<commit_message>
Guvenlik notlarina konulacak temel uyari ve guvenlik isaretleri acikca yazildi; 1.7'deki duzenlemeler
</commit_message>
<xml_diff>
--- a/Kim11-1-7-Tepkime-Hizina-Etki-Eden-Faktorler.docx
+++ b/Kim11-1-7-Tepkime-Hizina-Etki-Eden-Faktorler.docx
@@ -39,7 +39,21 @@
           <w:rFonts w:ascii="Times New Roman" w:hAnsi="Times New Roman" w:cs="Times New Roman"/>
           <w:lang w:val="tr-TR"/>
         </w:rPr>
-        <w:t xml:space="preserve">Marketten alınan sebze ve meyveler neden buzdolabında saklanır? Bir kâğıt parçası alev aldığında birkaç saniyede yanıp kül olurken açıkta bırakılan bir demir çivinin paslanması neden aylar sürer? Kâğıdın yanması (Görsel A) ile demirin paslanması (Görsel B) olaylarının her ikisi de maddelerin oksijenle tepkimeye girdiği kimyasal değişimlerdir. Bu olaylar arasındaki benzerlik ve farklılıklar nelerdir? Önceki konuda tepkime hızının zamanla değiştiğini ve tepkime hızının çarpışma teorisi ile açıklanabildiğini öğrendiniz. Aynı tepkimenin bazı koşullarda hızlı, bazı koşullarda yavaş gerçekleşmesinin nedenleri neler olabilir? Analiz ve Keşif Atölyesi 1.7.’deki etkinliği yaparak tepkime hızına etki eden faktörleri keşfediniz. Bu etkinlikte bilimsel sorgulama becerinizi kullanarak günlük hayattaki olaylardan araştırılabilir sorular türetecek, hipotezler kuracak, değişkenleri belirleyerek deneyler planlayıp uygulayacak ve elde ettiğiniz verileri çarpışma teorisiyle yorumlayacaksınız. Grubunuzla iş birliği içinde, planlı ve sistemli çalışırken merakınızın peşinden giderek araştırmacı yönünüzü; görev paylaşımında sorumluluk alarak da çalışkanlık ve dostluk değerlerinizi güçlendireceksiniz.</w:t>
+        <w:t xml:space="preserve">Marketten alınan sebze ve meyveler neden buzdolabında saklanır? Bir kâğıt parçası alev aldığında birkaç saniyede yanıp kül olurken açıkta bırakılan bir demir çivinin paslanması neden </w:t>
+      </w:r>
+      <w:r>
+        <w:rPr>
+          <w:rFonts w:ascii="Times New Roman" w:hAnsi="Times New Roman" w:cs="Times New Roman"/>
+          <w:lang w:val="tr-TR"/>
+        </w:rPr>
+        <w:t>haftalar</w:t>
+      </w:r>
+      <w:r>
+        <w:rPr>
+          <w:rFonts w:ascii="Times New Roman" w:hAnsi="Times New Roman" w:cs="Times New Roman"/>
+          <w:lang w:val="tr-TR"/>
+        </w:rPr>
+        <w:t xml:space="preserve"> sürer? Kâğıdın yanması (Görsel A) ile demirin paslanması (Görsel B) olaylarının her ikisi de maddelerin oksijenle tepkimeye girdiği kimyasal değişimlerdir. Bu olaylar arasındaki benzerlik ve farklılıklar nelerdir? Aynı tepkimenin bazı koşullarda hızlı, bazı koşullarda yavaş gerçekleşmesinin nedenleri neler olabilir? </w:t>
       </w:r>
     </w:p>
     <w:p>
@@ -275,7 +289,7 @@
           <w:noProof/>
         </w:rPr>
         <w:drawing>
-          <wp:inline distT="0" distB="0" distL="0" distR="0" wp14:anchorId="04A89E27" wp14:editId="6A3D50CA">
+          <wp:inline distT="0" distB="0" distL="0" distR="0" wp14:anchorId="04A89E27" wp14:editId="0BC87936">
             <wp:extent cx="5943600" cy="4358640"/>
             <wp:effectExtent l="0" t="0" r="0" b="0"/>
             <wp:docPr id="2123729894" name="Picture 12" descr="Rusty iron nails piled up in a disorderly fashion"/>
@@ -537,6 +551,29 @@
           <w:lang w:val="tr-TR"/>
         </w:rPr>
       </w:pPr>
+    </w:p>
+    <w:p>
+      <w:pPr>
+        <w:jc w:val="both"/>
+        <w:rPr>
+          <w:rFonts w:ascii="Times New Roman" w:hAnsi="Times New Roman" w:cs="Times New Roman"/>
+          <w:lang w:val="tr-TR"/>
+        </w:rPr>
+      </w:pPr>
+      <w:r>
+        <w:rPr>
+          <w:rFonts w:ascii="Times New Roman" w:hAnsi="Times New Roman" w:cs="Times New Roman"/>
+          <w:lang w:val="tr-TR"/>
+        </w:rPr>
+        <w:t>Analiz ve Keşif Atölyesi 1.7.’deki etkinliği yaparak tepkime hızına etki eden faktörleri keşfediniz. Bu etkinlikte bilimsel sorgulama becerinizi kullanarak günlük hayattaki olaylardan araştırılabilir sorular türetecek, hipotezler kuracak, değişkenleri belirleyerek deneyler planlayıp uygulayacak ve elde ettiğiniz verileri çarpışma teorisiyle yorumlayacaksınız. Grubunuzla iş birliği içinde, planlı ve sistemli çalışırken merakınızın peşinden giderek araştırmacı yönünüzü; görev paylaşımında sorumluluk alarak da çalışkanlık ve dostluk değerlerinizi güçlendireceksiniz.</w:t>
+      </w:r>
+      <w:r>
+        <w:rPr>
+          <w:rFonts w:ascii="Times New Roman" w:hAnsi="Times New Roman" w:cs="Times New Roman"/>
+          <w:lang w:val="tr-TR"/>
+        </w:rPr>
+        <w:t xml:space="preserve"> </w:t>
+      </w:r>
       <w:r>
         <w:rPr>
           <w:rFonts w:ascii="Times New Roman" w:hAnsi="Times New Roman" w:cs="Times New Roman"/>
@@ -665,15 +702,6 @@
     </w:p>
     <w:p>
       <w:pPr>
-        <w:jc w:val="both"/>
-        <w:rPr>
-          <w:rFonts w:ascii="Times New Roman" w:hAnsi="Times New Roman" w:cs="Times New Roman"/>
-          <w:lang w:val="tr-TR"/>
-        </w:rPr>
-      </w:pPr>
-    </w:p>
-    <w:p>
-      <w:pPr>
         <w:keepNext/>
         <w:shd w:val="clear" w:color="auto" w:fill="A5C9EB"/>
         <w:jc w:val="both"/>
@@ -691,6 +719,7 @@
           <w:bCs/>
           <w:lang w:val="tr-TR"/>
         </w:rPr>
+        <w:lastRenderedPageBreak/>
         <w:t>Analiz ve Keşif Atölyesi 1.7.</w:t>
       </w:r>
     </w:p>
@@ -735,7 +764,24 @@
           <w:highlight w:val="yellow"/>
           <w:lang w:val="tr-TR"/>
         </w:rPr>
-        <w:t>Güvenlik uyarıları Kimya9/10 kitabından alınsın; önlük, gözlük, eldiven ve havalandırma uyarıları eklensin.</w:t>
+        <w:t xml:space="preserve">Etkinlik başlığının yanına Kimya10 kitabındaki “Temel Uyarı ve Güvenlik İşaretleri” sayfasından şu işaretler konulsun: GÖZLÜK KULLAN, ELDİVEN GİY, KORUYUCU ELBİSE GİY, KOROZİF (AŞINDIRICI) MADDE, TAHRİŞ EDİCİ MADDE, MASKE KULLAN, YANICI MADDE, SICAK CİSİM UYARISI, KIRILABİLİR CAM UYARISI. Ek uyarılar: Hidroklorik asit aşındırıcıdır. Sodyum tiyosülfat ile hidroklorik asidin tepkimesinde boğucu SO</w:t>
+      </w:r>
+      <w:r>
+        <w:rPr>
+          <w:rFonts w:ascii="Times New Roman" w:hAnsi="Times New Roman" w:cs="Times New Roman"/>
+          <w:highlight w:val="yellow"/>
+          <w:lang w:val="tr-TR"/>
+          <w:vertAlign w:val="subscript"/>
+        </w:rPr>
+        <w:t xml:space="preserve">2</w:t>
+      </w:r>
+      <w:r>
+        <w:rPr>
+          <w:rFonts w:ascii="Times New Roman" w:hAnsi="Times New Roman" w:cs="Times New Roman"/>
+          <w:highlight w:val="yellow"/>
+          <w:lang w:val="tr-TR"/>
+        </w:rPr>
+        <w:t xml:space="preserve"> gazı oluştuğundan bu deney iyi havalandırılan bir ortamda ya da çeker ocakta yapılmalıdır. Metallerin asitle tepkimesinde oluşan hidrojen gazı yanıcıdır; deney tüplerinin yakınında açık alev bulundurulmamalıdır. Kor hâlindeki kıymık yalnızca öğretmen gözetiminde kullanılmalıdır.</w:t>
       </w:r>
     </w:p>
     <w:p>
@@ -753,7 +799,6 @@
           <w:bCs/>
           <w:lang w:val="tr-TR"/>
         </w:rPr>
-        <w:lastRenderedPageBreak/>
         <w:t>1. Aşama: Araştırılabilir Sorular ve Hipotezler</w:t>
       </w:r>
     </w:p>
@@ -770,7 +815,7 @@
           <w:rFonts w:ascii="Times New Roman" w:hAnsi="Times New Roman" w:cs="Times New Roman"/>
           <w:lang w:val="tr-TR"/>
         </w:rPr>
-        <w:t xml:space="preserve">Aşağıdaki tabloda günlük hayattan tepkime hızıyla ilişkili bazı örnek olaylar verilmiştir. İlk satır örnek olarak doldurulmuştur. Tablodaki örnek olaylardan yararlanarak her bir faktörün tepkime hızına etkisine ilişkin araştırılabilir bir soru ve bu soruya yönelik bir hipotez yazınız. Hipotezlerinizi oluştururken ön bilgilerinizden ve ders kitabı, güvenilir bilimsel kaynaklar gibi kaynaklardan yararlanınız. Çeşitli fikir, argüman ve yeni bilgilere açık olunuz; merak ettiğiniz soruların peşinden gitmenin bilimsel gelişimin bir parçası olduğunu unutmayınız.</w:t>
+        <w:t>Aşağıdaki tabloda günlük hayattan tepkime hızıyla ilişkili bazı örnek olaylar verilmiştir. İlk satır örnek olarak doldurulmuştur. Tablodaki örnek olaylardan yararlanarak her bir faktörün tepkime hızına etkisine ilişkin araştırılabilir bir soru ve bu soruya yönelik bir hipotez yazınız. Hipotezlerinizi oluştururken ön bilgilerinizden ve ders kitabı, güvenilir bilimsel kaynaklar gibi kaynaklardan yararlanınız. Çeşitli fikir, argüman ve yeni bilgilere açık olunuz; merak ettiğiniz soruların peşinden gitmenin bilimsel gelişimin bir parçası olduğunu unutmayınız.</w:t>
       </w:r>
     </w:p>
     <w:tbl>
@@ -1450,7 +1495,15 @@
           <w:rFonts w:ascii="Times New Roman" w:hAnsi="Times New Roman" w:cs="Times New Roman"/>
           <w:lang w:val="tr-TR"/>
         </w:rPr>
-        <w:t xml:space="preserve">Sınıfınızda gruplara ayrılınız. Grup arkadaşlarınızla iş birliği içinde her bir faktörün tepkime hızı ile ilişkisini araştıracağınız deneyler için bağımlı, bağımsız ve kontrol değişkenlerini belirleyerek aşağıdaki tabloya yazınız. Grup çalışmasında görev paylaşımı yapınız, arkadaşlarınızın fikirlerine saygı gösteriniz ve dostluk ilişkilerinizi güçlendirecek şekilde davranınız. Ortak hedefinize ulaşmak için zorlandığınız noktalarda birbirinize destek olunuz, gerektiğinde arkadaşlarınızdan yardım isteyiniz.</w:t>
+        <w:t xml:space="preserve">Sınıfınızda gruplara ayrılınız. Grup arkadaşlarınızla iş birliği içinde her bir faktörün tepkime hızı ile ilişkisini araştıracağınız deneyler için bağımlı, bağımsız ve kontrol değişkenlerini belirleyerek aşağıdaki tabloya yazınız. Grup çalışmasında görev paylaşımı yapınız, arkadaşlarınızın fikirlerine </w:t>
+      </w:r>
+      <w:r>
+        <w:rPr>
+          <w:rFonts w:ascii="Times New Roman" w:hAnsi="Times New Roman" w:cs="Times New Roman"/>
+          <w:lang w:val="tr-TR"/>
+        </w:rPr>
+        <w:lastRenderedPageBreak/>
+        <w:t>saygı gösteriniz ve dostluk ilişkilerinizi güçlendirecek şekilde davranınız. Ortak hedefinize ulaşmak için zorlandığınız noktalarda birbirinize destek olunuz, gerektiğinde arkadaşlarınızdan yardım isteyiniz.</w:t>
       </w:r>
     </w:p>
     <w:tbl>
@@ -1683,7 +1736,6 @@
                 <w:rFonts w:ascii="Times New Roman" w:hAnsi="Times New Roman" w:cs="Times New Roman"/>
                 <w:lang w:val="tr-TR"/>
               </w:rPr>
-              <w:lastRenderedPageBreak/>
               <w:t>Fiziksel hâl</w:t>
             </w:r>
           </w:p>
@@ -2189,6 +2241,7 @@
                 <w:rFonts w:ascii="Times New Roman" w:hAnsi="Times New Roman" w:cs="Times New Roman"/>
                 <w:lang w:val="tr-TR"/>
               </w:rPr>
+              <w:lastRenderedPageBreak/>
               <w:t xml:space="preserve">• </w:t>
             </w:r>
             <w:r>
@@ -2268,7 +2321,6 @@
                 <w:rFonts w:ascii="Times New Roman" w:hAnsi="Times New Roman" w:cs="Times New Roman"/>
                 <w:lang w:val="tr-TR"/>
               </w:rPr>
-              <w:lastRenderedPageBreak/>
               <w:t xml:space="preserve">• </w:t>
             </w:r>
             <w:r>
@@ -2842,6 +2894,7 @@
                 <w:rFonts w:ascii="Times New Roman" w:hAnsi="Times New Roman" w:cs="Times New Roman"/>
                 <w:lang w:val="tr-TR"/>
               </w:rPr>
+              <w:lastRenderedPageBreak/>
               <w:t>3</w:t>
             </w:r>
           </w:p>
@@ -3008,7 +3061,6 @@
           <w:rFonts w:ascii="Times New Roman" w:hAnsi="Times New Roman" w:cs="Times New Roman"/>
           <w:lang w:val="tr-TR"/>
         </w:rPr>
-        <w:lastRenderedPageBreak/>
         <w:t>……………………………………………………………………………………………………</w:t>
       </w:r>
     </w:p>
@@ -3541,7 +3593,7 @@
           <w:rFonts w:ascii="Times New Roman" w:hAnsi="Times New Roman" w:cs="Times New Roman"/>
           <w:lang w:val="tr-TR"/>
         </w:rPr>
-        <w:t xml:space="preserve">Verileriniz hipotezlerinizden birini desteklemiyorsa bunun olası nedenlerini (kontrol değişkenlerinin sabit tutulup tutulmadığı, ölçüm süresi, malzeme miktarı vb.) grup arkadaşlarınızla tartışınız. Gerekirse deney planınızı yeniden düzenleyerek deneyi tekrarlayınız.</w:t>
+        <w:t>Verileriniz hipotezlerinizden birini desteklemiyorsa bunun olası nedenlerini (kontrol değişkenlerinin sabit tutulup tutulmadığı, ölçüm süresi, malzeme miktarı vb.) grup arkadaşlarınızla tartışınız. Gerekirse deney planınızı yeniden düzenleyerek deneyi tekrarlayınız.</w:t>
       </w:r>
     </w:p>
     <w:p>
@@ -3592,6 +3644,7 @@
           <w:rFonts w:ascii="Times New Roman" w:hAnsi="Times New Roman" w:cs="Times New Roman"/>
           <w:lang w:val="tr-TR"/>
         </w:rPr>
+        <w:lastRenderedPageBreak/>
         <w:t>……………………………………………………………………………………………</w:t>
       </w:r>
     </w:p>
@@ -3613,7 +3666,7 @@
           <w:rFonts w:ascii="Times New Roman" w:hAnsi="Times New Roman" w:cs="Times New Roman"/>
           <w:lang w:val="tr-TR"/>
         </w:rPr>
-        <w:t xml:space="preserve">Deney sonuçlarınızı kullanarak her bir faktörün tepkime hızına etkisini alt mikro seviyede (tanecikler düzeyinde) açıklayınız. Tepken derişiminin ve sıcaklığın etkisini gösteren birer model çiziniz. Açıklamalarınızı ders kitabınızdaki ve güvenilir bilimsel kaynaklardaki bilgilerle karşılaştırınız.</w:t>
+        <w:t>Deney sonuçlarınızı kullanarak her bir faktörün tepkime hızına etkisini alt mikro seviyede (tanecikler düzeyinde) açıklayınız. Tepken derişiminin ve sıcaklığın etkisini gösteren birer model çiziniz. Açıklamalarınızı ders kitabınızdaki ve güvenilir bilimsel kaynaklardaki bilgilerle karşılaştırınız.</w:t>
       </w:r>
     </w:p>
     <w:p>
@@ -3707,7 +3760,6 @@
                 <w:bCs/>
                 <w:lang w:val="tr-TR"/>
               </w:rPr>
-              <w:lastRenderedPageBreak/>
               <w:t>Modelim</w:t>
             </w:r>
           </w:p>
@@ -3834,7 +3886,7 @@
           <w:rFonts w:ascii="Times New Roman" w:hAnsi="Times New Roman" w:cs="Times New Roman"/>
           <w:lang w:val="tr-TR"/>
         </w:rPr>
-        <w:t xml:space="preserve">Grubunuzun bulgularını ve açıklamalarını sınıfınızla paylaşınız. Diğer grupların sonuçlarını kendi sonuçlarınızla karşılaştırarak ulaştığınız açıklamaların güvenilirliğini değerlendiriniz.</w:t>
+        <w:t>Grubunuzun bulgularını ve açıklamalarını sınıfınızla paylaşınız. Diğer grupların sonuçlarını kendi sonuçlarınızla karşılaştırarak ulaştığınız açıklamaların güvenilirliğini değerlendiriniz.</w:t>
       </w:r>
     </w:p>
     <w:p>
@@ -3916,6 +3968,7 @@
           <w:noProof/>
           <w:lang w:val="tr-TR"/>
         </w:rPr>
+        <w:lastRenderedPageBreak/>
         <mc:AlternateContent>
           <mc:Choice Requires="wps">
             <w:drawing>
@@ -4059,7 +4112,6 @@
           <w:noProof/>
           <w:lang w:val="tr-TR"/>
         </w:rPr>
-        <w:lastRenderedPageBreak/>
         <mc:AlternateContent>
           <mc:Choice Requires="wps">
             <w:drawing>
@@ -4274,7 +4326,7 @@
           <w:rFonts w:ascii="Times New Roman" w:hAnsi="Times New Roman" w:cs="Times New Roman"/>
           <w:lang w:val="tr-TR"/>
         </w:rPr>
-        <w:t xml:space="preserve">Analiz ve Keşif Atölyesi 1.7.’de gerçekleştirdiğiniz deneylerde aynı tepkimenin bazı koşullarda hızlandığını, bazı koşullarda ise yavaşladığını gözlemlediniz. Deney verileriniz, kimyasal tepkimelerin hızının; tepkenlerin cinsine, fiziksel hâline ve derişimine, sıcaklığa, katı tepkenlerin temas yüzeyine ve katalizöre bağlı olduğunu göstermektedir. Bu faktörlerin etkisi çarpışma teorisi ile açıklanabilir. Çarpışma teorisine göre bir tepkimenin hızı, birim zamanda gerçekleşen etkin çarpışma sayısı ile doğru orantılıdır. Bu nedenle birim zamandaki toplam çarpışma sayısını ya da çarpışmalar içindeki etkin çarpışmaların oranını artıran her etken tepkime hızını artırır.</w:t>
+        <w:t>Analiz ve Keşif Atölyesi 1.7.’de gerçekleştirdiğiniz deneylerde aynı tepkimenin bazı koşullarda hızlandığını, bazı koşullarda ise yavaşladığını gözlemlediniz. Deney verileriniz, kimyasal tepkimelerin hızının; tepkenlerin cinsine, fiziksel hâline ve derişimine, sıcaklığa, katı tepkenlerin temas yüzeyine ve katalizöre bağlı olduğunu göstermektedir. Bu faktörlerin etkisi çarpışma teorisi ile açıklanabilir. Çarpışma teorisine göre bir tepkimenin hızı, birim zamanda gerçekleşen etkin çarpışma sayısı ile doğru orantılıdır. Bu nedenle birim zamandaki toplam çarpışma sayısını ya da çarpışmalar içindeki etkin çarpışmaların oranını artıran her etken tepkime hızını artırır.</w:t>
       </w:r>
     </w:p>
     <w:p>
@@ -4309,37 +4361,37 @@
           <w:rFonts w:ascii="Times New Roman" w:hAnsi="Times New Roman" w:cs="Times New Roman"/>
           <w:lang w:val="tr-TR"/>
         </w:rPr>
-        <w:t xml:space="preserve">Aynı koşullarda farklı maddeler farklı hızlarda tepkimeye girer. Örneğin oda sıcaklığında gümüş nitrat çözeltisine sodyum klorür çözeltisi eklendiğinde beyaz renkli gümüş klorür çökeleği anında oluşur (Görsel C). Buna karşılık doğal gazın temel bileşeni olan metan, havadaki oksijenle aynı ortamda uzun süre tepkimeye girmeden bulunabilir; yanmanın başlaması için bir kıvılcım ya da alev gerekir. Peki tepkenlerin cinsi tepkime hızını neden bu kadar etkiler? Tepkime sırasında kırılması gereken bağların sayısı ve sağlamlığı, aktivasyon enerjisinin büyüklüğünü belirler. Genel olarak zıt yüklü iyonlar arasında gerçekleşen tepkimeler (Ag</w:t>
-      </w:r>
-      <w:r>
-        <w:rPr>
-          <w:rFonts w:ascii="Times New Roman" w:hAnsi="Times New Roman" w:cs="Times New Roman"/>
-          <w:lang w:val="tr-TR"/>
+        <w:t>Aynı koşullarda farklı maddeler farklı hızlarda tepkimeye girer. Örneğin oda sıcaklığında gümüş nitrat çözeltisine sodyum klorür çözeltisi eklendiğinde beyaz renkli gümüş klorür çökeleği anında oluşur (Görsel C). Buna karşılık doğal gazın temel bileşeni olan metan, havadaki oksijenle aynı ortamda uzun süre tepkimeye girmeden bulunabilir; yanmanın başlaması için bir kıvılcım ya da alev gerekir. Peki tepkenlerin cinsi tepkime hızını neden bu kadar etkiler? Tepkime sırasında kırılması gereken bağların sayısı ve sağlamlığı, aktivasyon enerjisinin büyüklüğünü belirler. Genel olarak zıt yüklü iyonlar arasında gerçekleşen tepkimeler (Ag</w:t>
+      </w:r>
+      <w:r>
+        <w:rPr>
+          <w:rFonts w:ascii="Times New Roman" w:hAnsi="Times New Roman" w:cs="Times New Roman"/>
           <w:vertAlign w:val="superscript"/>
-        </w:rPr>
-        <w:t xml:space="preserve">+</w:t>
-      </w:r>
-      <w:r>
-        <w:rPr>
-          <w:rFonts w:ascii="Times New Roman" w:hAnsi="Times New Roman" w:cs="Times New Roman"/>
-          <w:lang w:val="tr-TR"/>
-        </w:rPr>
-        <w:t xml:space="preserve">(suda) + Cl</w:t>
-      </w:r>
-      <w:r>
-        <w:rPr>
-          <w:rFonts w:ascii="Times New Roman" w:hAnsi="Times New Roman" w:cs="Times New Roman"/>
-          <w:lang w:val="tr-TR"/>
+          <w:lang w:val="tr-TR"/>
+        </w:rPr>
+        <w:t>+</w:t>
+      </w:r>
+      <w:r>
+        <w:rPr>
+          <w:rFonts w:ascii="Times New Roman" w:hAnsi="Times New Roman" w:cs="Times New Roman"/>
+          <w:lang w:val="tr-TR"/>
+        </w:rPr>
+        <w:t>(suda) + Cl</w:t>
+      </w:r>
+      <w:r>
+        <w:rPr>
+          <w:rFonts w:ascii="Times New Roman" w:hAnsi="Times New Roman" w:cs="Times New Roman"/>
           <w:vertAlign w:val="superscript"/>
-        </w:rPr>
-        <w:t xml:space="preserve">−</w:t>
-      </w:r>
-      <w:r>
-        <w:rPr>
-          <w:rFonts w:ascii="Times New Roman" w:hAnsi="Times New Roman" w:cs="Times New Roman"/>
-          <w:lang w:val="tr-TR"/>
-        </w:rPr>
-        <w:t xml:space="preserve">(suda) → AgCl(k) gibi) bağ kırılması gerektirmediği için oda sıcaklığında çok hızlıdır. Metanın yanması gibi kovalent bağların kırılmasını gerektiren tepkimeler ise genellikle daha yavaştır.</w:t>
+          <w:lang w:val="tr-TR"/>
+        </w:rPr>
+        <w:t>−</w:t>
+      </w:r>
+      <w:r>
+        <w:rPr>
+          <w:rFonts w:ascii="Times New Roman" w:hAnsi="Times New Roman" w:cs="Times New Roman"/>
+          <w:lang w:val="tr-TR"/>
+        </w:rPr>
+        <w:t>(suda) → AgCl(k) gibi) bağ kırılması gerektirmediği için oda sıcaklığında çok hızlıdır. Metanın yanması gibi kovalent bağların kırılmasını gerektiren tepkimeler ise genellikle daha yavaştır.</w:t>
       </w:r>
     </w:p>
     <w:tbl>
@@ -4395,7 +4447,7 @@
                 <w:rFonts w:ascii="Times New Roman" w:hAnsi="Times New Roman" w:cs="Times New Roman"/>
                 <w:lang w:val="tr-TR"/>
               </w:rPr>
-              <w:t xml:space="preserve">Tarif: Gümüş nitrat çözeltisi bulunan bir deney tüpüne/behere sodyum klorür çözeltisi damlatıldığı anda oluşan beyaz, bulutsu gümüş klorür çökeleği.</w:t>
+              <w:t>Tarif: Gümüş nitrat çözeltisi bulunan bir deney tüpüne/behere sodyum klorür çözeltisi damlatıldığı anda oluşan beyaz, bulutsu gümüş klorür çökeleği.</w:t>
             </w:r>
           </w:p>
           <w:p>
@@ -4411,7 +4463,8 @@
                 <w:rFonts w:ascii="Times New Roman" w:hAnsi="Times New Roman" w:cs="Times New Roman"/>
                 <w:lang w:val="tr-TR"/>
               </w:rPr>
-              <w:t xml:space="preserve">Shutterstock arama: “silver chloride precipitate” / “white precipitate test tube”</w:t>
+              <w:lastRenderedPageBreak/>
+              <w:t>Shutterstock arama: “silver chloride precipitate” / “white precipitate test tube”</w:t>
             </w:r>
           </w:p>
           <w:p>
@@ -4427,7 +4480,7 @@
                 <w:rFonts w:ascii="Times New Roman" w:hAnsi="Times New Roman" w:cs="Times New Roman"/>
                 <w:lang w:val="tr-TR"/>
               </w:rPr>
-              <w:t xml:space="preserve">Shutter ID: 2074498582 (vektörel; AgNO₃ + NaCl → AgCl + NaNO₃ çökelme tepkimesi, etiketler Türkçeleştirilmeli). Alternatif: 2294975705. Uygun fotoğraf bulunamadı; mümkünse deney fotoğrafı çekilsin.</w:t>
+              <w:t>Shutter ID: 2074498582 (vektörel; AgNO₃ + NaCl → AgCl + NaNO₃ çökelme tepkimesi, etiketler Türkçeleştirilmeli). Alternatif: 2294975705. Uygun fotoğraf bulunamadı; mümkünse deney fotoğrafı çekilsin.</w:t>
             </w:r>
           </w:p>
         </w:tc>
@@ -4480,7 +4533,7 @@
           <w:rFonts w:ascii="Times New Roman" w:hAnsi="Times New Roman" w:cs="Times New Roman"/>
           <w:lang w:val="tr-TR"/>
         </w:rPr>
-        <w:t xml:space="preserve">Tepkime hızı, bir basamakta aynı anda çarpışması gereken tanecik sayısına da bağlıdır. İki taneciğin uygun doğrultuda çarpışma olasılığı yüksekken üç taneciğin aynı anda ve uygun doğrultuda çarpışma olasılığı çok düşüktür. Bu nedenle aynı koşullarda, tek basamakta gerçekleşen ve iki taneciğin çarpışmasını gerektiren tepkimeler, üç taneciğin aynı anda çarpışmasını gerektiren tepkimelere göre genellikle daha hızlıdır. Dört ya da daha fazla taneciğin aynı anda çarpışması neredeyse imkânsız olduğundan bu tür tepkimeler birden fazla basamakta gerçekleşir.</w:t>
+        <w:t>Tepkime hızı, bir basamakta aynı anda çarpışması gereken tanecik sayısına da bağlıdır. İki taneciğin uygun doğrultuda çarpışma olasılığı yüksekken üç taneciğin aynı anda ve uygun doğrultuda çarpışma olasılığı çok düşüktür. Bu nedenle aynı koşullarda, tek basamakta gerçekleşen ve iki taneciğin çarpışmasını gerektiren tepkimeler, üç taneciğin aynı anda çarpışmasını gerektiren tepkimelere göre genellikle daha hızlıdır. Dört ya da daha fazla taneciğin aynı anda çarpışması neredeyse imkânsız olduğundan bu tür tepkimeler birden fazla basamakta gerçekleşir.</w:t>
       </w:r>
     </w:p>
     <w:p>
@@ -4515,15 +4568,7 @@
           <w:rFonts w:ascii="Times New Roman" w:hAnsi="Times New Roman" w:cs="Times New Roman"/>
           <w:lang w:val="tr-TR"/>
         </w:rPr>
-        <w:t xml:space="preserve">Tepkimenin gerçekleşebilmesi için tepken taneciklerinin birbirleriyle çarpışması gerekir. Katı hâldeki tanecikler yalnızca yerlerinde titreşim hareketi yapabildiği için iki katı tepken ancak temas </w:t>
-      </w:r>
-      <w:r>
-        <w:rPr>
-          <w:rFonts w:ascii="Times New Roman" w:hAnsi="Times New Roman" w:cs="Times New Roman"/>
-          <w:lang w:val="tr-TR"/>
-        </w:rPr>
-        <w:lastRenderedPageBreak/>
-        <w:t xml:space="preserve">yüzeylerinde tepkimeye girebilir. Bu nedenle katılar arasındaki tepkimeler genellikle çok yavaştır. Sıvı ve çözelti hâlindeki tanecikler ile gaz tanecikleri ise ortamda serbestçe hareket ederek daha sık çarpışır. Örneğin katı kurşun(II) nitrat ile katı potasyum iyodür bir kapta karıştırıldığında sarı renkli kurşun(II) iyodür yalnızca tanecikleri birbirine değen yüzeylerde ve yavaş oluşur. Aynı maddelerin sulu çözeltileri karıştırıldığında ise sarı çökelek anında oluşur. Genel olarak aynı tepkime için tepkime hızı gaz &gt; sıvı (çözelti) &gt; katı şeklinde sıralanır. Tepkenlerin tamamı aynı fiziksel hâlde bulunan tepkimelere </w:t>
+        <w:t xml:space="preserve">Tepkimenin gerçekleşebilmesi için tepken taneciklerinin birbirleriyle çarpışması gerekir. Katı hâldeki tanecikler yalnızca yerlerinde titreşim hareketi yapabildiği için iki katı tepken ancak temas yüzeylerinde tepkimeye girebilir. Bu nedenle katılar arasındaki tepkimeler genellikle çok yavaştır. Sıvı ve çözelti hâlindeki tanecikler ile gaz tanecikleri ise ortamda serbestçe hareket ederek daha sık çarpışır. Örneğin katı kurşun(II) nitrat ile katı potasyum iyodür bir kapta karıştırıldığında sarı renkli kurşun(II) iyodür yalnızca tanecikleri birbirine değen yüzeylerde ve yavaş oluşur. Aynı maddelerin sulu çözeltileri karıştırıldığında ise sarı çökelek anında oluşur. Genel olarak aynı tepkime için tepkime hızı gaz &gt; sıvı (çözelti) &gt; katı şeklinde sıralanır. Tepkenlerin tamamı aynı fiziksel hâlde bulunan tepkimelere </w:t>
       </w:r>
       <w:r>
         <w:rPr>
@@ -4590,7 +4635,7 @@
           <w:rFonts w:ascii="Times New Roman" w:hAnsi="Times New Roman" w:cs="Times New Roman"/>
           <w:lang w:val="tr-TR"/>
         </w:rPr>
-        <w:t xml:space="preserve">Eşit kütlede mermer parçaları biri 0,5 M, diğeri 2 M hidroklorik asit çözeltisi içeren iki behere bırakıldığında derişik asitteki gaz çıkışının çok daha hızlı olduğu görülür. Peki derişimin artması tanecikler düzeyinde neyi değiştirir? Tepken derişimi arttıkça birim hacimdeki tanecik sayısı artar. Birim hacimde daha fazla tanecik bulunması birim zamanda gerçekleşen çarpışma sayısını ve dolayısıyla etkin çarpışma sayısını artırır (Görsel D). Bu nedenle tepken derişimi arttıkça tepkime hızı artar. Havada ısıtıldığında yalnızca kızaran bir çelik yünü parçasının saf oksijen dolu bir kapta parlak kıvılcımlar saçarak hızla yanması da havada yaklaşık %21 olan oksijen oranının saf oksijende çok daha yüksek olmasıyla açıklanabilir. Gaz fazındaki tepkimelerde sabit sıcaklıkta kabın hacmi küçültüldüğünde gazların derişimi ve basıncı artar; bu durum da tepkime hızını artırır. Sıcaklık sabit kaldığı sürece katı ve saf sıvıların derişimi değişmediğinden bunların miktarındaki değişim tepkime hızını derişim yoluyla etkilemez.</w:t>
+        <w:t>Eşit kütlede mermer parçaları biri 0,5 M, diğeri 2 M hidroklorik asit çözeltisi içeren iki behere bırakıldığında derişik asitteki gaz çıkışının çok daha hızlı olduğu görülür. Peki derişimin artması tanecikler düzeyinde neyi değiştirir? Tepken derişimi arttıkça birim hacimdeki tanecik sayısı artar. Birim hacimde daha fazla tanecik bulunması birim zamanda gerçekleşen çarpışma sayısını ve dolayısıyla etkin çarpışma sayısını artırır (Görsel D). Bu nedenle tepken derişimi arttıkça tepkime hızı artar. Havada ısıtıldığında yalnızca kızaran bir çelik yünü parçasının saf oksijen dolu bir kapta parlak kıvılcımlar saçarak hızla yanması da havada yaklaşık %21 olan oksijen oranının saf oksijende çok daha yüksek olmasıyla açıklanabilir. Gaz fazındaki tepkimelerde sabit sıcaklıkta kabın hacmi küçültüldüğünde gazların derişimi ve basıncı artar; bu durum da tepkime hızını artırır. Sıcaklık sabit kaldığı sürece katı ve saf sıvıların derişimi değişmediğinden bunların miktarındaki değişim tepkime hızını derişim yoluyla etkilemez.</w:t>
       </w:r>
     </w:p>
     <w:p>
@@ -4605,6 +4650,7 @@
         <w:rPr>
           <w:noProof/>
         </w:rPr>
+        <w:lastRenderedPageBreak/>
         <w:drawing>
           <wp:inline distT="0" distB="0" distL="0" distR="0" wp14:anchorId="6B73C9F0" wp14:editId="5416ED67">
             <wp:extent cx="4680000" cy="2246400"/>
@@ -4726,15 +4772,15 @@
           <w:rFonts w:ascii="Times New Roman" w:hAnsi="Times New Roman" w:cs="Times New Roman"/>
           <w:lang w:val="tr-TR"/>
         </w:rPr>
-        <w:t xml:space="preserve">Sülfürik asitle asitlendirilmiş potasyum permanganat çözeltisi oksalik asit çözeltisiyle karıştırıldığında permanganatın mor rengi oda sıcaklığında ancak birkaç dakikada kaybolur; karışım yaklaşık 60 °C’ye ısıtıldığında ise renk çok daha kısa sürede kaybolur. Bu durum, sıcaklığın tanecik hareketleri üzerindeki etkisiyle açıklanabilir. Sıcaklık arttıkça taneciklerin ortalama kinetik enerjisi ve hızları artar. Hızlanan tanecikler birim zamanda daha sık çarpışır. Ancak sıcaklık artışının tepkime hızını artırmasının asıl nedeni, aktivasyon enerjisini (eşik enerjisini) aşacak kadar kinetik enerjiye sahip tanecik oranının artmasıdır. Grafik A’da T</w:t>
-      </w:r>
-      <w:r>
-        <w:rPr>
-          <w:rFonts w:ascii="Times New Roman" w:hAnsi="Times New Roman" w:cs="Times New Roman"/>
-          <w:lang w:val="tr-TR"/>
+        <w:t>Sülfürik asitle asitlendirilmiş potasyum permanganat çözeltisi oksalik asit çözeltisiyle karıştırıldığında permanganatın mor rengi oda sıcaklığında ancak birkaç dakikada kaybolur; karışım yaklaşık 60 °C’ye ısıtıldığında ise renk çok daha kısa sürede kaybolur. Bu durum, sıcaklığın tanecik hareketleri üzerindeki etkisiyle açıklanabilir. Sıcaklık arttıkça taneciklerin ortalama kinetik enerjisi ve hızları artar. Hızlanan tanecikler birim zamanda daha sık çarpışır. Ancak sıcaklık artışının tepkime hızını artırmasının asıl nedeni, aktivasyon enerjisini (eşik enerjisini) aşacak kadar kinetik enerjiye sahip tanecik oranının artmasıdır. Grafik A’da T</w:t>
+      </w:r>
+      <w:r>
+        <w:rPr>
+          <w:rFonts w:ascii="Times New Roman" w:hAnsi="Times New Roman" w:cs="Times New Roman"/>
           <w:vertAlign w:val="subscript"/>
-        </w:rPr>
-        <w:t xml:space="preserve">1</w:t>
+          <w:lang w:val="tr-TR"/>
+        </w:rPr>
+        <w:t>1</w:t>
       </w:r>
       <w:r>
         <w:rPr>
@@ -4746,10 +4792,10 @@
       <w:r>
         <w:rPr>
           <w:rFonts w:ascii="Times New Roman" w:hAnsi="Times New Roman" w:cs="Times New Roman"/>
-          <w:lang w:val="tr-TR"/>
           <w:vertAlign w:val="subscript"/>
-        </w:rPr>
-        <w:t xml:space="preserve">2</w:t>
+          <w:lang w:val="tr-TR"/>
+        </w:rPr>
+        <w:t>2</w:t>
       </w:r>
       <w:r>
         <w:rPr>
@@ -4761,17 +4807,17 @@
       <w:r>
         <w:rPr>
           <w:rFonts w:ascii="Times New Roman" w:hAnsi="Times New Roman" w:cs="Times New Roman"/>
-          <w:lang w:val="tr-TR"/>
           <w:vertAlign w:val="subscript"/>
-        </w:rPr>
-        <w:t xml:space="preserve">2</w:t>
-      </w:r>
-      <w:r>
-        <w:rPr>
-          <w:rFonts w:ascii="Times New Roman" w:hAnsi="Times New Roman" w:cs="Times New Roman"/>
-          <w:lang w:val="tr-TR"/>
-        </w:rPr>
-        <w:t xml:space="preserve">) bu alan belirgin şekilde büyüktür; bu nedenle etkin çarpışma sayısı ve tepkime hızı artar. Sıcaklık artışı hem endotermik hem de ekzotermik tepkimelerin hızını artırır. Oda sıcaklığı civarında birçok tepkimede sıcaklığın 10 °C artırılması tepkime hızını yaklaşık iki katına çıkarır. Sebze ve meyvelerin buzdolabında saklanması, düşük sıcaklıkta bozulma tepkimelerinin yavaşlamasından yararlanılan bir uygulamadır. Düdüklü tencerede suyun daha yüksek sıcaklıkta kaynaması ise yemeklerin daha kısa sürede pişmesini sağlar.</w:t>
+          <w:lang w:val="tr-TR"/>
+        </w:rPr>
+        <w:t>2</w:t>
+      </w:r>
+      <w:r>
+        <w:rPr>
+          <w:rFonts w:ascii="Times New Roman" w:hAnsi="Times New Roman" w:cs="Times New Roman"/>
+          <w:lang w:val="tr-TR"/>
+        </w:rPr>
+        <w:t>) bu alan belirgin şekilde büyüktür; bu nedenle etkin çarpışma sayısı ve tepkime hızı artar. Sıcaklık artışı hem endotermik hem de ekzotermik tepkimelerin hızını artırır. Oda sıcaklığı civarında birçok tepkimede sıcaklığın 10 °C artırılması tepkime hızını yaklaşık iki katına çıkarır. Sebze ve meyvelerin buzdolabında saklanması, düşük sıcaklıkta bozulma tepkimelerinin yavaşlamasından yararlanılan bir uygulamadır. Düdüklü tencerede suyun daha yüksek sıcaklıkta kaynaması ise yemeklerin daha kısa sürede pişmesini sağlar.</w:t>
       </w:r>
     </w:p>
     <w:p>
@@ -4786,6 +4832,7 @@
         <w:rPr>
           <w:noProof/>
         </w:rPr>
+        <w:lastRenderedPageBreak/>
         <w:drawing>
           <wp:inline distT="0" distB="0" distL="0" distR="0" wp14:anchorId="0E9E73F2" wp14:editId="6FD2B120">
             <wp:extent cx="4680000" cy="2867280"/>
@@ -4925,7 +4972,6 @@
         <w:rPr>
           <w:noProof/>
         </w:rPr>
-        <w:lastRenderedPageBreak/>
         <w:drawing>
           <wp:inline distT="0" distB="0" distL="0" distR="0" wp14:anchorId="00E20AE5" wp14:editId="7AC8A6D0">
             <wp:extent cx="4320000" cy="1958400"/>
@@ -5004,6 +5050,7 @@
           <w:bCs/>
           <w:lang w:val="tr-TR"/>
         </w:rPr>
+        <w:lastRenderedPageBreak/>
         <w:t>Katalizör</w:t>
       </w:r>
     </w:p>
@@ -5020,60 +5067,60 @@
           <w:rFonts w:ascii="Times New Roman" w:hAnsi="Times New Roman" w:cs="Times New Roman"/>
           <w:lang w:val="tr-TR"/>
         </w:rPr>
-        <w:t xml:space="preserve">Potasyum klorat ısıtıldığında 2KClO</w:t>
-      </w:r>
-      <w:r>
-        <w:rPr>
-          <w:rFonts w:ascii="Times New Roman" w:hAnsi="Times New Roman" w:cs="Times New Roman"/>
-          <w:lang w:val="tr-TR"/>
+        <w:t>Potasyum klorat ısıtıldığında 2KClO</w:t>
+      </w:r>
+      <w:r>
+        <w:rPr>
+          <w:rFonts w:ascii="Times New Roman" w:hAnsi="Times New Roman" w:cs="Times New Roman"/>
           <w:vertAlign w:val="subscript"/>
-        </w:rPr>
-        <w:t xml:space="preserve">3</w:t>
-      </w:r>
-      <w:r>
-        <w:rPr>
-          <w:rFonts w:ascii="Times New Roman" w:hAnsi="Times New Roman" w:cs="Times New Roman"/>
-          <w:lang w:val="tr-TR"/>
-        </w:rPr>
-        <w:t xml:space="preserve">(k) → 2KCl(k) + 3O</w:t>
-      </w:r>
-      <w:r>
-        <w:rPr>
-          <w:rFonts w:ascii="Times New Roman" w:hAnsi="Times New Roman" w:cs="Times New Roman"/>
-          <w:lang w:val="tr-TR"/>
+          <w:lang w:val="tr-TR"/>
+        </w:rPr>
+        <w:t>3</w:t>
+      </w:r>
+      <w:r>
+        <w:rPr>
+          <w:rFonts w:ascii="Times New Roman" w:hAnsi="Times New Roman" w:cs="Times New Roman"/>
+          <w:lang w:val="tr-TR"/>
+        </w:rPr>
+        <w:t>(k) → 2KCl(k) + 3O</w:t>
+      </w:r>
+      <w:r>
+        <w:rPr>
+          <w:rFonts w:ascii="Times New Roman" w:hAnsi="Times New Roman" w:cs="Times New Roman"/>
           <w:vertAlign w:val="subscript"/>
-        </w:rPr>
-        <w:t xml:space="preserve">2</w:t>
-      </w:r>
-      <w:r>
-        <w:rPr>
-          <w:rFonts w:ascii="Times New Roman" w:hAnsi="Times New Roman" w:cs="Times New Roman"/>
-          <w:lang w:val="tr-TR"/>
-        </w:rPr>
-        <w:t xml:space="preserve">(g) denklemine göre bozunur. Bu tepkime ancak yüksek sıcaklıkta gözle görülür bir hızla gerçekleşir. Potasyum klorata az miktarda mangan dioksit (MnO</w:t>
-      </w:r>
-      <w:r>
-        <w:rPr>
-          <w:rFonts w:ascii="Times New Roman" w:hAnsi="Times New Roman" w:cs="Times New Roman"/>
-          <w:lang w:val="tr-TR"/>
+          <w:lang w:val="tr-TR"/>
+        </w:rPr>
+        <w:t>2</w:t>
+      </w:r>
+      <w:r>
+        <w:rPr>
+          <w:rFonts w:ascii="Times New Roman" w:hAnsi="Times New Roman" w:cs="Times New Roman"/>
+          <w:lang w:val="tr-TR"/>
+        </w:rPr>
+        <w:t>(g) denklemine göre bozunur. Bu tepkime ancak yüksek sıcaklıkta gözle görülür bir hızla gerçekleşir. Potasyum klorata az miktarda mangan dioksit (MnO</w:t>
+      </w:r>
+      <w:r>
+        <w:rPr>
+          <w:rFonts w:ascii="Times New Roman" w:hAnsi="Times New Roman" w:cs="Times New Roman"/>
           <w:vertAlign w:val="subscript"/>
-        </w:rPr>
-        <w:t xml:space="preserve">2</w:t>
-      </w:r>
-      <w:r>
-        <w:rPr>
-          <w:rFonts w:ascii="Times New Roman" w:hAnsi="Times New Roman" w:cs="Times New Roman"/>
-          <w:lang w:val="tr-TR"/>
-        </w:rPr>
-        <w:t xml:space="preserve">) karıştırılıp ısıtıldığında ise oksijen çıkışı daha düşük sıcaklıkta başlar ve çok daha hızlı gerçekleşir. Tepkime sonunda MnO</w:t>
-      </w:r>
-      <w:r>
-        <w:rPr>
-          <w:rFonts w:ascii="Times New Roman" w:hAnsi="Times New Roman" w:cs="Times New Roman"/>
-          <w:lang w:val="tr-TR"/>
+          <w:lang w:val="tr-TR"/>
+        </w:rPr>
+        <w:t>2</w:t>
+      </w:r>
+      <w:r>
+        <w:rPr>
+          <w:rFonts w:ascii="Times New Roman" w:hAnsi="Times New Roman" w:cs="Times New Roman"/>
+          <w:lang w:val="tr-TR"/>
+        </w:rPr>
+        <w:t>) karıştırılıp ısıtıldığında ise oksijen çıkışı daha düşük sıcaklıkta başlar ve çok daha hızlı gerçekleşir. Tepkime sonunda MnO</w:t>
+      </w:r>
+      <w:r>
+        <w:rPr>
+          <w:rFonts w:ascii="Times New Roman" w:hAnsi="Times New Roman" w:cs="Times New Roman"/>
           <w:vertAlign w:val="subscript"/>
-        </w:rPr>
-        <w:t xml:space="preserve">2</w:t>
+          <w:lang w:val="tr-TR"/>
+        </w:rPr>
+        <w:t>2</w:t>
       </w:r>
       <w:r>
         <w:rPr>
@@ -5085,10 +5132,10 @@
       <w:r>
         <w:rPr>
           <w:rFonts w:ascii="Times New Roman" w:hAnsi="Times New Roman" w:cs="Times New Roman"/>
-          <w:lang w:val="tr-TR"/>
           <w:vertAlign w:val="subscript"/>
-        </w:rPr>
-        <w:t xml:space="preserve">2</w:t>
+          <w:lang w:val="tr-TR"/>
+        </w:rPr>
+        <w:t>2</w:t>
       </w:r>
       <w:r>
         <w:rPr>
@@ -5162,29 +5209,29 @@
           <w:bCs/>
           <w:lang w:val="tr-TR"/>
         </w:rPr>
+        <w:t>Grafik B:</w:t>
+      </w:r>
+      <w:r>
+        <w:rPr>
+          <w:rFonts w:ascii="Times New Roman" w:hAnsi="Times New Roman" w:cs="Times New Roman"/>
+          <w:lang w:val="tr-TR"/>
+        </w:rPr>
+        <w:t xml:space="preserve"> Katalizörlü ve katalizörsüz bir ekzotermik tepkimeye ait potansiyel enerji-tepkime koordinatı grafiği</w:t>
+      </w:r>
+    </w:p>
+    <w:p>
+      <w:pPr>
+        <w:jc w:val="center"/>
+        <w:rPr>
+          <w:rFonts w:ascii="Times New Roman" w:hAnsi="Times New Roman" w:cs="Times New Roman"/>
+          <w:lang w:val="tr-TR"/>
+        </w:rPr>
+      </w:pPr>
+      <w:r>
+        <w:rPr>
+          <w:noProof/>
+        </w:rPr>
         <w:lastRenderedPageBreak/>
-        <w:t>Grafik B:</w:t>
-      </w:r>
-      <w:r>
-        <w:rPr>
-          <w:rFonts w:ascii="Times New Roman" w:hAnsi="Times New Roman" w:cs="Times New Roman"/>
-          <w:lang w:val="tr-TR"/>
-        </w:rPr>
-        <w:t xml:space="preserve"> Katalizörlü ve katalizörsüz bir ekzotermik tepkimeye ait potansiyel enerji-tepkime koordinatı grafiği</w:t>
-      </w:r>
-    </w:p>
-    <w:p>
-      <w:pPr>
-        <w:jc w:val="center"/>
-        <w:rPr>
-          <w:rFonts w:ascii="Times New Roman" w:hAnsi="Times New Roman" w:cs="Times New Roman"/>
-          <w:lang w:val="tr-TR"/>
-        </w:rPr>
-      </w:pPr>
-      <w:r>
-        <w:rPr>
-          <w:noProof/>
-        </w:rPr>
         <w:drawing>
           <wp:inline distT="0" distB="0" distL="0" distR="0" wp14:anchorId="69926181" wp14:editId="2FB36F26">
             <wp:extent cx="4680000" cy="2867280"/>
@@ -5260,7 +5307,7 @@
           <w:rFonts w:ascii="Times New Roman" w:hAnsi="Times New Roman" w:cs="Times New Roman"/>
           <w:lang w:val="tr-TR"/>
         </w:rPr>
-        <w:t xml:space="preserve">Katalizörlerin başlıca özellikleri şunlardır:</w:t>
+        <w:t>Katalizörlerin başlıca özellikleri şunlardır:</w:t>
       </w:r>
     </w:p>
     <w:p>
@@ -5281,7 +5328,7 @@
           <w:rFonts w:ascii="Times New Roman" w:hAnsi="Times New Roman" w:cs="Times New Roman"/>
           <w:lang w:val="tr-TR"/>
         </w:rPr>
-        <w:t xml:space="preserve">İleri ve geri tepkimelerin aktivasyon enerjilerini aynı miktarda düşürür. Bu nedenle tepkime entalpisini (ΔH) değiştirmez; ileri ve geri tepkimeleri birlikte hızlandırır.</w:t>
+        <w:t>İleri ve geri tepkimelerin aktivasyon enerjilerini aynı miktarda düşürür. Bu nedenle tepkime entalpisini (ΔH) değiştirmez; ileri ve geri tepkimeleri birlikte hızlandırır.</w:t>
       </w:r>
     </w:p>
     <w:p>
@@ -5302,7 +5349,7 @@
           <w:rFonts w:ascii="Times New Roman" w:hAnsi="Times New Roman" w:cs="Times New Roman"/>
           <w:lang w:val="tr-TR"/>
         </w:rPr>
-        <w:t xml:space="preserve">Tepkimede oluşan ürünlerin türünü ve tepkime sonunda elde edilen ürün miktarını (verimi) değiştirmez; ürünün daha kısa sürede elde edilmesini sağlar.</w:t>
+        <w:t>Tepkimede oluşan ürünlerin türünü ve tepkime sonunda elde edilen ürün miktarını (verimi) değiştirmez; ürünün daha kısa sürede elde edilmesini sağlar.</w:t>
       </w:r>
     </w:p>
     <w:p>
@@ -5323,7 +5370,7 @@
           <w:rFonts w:ascii="Times New Roman" w:hAnsi="Times New Roman" w:cs="Times New Roman"/>
           <w:lang w:val="tr-TR"/>
         </w:rPr>
-        <w:t xml:space="preserve">Kendiliğinden gerçekleşemeyecek bir tepkimeyi gerçekleştiremez; gerçekleşebilen bir tepkimeyi hızlandırır.</w:t>
+        <w:t>Kendiliğinden gerçekleşemeyecek bir tepkimeyi gerçekleştiremez; gerçekleşebilen bir tepkimeyi hızlandırır.</w:t>
       </w:r>
     </w:p>
     <w:p>
@@ -5344,23 +5391,23 @@
           <w:rFonts w:ascii="Times New Roman" w:hAnsi="Times New Roman" w:cs="Times New Roman"/>
           <w:lang w:val="tr-TR"/>
         </w:rPr>
-        <w:t xml:space="preserve">Tepkime sonunda kimyasal olarak değişmeden kalır; bu nedenle az miktarda katalizör çok miktarda tepkenin dönüşümünü hızlandırabilir.</w:t>
-      </w:r>
-    </w:p>
-    <w:p>
-      <w:pPr>
-        <w:jc w:val="both"/>
-        <w:rPr>
-          <w:rFonts w:ascii="Times New Roman" w:hAnsi="Times New Roman" w:cs="Times New Roman"/>
-          <w:lang w:val="tr-TR"/>
-        </w:rPr>
-      </w:pPr>
-      <w:r>
-        <w:rPr>
-          <w:rFonts w:ascii="Times New Roman" w:hAnsi="Times New Roman" w:cs="Times New Roman"/>
-          <w:lang w:val="tr-TR"/>
-        </w:rPr>
-        <w:t xml:space="preserve">Bazı durumlarda amaç bir tepkimeyi hızlandırmak değil, yavaşlatmaktır. Gıdaların bozulması ya da metallerin paslanması gibi istenmeyen tepkimeler nasıl geciktirilebilir? Tepkime hızını azaltan bu tür maddelere inhibitör denir. Bazı kaynaklarda inhibitörler negatif katalizör olarak da adlandırılır. İnhibitörler genellikle tepkimede etkin rol oynayan tanecikleri ya da katalizörün yüzeyini bağlayarak tepkimenin yavaşlamasına neden olur. Gıdaların bozulmasını geciktirmek için kullanılan bazı koruyucu ve antioksidan maddeler (askorbik asit gibi), araç radyatörlerine ve kalorifer tesisatlarına eklenen korozyon önleyiciler inhibitörlere örnektir.</w:t>
+        <w:t>Tepkime sonunda kimyasal olarak değişmeden kalır; bu nedenle az miktarda katalizör çok miktarda tepkenin dönüşümünü hızlandırabilir.</w:t>
+      </w:r>
+    </w:p>
+    <w:p>
+      <w:pPr>
+        <w:jc w:val="both"/>
+        <w:rPr>
+          <w:rFonts w:ascii="Times New Roman" w:hAnsi="Times New Roman" w:cs="Times New Roman"/>
+          <w:lang w:val="tr-TR"/>
+        </w:rPr>
+      </w:pPr>
+      <w:r>
+        <w:rPr>
+          <w:rFonts w:ascii="Times New Roman" w:hAnsi="Times New Roman" w:cs="Times New Roman"/>
+          <w:lang w:val="tr-TR"/>
+        </w:rPr>
+        <w:t>Bazı durumlarda amaç bir tepkimeyi hızlandırmak değil, yavaşlatmaktır. Gıdaların bozulması ya da metallerin paslanması gibi istenmeyen tepkimeler nasıl geciktirilebilir? Tepkime hızını azaltan bu tür maddelere inhibitör denir. Bazı kaynaklarda inhibitörler negatif katalizör olarak da adlandırılır. İnhibitörler genellikle tepkimede etkin rol oynayan tanecikleri ya da katalizörün yüzeyini bağlayarak tepkimenin yavaşlamasına neden olur. Gıdaların bozulmasını geciktirmek için kullanılan bazı koruyucu ve antioksidan maddeler (askorbik asit gibi), araç radyatörlerine ve kalorifer tesisatlarına eklenen korozyon önleyiciler inhibitörlere örnektir.</w:t>
       </w:r>
     </w:p>
     <w:p>
@@ -5443,7 +5490,15 @@
           <w:rFonts w:ascii="Times New Roman" w:hAnsi="Times New Roman" w:cs="Times New Roman"/>
           <w:lang w:val="tr-TR"/>
         </w:rPr>
-        <w:t>) ve su buharına (H</w:t>
+        <w:t xml:space="preserve">) </w:t>
+      </w:r>
+      <w:r>
+        <w:rPr>
+          <w:rFonts w:ascii="Times New Roman" w:hAnsi="Times New Roman" w:cs="Times New Roman"/>
+          <w:lang w:val="tr-TR"/>
+        </w:rPr>
+        <w:lastRenderedPageBreak/>
+        <w:t>ve su buharına (H</w:t>
       </w:r>
       <w:r>
         <w:rPr>
@@ -5574,15 +5629,7 @@
           <w:rFonts w:ascii="Times New Roman" w:hAnsi="Times New Roman" w:cs="Times New Roman"/>
           <w:lang w:val="tr-TR"/>
         </w:rPr>
-        <w:lastRenderedPageBreak/>
-        <w:t xml:space="preserve">Otomobil katalitik dönüştürücüsünün iç yapısı</w:t>
-      </w:r>
-      <w:r>
-        <w:rPr>
-          <w:rFonts w:ascii="Times New Roman" w:hAnsi="Times New Roman" w:cs="Times New Roman"/>
-          <w:lang w:val="tr-TR"/>
-        </w:rPr>
-        <w:t xml:space="preserve"/>
+        <w:t>Otomobil katalitik dönüştürücüsünün iç yapısı</w:t>
       </w:r>
     </w:p>
     <w:p>
@@ -5880,6 +5927,7 @@
           <w:noProof/>
           <w:lang w:val="tr-TR"/>
         </w:rPr>
+        <w:lastRenderedPageBreak/>
         <mc:AlternateContent>
           <mc:Choice Requires="wps">
             <w:drawing>
@@ -6299,7 +6347,6 @@
                 <w:rFonts w:ascii="Times New Roman" w:hAnsi="Times New Roman" w:cs="Times New Roman"/>
                 <w:lang w:val="tr-TR"/>
               </w:rPr>
-              <w:lastRenderedPageBreak/>
               <w:t>Kömür tozunun kömür parçasından daha hızlı yanması</w:t>
             </w:r>
           </w:p>
@@ -6762,6 +6809,7 @@
           <w:rFonts w:ascii="Times New Roman" w:hAnsi="Times New Roman" w:cs="Times New Roman"/>
           <w:lang w:val="tr-TR"/>
         </w:rPr>
+        <w:lastRenderedPageBreak/>
         <w:t>……………………………………………………………………………………………</w:t>
       </w:r>
     </w:p>
@@ -6869,7 +6917,6 @@
         <w:rPr>
           <w:noProof/>
         </w:rPr>
-        <w:lastRenderedPageBreak/>
         <w:drawing>
           <wp:inline distT="0" distB="0" distL="0" distR="0" wp14:anchorId="6DE7896F" wp14:editId="669051F2">
             <wp:extent cx="3960000" cy="2426160"/>
@@ -7070,7 +7117,7 @@
           <w:rFonts w:ascii="Times New Roman" w:hAnsi="Times New Roman" w:cs="Times New Roman"/>
           <w:lang w:val="tr-TR"/>
         </w:rPr>
-        <w:t xml:space="preserve">5. Aynı koşullarda tek basamakta gerçekleşen aşağıdaki tepkimelerden hangisinin daha hızlı olması beklenir? Gerekçesini çarpışma teorisi ile açıklayınız.</w:t>
+        <w:t>5. Aynı koşullarda tek basamakta gerçekleşen aşağıdaki tepkimelerden hangisinin daha hızlı olması beklenir? Gerekçesini çarpışma teorisi ile açıklayınız.</w:t>
       </w:r>
     </w:p>
     <w:p>
@@ -7086,7 +7133,7 @@
           <w:rFonts w:ascii="Times New Roman" w:hAnsi="Times New Roman" w:cs="Times New Roman"/>
           <w:lang w:val="tr-TR"/>
         </w:rPr>
-        <w:t xml:space="preserve">I. X(g) + Y(g) → XY(g)          II. 2X(g) + Y(g) → X</w:t>
+        <w:t>I. X(g) + Y(g) → XY(g)          II. 2X(g) + Y(g) → X</w:t>
       </w:r>
       <w:r>
         <w:rPr>
@@ -7094,14 +7141,14 @@
           <w:vertAlign w:val="subscript"/>
           <w:lang w:val="tr-TR"/>
         </w:rPr>
-        <w:t xml:space="preserve">2</w:t>
-      </w:r>
-      <w:r>
-        <w:rPr>
-          <w:rFonts w:ascii="Times New Roman" w:hAnsi="Times New Roman" w:cs="Times New Roman"/>
-          <w:lang w:val="tr-TR"/>
-        </w:rPr>
-        <w:t xml:space="preserve">Y(g)</w:t>
+        <w:t>2</w:t>
+      </w:r>
+      <w:r>
+        <w:rPr>
+          <w:rFonts w:ascii="Times New Roman" w:hAnsi="Times New Roman" w:cs="Times New Roman"/>
+          <w:lang w:val="tr-TR"/>
+        </w:rPr>
+        <w:t>Y(g)</w:t>
       </w:r>
     </w:p>
     <w:p>
@@ -7118,7 +7165,8 @@
           <w:rFonts w:ascii="Times New Roman" w:hAnsi="Times New Roman" w:cs="Times New Roman"/>
           <w:lang w:val="tr-TR"/>
         </w:rPr>
-        <w:t xml:space="preserve">……………………………………………………………………………………………</w:t>
+        <w:lastRenderedPageBreak/>
+        <w:t>……………………………………………………………………………………………</w:t>
       </w:r>
     </w:p>
     <w:p>
@@ -7135,23 +7183,23 @@
           <w:rFonts w:ascii="Times New Roman" w:hAnsi="Times New Roman" w:cs="Times New Roman"/>
           <w:lang w:val="tr-TR"/>
         </w:rPr>
-        <w:t xml:space="preserve">……………………………………………………………………………………………</w:t>
-      </w:r>
-    </w:p>
-    <w:p>
-      <w:pPr>
-        <w:jc w:val="both"/>
-        <w:rPr>
-          <w:rFonts w:ascii="Times New Roman" w:hAnsi="Times New Roman" w:cs="Times New Roman"/>
-          <w:lang w:val="tr-TR"/>
-        </w:rPr>
-      </w:pPr>
-      <w:r>
-        <w:rPr>
-          <w:rFonts w:ascii="Times New Roman" w:hAnsi="Times New Roman" w:cs="Times New Roman"/>
-          <w:lang w:val="tr-TR"/>
-        </w:rPr>
-        <w:t xml:space="preserve">6. Aşağıdaki ifadelerden doğru olanların başına “D”, yanlış olanların başına “Y” yazınız.</w:t>
+        <w:t>……………………………………………………………………………………………</w:t>
+      </w:r>
+    </w:p>
+    <w:p>
+      <w:pPr>
+        <w:jc w:val="both"/>
+        <w:rPr>
+          <w:rFonts w:ascii="Times New Roman" w:hAnsi="Times New Roman" w:cs="Times New Roman"/>
+          <w:lang w:val="tr-TR"/>
+        </w:rPr>
+      </w:pPr>
+      <w:r>
+        <w:rPr>
+          <w:rFonts w:ascii="Times New Roman" w:hAnsi="Times New Roman" w:cs="Times New Roman"/>
+          <w:lang w:val="tr-TR"/>
+        </w:rPr>
+        <w:t>6. Aşağıdaki ifadelerden doğru olanların başına “D”, yanlış olanların başına “Y” yazınız.</w:t>
       </w:r>
     </w:p>
     <w:p>
@@ -7168,7 +7216,7 @@
           <w:rFonts w:ascii="Times New Roman" w:hAnsi="Times New Roman" w:cs="Times New Roman"/>
           <w:lang w:val="tr-TR"/>
         </w:rPr>
-        <w:t xml:space="preserve">(  ) Katalizör, tepkime sonunda elde edilen ürün miktarını artırır.</w:t>
+        <w:t>(  ) Katalizör, tepkime sonunda elde edilen ürün miktarını artırır.</w:t>
       </w:r>
     </w:p>
     <w:p>
@@ -7185,7 +7233,7 @@
           <w:rFonts w:ascii="Times New Roman" w:hAnsi="Times New Roman" w:cs="Times New Roman"/>
           <w:lang w:val="tr-TR"/>
         </w:rPr>
-        <w:t xml:space="preserve">(  ) Katalizör yalnızca ileri tepkimenin aktivasyon enerjisini düşürür.</w:t>
+        <w:t>(  ) Katalizör yalnızca ileri tepkimenin aktivasyon enerjisini düşürür.</w:t>
       </w:r>
     </w:p>
     <w:p>
@@ -7202,7 +7250,7 @@
           <w:rFonts w:ascii="Times New Roman" w:hAnsi="Times New Roman" w:cs="Times New Roman"/>
           <w:lang w:val="tr-TR"/>
         </w:rPr>
-        <w:t xml:space="preserve">(  ) Enzimler, canlılarda gerçekleşen tepkimeleri hızlandıran katalizörlerdir.</w:t>
+        <w:t>(  ) Enzimler, canlılarda gerçekleşen tepkimeleri hızlandıran katalizörlerdir.</w:t>
       </w:r>
     </w:p>
     <w:p>
@@ -7219,7 +7267,7 @@
           <w:rFonts w:ascii="Times New Roman" w:hAnsi="Times New Roman" w:cs="Times New Roman"/>
           <w:lang w:val="tr-TR"/>
         </w:rPr>
-        <w:t xml:space="preserve">(  ) İnhibitörler tepkime hızını azaltır.</w:t>
+        <w:t>(  ) İnhibitörler tepkime hızını azaltır.</w:t>
       </w:r>
     </w:p>
     <w:p>
@@ -7236,7 +7284,7 @@
           <w:rFonts w:ascii="Times New Roman" w:hAnsi="Times New Roman" w:cs="Times New Roman"/>
           <w:lang w:val="tr-TR"/>
         </w:rPr>
-        <w:t xml:space="preserve">(  ) Katalizör tepkimenin izlediği yolu değiştirir.</w:t>
+        <w:t>(  ) Katalizör tepkimenin izlediği yolu değiştirir.</w:t>
       </w:r>
     </w:p>
     <w:p>
@@ -7686,7 +7734,7 @@
 <file path=word/numbering.xml><?xml version="1.0" encoding="utf-8"?>
 <w:numbering xmlns:wpc="http://schemas.microsoft.com/office/word/2010/wordprocessingCanvas" xmlns:cx="http://schemas.microsoft.com/office/drawing/2014/chartex" xmlns:cx1="http://schemas.microsoft.com/office/drawing/2015/9/8/chartex" xmlns:cx2="http://schemas.microsoft.com/office/drawing/2015/10/21/chartex" xmlns:cx3="http://schemas.microsoft.com/office/drawing/2016/5/9/chartex" xmlns:cx4="http://schemas.microsoft.com/office/drawing/2016/5/10/chartex" xmlns:cx5="http://schemas.microsoft.com/office/drawing/2016/5/11/chartex" xmlns:cx6="http://schemas.microsoft.com/office/drawing/2016/5/12/chartex" xmlns:cx7="http://schemas.microsoft.com/office/drawing/2016/5/13/chartex" xmlns:cx8="http://schemas.microsoft.com/office/drawing/2016/5/14/chartex" xmlns:mc="http://schemas.openxmlformats.org/markup-compatibility/2006" xmlns:m="http://schemas.openxmlformats.org/officeDocument/2006/math" xmlns:aink="http://schemas.microsoft.com/office/drawing/2016/ink" xmlns:am3d="http://schemas.microsoft.com/office/drawing/2017/model3d" xmlns:oel="http://schemas.microsoft.com/office/2019/extlst" xmlns:r="http://schemas.openxmlformats.org/officeDocument/2006/relationships" xmlns:wp14="http://schemas.microsoft.com/office/word/2010/wordprocessingDrawing" xmlns:wp="http://schemas.openxmlformats.org/drawingml/2006/wordprocessingDrawing" xmlns:wpg="http://schemas.microsoft.com/office/word/2010/wordprocessingGroup" xmlns:wpi="http://schemas.microsoft.com/office/word/2010/wordprocessingInk" xmlns:wps="http://schemas.microsoft.com/office/word/2010/wordprocessingShape" xmlns:o="urn:schemas-microsoft-com:office:office" xmlns:v="urn:schemas-microsoft-com:vml" xmlns:w10="urn:schemas-microsoft-com:office:word" xmlns:w="http://schemas.openxmlformats.org/wordprocessingml/2006/main" xmlns:w14="http://schemas.microsoft.com/office/word/2010/wordml" xmlns:w15="http://schemas.microsoft.com/office/word/2012/wordml" xmlns:w16cex="http://schemas.microsoft.com/office/word/2018/wordml/cex" xmlns:w16cid="http://schemas.microsoft.com/office/word/2016/wordml/cid" xmlns:w16="http://schemas.microsoft.com/office/word/2018/wordml" xmlns:w16sdtdh="http://schemas.microsoft.com/office/word/2020/wordml/sdtdatahash" xmlns:w16sdtfl="http://schemas.microsoft.com/office/word/2024/wordml/sdtformatlock" xmlns:w16se="http://schemas.microsoft.com/office/word/2015/wordml/symex" xmlns:w16du="http://schemas.microsoft.com/office/word/2023/wordml/word16du" xmlns:wne="http://schemas.microsoft.com/office/word/2006/wordml" mc:Ignorable="w14 w15 w16se w16cid w16 w16cex w16sdtdh w16sdtfl w16du wp14">
   <w:abstractNum w:abstractNumId="0" w15:restartNumberingAfterBreak="0">
-    <w:nsid w:val="01217A70"/>
+    <w:nsid w:val="854F5509"/>
     <w:multiLevelType w:val="hybridMultilevel"/>
     <w:tmpl w:val="9E326D80"/>
     <w:lvl w:ilvl="0" w:tplc="627EE736">
@@ -7799,6 +7847,119 @@
     </w:lvl>
   </w:abstractNum>
   <w:abstractNum w:abstractNumId="1" w15:restartNumberingAfterBreak="0">
+    <w:nsid w:val="01217A70"/>
+    <w:multiLevelType w:val="hybridMultilevel"/>
+    <w:tmpl w:val="9E326D80"/>
+    <w:lvl w:ilvl="0" w:tplc="627EE736">
+      <w:start w:val="1"/>
+      <w:numFmt w:val="bullet"/>
+      <w:lvlText w:val=""/>
+      <w:lvlJc w:val="left"/>
+      <w:pPr>
+        <w:ind w:left="1080" w:hanging="360"/>
+      </w:pPr>
+      <w:rPr>
+        <w:rFonts w:ascii="Symbol" w:eastAsiaTheme="minorHAnsi" w:hAnsi="Symbol" w:cs="Times New Roman" w:hint="default"/>
+      </w:rPr>
+    </w:lvl>
+    <w:lvl w:ilvl="1" w:tplc="04090003" w:tentative="1">
+      <w:start w:val="1"/>
+      <w:numFmt w:val="bullet"/>
+      <w:lvlText w:val="o"/>
+      <w:lvlJc w:val="left"/>
+      <w:pPr>
+        <w:ind w:left="1800" w:hanging="360"/>
+      </w:pPr>
+      <w:rPr>
+        <w:rFonts w:ascii="Courier New" w:hAnsi="Courier New" w:cs="Courier New" w:hint="default"/>
+      </w:rPr>
+    </w:lvl>
+    <w:lvl w:ilvl="2" w:tplc="04090005" w:tentative="1">
+      <w:start w:val="1"/>
+      <w:numFmt w:val="bullet"/>
+      <w:lvlText w:val=""/>
+      <w:lvlJc w:val="left"/>
+      <w:pPr>
+        <w:ind w:left="2520" w:hanging="360"/>
+      </w:pPr>
+      <w:rPr>
+        <w:rFonts w:ascii="Wingdings" w:hAnsi="Wingdings" w:hint="default"/>
+      </w:rPr>
+    </w:lvl>
+    <w:lvl w:ilvl="3" w:tplc="04090001" w:tentative="1">
+      <w:start w:val="1"/>
+      <w:numFmt w:val="bullet"/>
+      <w:lvlText w:val=""/>
+      <w:lvlJc w:val="left"/>
+      <w:pPr>
+        <w:ind w:left="3240" w:hanging="360"/>
+      </w:pPr>
+      <w:rPr>
+        <w:rFonts w:ascii="Symbol" w:hAnsi="Symbol" w:hint="default"/>
+      </w:rPr>
+    </w:lvl>
+    <w:lvl w:ilvl="4" w:tplc="04090003" w:tentative="1">
+      <w:start w:val="1"/>
+      <w:numFmt w:val="bullet"/>
+      <w:lvlText w:val="o"/>
+      <w:lvlJc w:val="left"/>
+      <w:pPr>
+        <w:ind w:left="3960" w:hanging="360"/>
+      </w:pPr>
+      <w:rPr>
+        <w:rFonts w:ascii="Courier New" w:hAnsi="Courier New" w:cs="Courier New" w:hint="default"/>
+      </w:rPr>
+    </w:lvl>
+    <w:lvl w:ilvl="5" w:tplc="04090005" w:tentative="1">
+      <w:start w:val="1"/>
+      <w:numFmt w:val="bullet"/>
+      <w:lvlText w:val=""/>
+      <w:lvlJc w:val="left"/>
+      <w:pPr>
+        <w:ind w:left="4680" w:hanging="360"/>
+      </w:pPr>
+      <w:rPr>
+        <w:rFonts w:ascii="Wingdings" w:hAnsi="Wingdings" w:hint="default"/>
+      </w:rPr>
+    </w:lvl>
+    <w:lvl w:ilvl="6" w:tplc="04090001" w:tentative="1">
+      <w:start w:val="1"/>
+      <w:numFmt w:val="bullet"/>
+      <w:lvlText w:val=""/>
+      <w:lvlJc w:val="left"/>
+      <w:pPr>
+        <w:ind w:left="5400" w:hanging="360"/>
+      </w:pPr>
+      <w:rPr>
+        <w:rFonts w:ascii="Symbol" w:hAnsi="Symbol" w:hint="default"/>
+      </w:rPr>
+    </w:lvl>
+    <w:lvl w:ilvl="7" w:tplc="04090003" w:tentative="1">
+      <w:start w:val="1"/>
+      <w:numFmt w:val="bullet"/>
+      <w:lvlText w:val="o"/>
+      <w:lvlJc w:val="left"/>
+      <w:pPr>
+        <w:ind w:left="6120" w:hanging="360"/>
+      </w:pPr>
+      <w:rPr>
+        <w:rFonts w:ascii="Courier New" w:hAnsi="Courier New" w:cs="Courier New" w:hint="default"/>
+      </w:rPr>
+    </w:lvl>
+    <w:lvl w:ilvl="8" w:tplc="04090005" w:tentative="1">
+      <w:start w:val="1"/>
+      <w:numFmt w:val="bullet"/>
+      <w:lvlText w:val=""/>
+      <w:lvlJc w:val="left"/>
+      <w:pPr>
+        <w:ind w:left="6840" w:hanging="360"/>
+      </w:pPr>
+      <w:rPr>
+        <w:rFonts w:ascii="Wingdings" w:hAnsi="Wingdings" w:hint="default"/>
+      </w:rPr>
+    </w:lvl>
+  </w:abstractNum>
+  <w:abstractNum w:abstractNumId="2" w15:restartNumberingAfterBreak="0">
     <w:nsid w:val="32EA6E56"/>
     <w:multiLevelType w:val="hybridMultilevel"/>
     <w:tmpl w:val="2CAE595E"/>
@@ -7888,7 +8049,7 @@
       </w:pPr>
     </w:lvl>
   </w:abstractNum>
-  <w:abstractNum w:abstractNumId="2" w15:restartNumberingAfterBreak="0">
+  <w:abstractNum w:abstractNumId="3" w15:restartNumberingAfterBreak="0">
     <w:nsid w:val="6FC2461C"/>
     <w:multiLevelType w:val="multilevel"/>
     <w:tmpl w:val="AB182936"/>
@@ -8001,142 +8162,29 @@
       </w:rPr>
     </w:lvl>
   </w:abstractNum>
-  <w:abstractNum w:abstractNumId="3" w15:restartNumberingAfterBreak="0">
-    <w:nsid w:val="854F5509"/>
-    <w:multiLevelType w:val="hybridMultilevel"/>
-    <w:tmpl w:val="9E326D80"/>
-    <w:lvl w:ilvl="0" w:tplc="627EE736">
-      <w:start w:val="1"/>
-      <w:numFmt w:val="bullet"/>
-      <w:lvlText w:val=""/>
-      <w:lvlJc w:val="left"/>
-      <w:pPr>
-        <w:ind w:left="1080" w:hanging="360"/>
-      </w:pPr>
-      <w:rPr>
-        <w:rFonts w:ascii="Symbol" w:eastAsiaTheme="minorHAnsi" w:hAnsi="Symbol" w:cs="Times New Roman" w:hint="default"/>
-      </w:rPr>
-    </w:lvl>
-    <w:lvl w:ilvl="1" w:tplc="04090003" w:tentative="1">
-      <w:start w:val="1"/>
-      <w:numFmt w:val="bullet"/>
-      <w:lvlText w:val="o"/>
-      <w:lvlJc w:val="left"/>
-      <w:pPr>
-        <w:ind w:left="1800" w:hanging="360"/>
-      </w:pPr>
-      <w:rPr>
-        <w:rFonts w:ascii="Courier New" w:hAnsi="Courier New" w:cs="Courier New" w:hint="default"/>
-      </w:rPr>
-    </w:lvl>
-    <w:lvl w:ilvl="2" w:tplc="04090005" w:tentative="1">
-      <w:start w:val="1"/>
-      <w:numFmt w:val="bullet"/>
-      <w:lvlText w:val=""/>
-      <w:lvlJc w:val="left"/>
-      <w:pPr>
-        <w:ind w:left="2520" w:hanging="360"/>
-      </w:pPr>
-      <w:rPr>
-        <w:rFonts w:ascii="Wingdings" w:hAnsi="Wingdings" w:hint="default"/>
-      </w:rPr>
-    </w:lvl>
-    <w:lvl w:ilvl="3" w:tplc="04090001" w:tentative="1">
-      <w:start w:val="1"/>
-      <w:numFmt w:val="bullet"/>
-      <w:lvlText w:val=""/>
-      <w:lvlJc w:val="left"/>
-      <w:pPr>
-        <w:ind w:left="3240" w:hanging="360"/>
-      </w:pPr>
-      <w:rPr>
-        <w:rFonts w:ascii="Symbol" w:hAnsi="Symbol" w:hint="default"/>
-      </w:rPr>
-    </w:lvl>
-    <w:lvl w:ilvl="4" w:tplc="04090003" w:tentative="1">
-      <w:start w:val="1"/>
-      <w:numFmt w:val="bullet"/>
-      <w:lvlText w:val="o"/>
-      <w:lvlJc w:val="left"/>
-      <w:pPr>
-        <w:ind w:left="3960" w:hanging="360"/>
-      </w:pPr>
-      <w:rPr>
-        <w:rFonts w:ascii="Courier New" w:hAnsi="Courier New" w:cs="Courier New" w:hint="default"/>
-      </w:rPr>
-    </w:lvl>
-    <w:lvl w:ilvl="5" w:tplc="04090005" w:tentative="1">
-      <w:start w:val="1"/>
-      <w:numFmt w:val="bullet"/>
-      <w:lvlText w:val=""/>
-      <w:lvlJc w:val="left"/>
-      <w:pPr>
-        <w:ind w:left="4680" w:hanging="360"/>
-      </w:pPr>
-      <w:rPr>
-        <w:rFonts w:ascii="Wingdings" w:hAnsi="Wingdings" w:hint="default"/>
-      </w:rPr>
-    </w:lvl>
-    <w:lvl w:ilvl="6" w:tplc="04090001" w:tentative="1">
-      <w:start w:val="1"/>
-      <w:numFmt w:val="bullet"/>
-      <w:lvlText w:val=""/>
-      <w:lvlJc w:val="left"/>
-      <w:pPr>
-        <w:ind w:left="5400" w:hanging="360"/>
-      </w:pPr>
-      <w:rPr>
-        <w:rFonts w:ascii="Symbol" w:hAnsi="Symbol" w:hint="default"/>
-      </w:rPr>
-    </w:lvl>
-    <w:lvl w:ilvl="7" w:tplc="04090003" w:tentative="1">
-      <w:start w:val="1"/>
-      <w:numFmt w:val="bullet"/>
-      <w:lvlText w:val="o"/>
-      <w:lvlJc w:val="left"/>
-      <w:pPr>
-        <w:ind w:left="6120" w:hanging="360"/>
-      </w:pPr>
-      <w:rPr>
-        <w:rFonts w:ascii="Courier New" w:hAnsi="Courier New" w:cs="Courier New" w:hint="default"/>
-      </w:rPr>
-    </w:lvl>
-    <w:lvl w:ilvl="8" w:tplc="04090005" w:tentative="1">
-      <w:start w:val="1"/>
-      <w:numFmt w:val="bullet"/>
-      <w:lvlText w:val=""/>
-      <w:lvlJc w:val="left"/>
-      <w:pPr>
-        <w:ind w:left="6840" w:hanging="360"/>
-      </w:pPr>
-      <w:rPr>
-        <w:rFonts w:ascii="Wingdings" w:hAnsi="Wingdings" w:hint="default"/>
-      </w:rPr>
-    </w:lvl>
-  </w:abstractNum>
   <w:num w:numId="1" w16cid:durableId="936672177">
-    <w:abstractNumId w:val="2"/>
+    <w:abstractNumId w:val="3"/>
   </w:num>
   <w:num w:numId="2" w16cid:durableId="586303353">
-    <w:abstractNumId w:val="0"/>
+    <w:abstractNumId w:val="1"/>
     <w:lvlOverride w:ilvl="0">
       <w:startOverride w:val="1"/>
     </w:lvlOverride>
   </w:num>
   <w:num w:numId="3" w16cid:durableId="1148547480">
-    <w:abstractNumId w:val="0"/>
+    <w:abstractNumId w:val="1"/>
     <w:lvlOverride w:ilvl="0">
       <w:startOverride w:val="1"/>
     </w:lvlOverride>
   </w:num>
   <w:num w:numId="4" w16cid:durableId="276834025">
-    <w:abstractNumId w:val="1"/>
+    <w:abstractNumId w:val="2"/>
     <w:lvlOverride w:ilvl="0">
       <w:startOverride w:val="1"/>
     </w:lvlOverride>
   </w:num>
-  <w:num xmlns:a="http://schemas.openxmlformats.org/drawingml/2006/main" xmlns:pic="http://schemas.openxmlformats.org/drawingml/2006/picture" w:numId="5">
-    <w:abstractNumId w:val="3"/>
+  <w:num w:numId="5" w16cid:durableId="961113868">
+    <w:abstractNumId w:val="0"/>
     <w:lvlOverride w:ilvl="0">
       <w:startOverride w:val="1"/>
     </w:lvlOverride>

</xml_diff>

<commit_message>
1.7: fiziksel hal ve tepken derisimi icin gunluk hayat ornekleri degistirildi (parafin, sirke-kirec); 1.7 duzenlemeleri
</commit_message>
<xml_diff>
--- a/Kim11-1-7-Tepkime-Hizina-Etki-Eden-Faktorler.docx
+++ b/Kim11-1-7-Tepkime-Hizina-Etki-Eden-Faktorler.docx
@@ -289,7 +289,7 @@
           <w:noProof/>
         </w:rPr>
         <w:drawing>
-          <wp:inline distT="0" distB="0" distL="0" distR="0" wp14:anchorId="04A89E27" wp14:editId="0BC87936">
+          <wp:inline distT="0" distB="0" distL="0" distR="0" wp14:anchorId="04A89E27" wp14:editId="09DCE0F9">
             <wp:extent cx="5943600" cy="4358640"/>
             <wp:effectExtent l="0" t="0" r="0" b="0"/>
             <wp:docPr id="2123729894" name="Picture 12" descr="Rusty iron nails piled up in a disorderly fashion"/>
@@ -565,21 +565,7 @@
           <w:rFonts w:ascii="Times New Roman" w:hAnsi="Times New Roman" w:cs="Times New Roman"/>
           <w:lang w:val="tr-TR"/>
         </w:rPr>
-        <w:t>Analiz ve Keşif Atölyesi 1.7.’deki etkinliği yaparak tepkime hızına etki eden faktörleri keşfediniz. Bu etkinlikte bilimsel sorgulama becerinizi kullanarak günlük hayattaki olaylardan araştırılabilir sorular türetecek, hipotezler kuracak, değişkenleri belirleyerek deneyler planlayıp uygulayacak ve elde ettiğiniz verileri çarpışma teorisiyle yorumlayacaksınız. Grubunuzla iş birliği içinde, planlı ve sistemli çalışırken merakınızın peşinden giderek araştırmacı yönünüzü; görev paylaşımında sorumluluk alarak da çalışkanlık ve dostluk değerlerinizi güçlendireceksiniz.</w:t>
-      </w:r>
-      <w:r>
-        <w:rPr>
-          <w:rFonts w:ascii="Times New Roman" w:hAnsi="Times New Roman" w:cs="Times New Roman"/>
-          <w:lang w:val="tr-TR"/>
-        </w:rPr>
-        <w:t xml:space="preserve"> </w:t>
-      </w:r>
-      <w:r>
-        <w:rPr>
-          <w:rFonts w:ascii="Times New Roman" w:hAnsi="Times New Roman" w:cs="Times New Roman"/>
-          <w:lang w:val="tr-TR"/>
-        </w:rPr>
-        <w:t>Çalışmaya başlamadan önce karekodda yer alan “Ön Bilgi ve Hedef Belirleme Formu”nu doldurunuz. Bu formda konu ile ilgili ön bilgilerinizi, deney sürecinde neyi öğrenmeyi beklediğinizi, hangi stratejileri kullanacağınızı ve bu süreçte neler hissedebileceğinizi belirtiniz.</w:t>
+        <w:t>Analiz ve Keşif Atölyesi 1.7.’deki etkinliği yaparak tepkime hızına etki eden faktörleri keşfediniz. Bu etkinlikte bilimsel sorgulama becerinizi kullanarak günlük hayattaki olaylardan araştırılabilir sorular türetecek, hipotezler kuracak, değişkenleri belirleyerek deneyler planlayıp uygulayacak ve elde ettiğiniz verileri çarpışma teorisiyle yorumlayacaksınız. Grubunuzla iş birliği içinde, planlı ve sistemli çalışırken merakınızın peşinden giderek araştırmacı yönünüzü; görev paylaşımında sorumluluk alarak da çalışkanlık ve dostluk değerlerinizi güçlendireceksiniz. Çalışmaya başlamadan önce karekodda yer alan “Ön Bilgi ve Hedef Belirleme Formu”nu doldurunuz. Bu formda konu ile ilgili ön bilgilerinizi, deney sürecinde neyi öğrenmeyi beklediğinizi, hangi stratejileri kullanacağınızı ve bu süreçte neler hissedebileceğinizi belirtiniz.</w:t>
       </w:r>
     </w:p>
     <w:p>
@@ -764,24 +750,7 @@
           <w:highlight w:val="yellow"/>
           <w:lang w:val="tr-TR"/>
         </w:rPr>
-        <w:t xml:space="preserve">Etkinlik başlığının yanına Kimya10 kitabındaki “Temel Uyarı ve Güvenlik İşaretleri” sayfasından şu işaretler konulsun: GÖZLÜK KULLAN, ELDİVEN GİY, KORUYUCU ELBİSE GİY, KOROZİF (AŞINDIRICI) MADDE, TAHRİŞ EDİCİ MADDE, MASKE KULLAN, YANICI MADDE, SICAK CİSİM UYARISI, KIRILABİLİR CAM UYARISI. Ek uyarılar: Hidroklorik asit aşındırıcıdır. Sodyum tiyosülfat ile hidroklorik asidin tepkimesinde boğucu SO</w:t>
-      </w:r>
-      <w:r>
-        <w:rPr>
-          <w:rFonts w:ascii="Times New Roman" w:hAnsi="Times New Roman" w:cs="Times New Roman"/>
-          <w:highlight w:val="yellow"/>
-          <w:lang w:val="tr-TR"/>
-          <w:vertAlign w:val="subscript"/>
-        </w:rPr>
-        <w:t xml:space="preserve">2</w:t>
-      </w:r>
-      <w:r>
-        <w:rPr>
-          <w:rFonts w:ascii="Times New Roman" w:hAnsi="Times New Roman" w:cs="Times New Roman"/>
-          <w:highlight w:val="yellow"/>
-          <w:lang w:val="tr-TR"/>
-        </w:rPr>
-        <w:t xml:space="preserve"> gazı oluştuğundan bu deney iyi havalandırılan bir ortamda ya da çeker ocakta yapılmalıdır. Metallerin asitle tepkimesinde oluşan hidrojen gazı yanıcıdır; deney tüplerinin yakınında açık alev bulundurulmamalıdır. Kor hâlindeki kıymık yalnızca öğretmen gözetiminde kullanılmalıdır.</w:t>
+        <w:t xml:space="preserve">Etkinlik başlığının yanına Kimya10 kitabındaki “Temel Uyarı ve Güvenlik İşaretleri” sayfasından şu işaretler konulsun: GÖZLÜK KULLAN, ELDİVEN GİY, KORUYUCU ELBİSE GİY, KOROZİF (AŞINDIRICI) MADDE, TAHRİŞ EDİCİ MADDE, MASKE KULLAN, YANICI MADDE, SICAK CİSİM UYARISI, KIRILABİLİR CAM UYARISI. </w:t>
       </w:r>
     </w:p>
     <w:p>
@@ -815,7 +784,7 @@
           <w:rFonts w:ascii="Times New Roman" w:hAnsi="Times New Roman" w:cs="Times New Roman"/>
           <w:lang w:val="tr-TR"/>
         </w:rPr>
-        <w:t>Aşağıdaki tabloda günlük hayattan tepkime hızıyla ilişkili bazı örnek olaylar verilmiştir. İlk satır örnek olarak doldurulmuştur. Tablodaki örnek olaylardan yararlanarak her bir faktörün tepkime hızına etkisine ilişkin araştırılabilir bir soru ve bu soruya yönelik bir hipotez yazınız. Hipotezlerinizi oluştururken ön bilgilerinizden ve ders kitabı, güvenilir bilimsel kaynaklar gibi kaynaklardan yararlanınız. Çeşitli fikir, argüman ve yeni bilgilere açık olunuz; merak ettiğiniz soruların peşinden gitmenin bilimsel gelişimin bir parçası olduğunu unutmayınız.</w:t>
+        <w:t>Aşağıdaki tabloda günlük hayattan tepkime hızıyla ilişkili bazı örnek olaylar verilmiştir. Tablodaki örnek olaylardan yararlanarak her bir faktörün tepkime hızına etkisine ilişkin araştırılabilir bir soru ve bu soruya yönelik bir hipotez yazınız. Çeşitli fikir, argüman ve yeni bilgilere açık olunuz; merak ettiğiniz soruların peşinden gitmenin bilimsel gelişimin bir parçası olduğunu unutmayınız.</w:t>
       </w:r>
     </w:p>
     <w:tbl>
@@ -863,8 +832,6 @@
                 <w:rFonts w:ascii="Times New Roman" w:hAnsi="Times New Roman" w:cs="Times New Roman"/>
                 <w:b/>
                 <w:bCs/>
-                <w:sz w:val="20"/>
-                <w:szCs w:val="20"/>
                 <w:lang w:val="tr-TR"/>
               </w:rPr>
               <w:t>Faktör</w:t>
@@ -891,8 +858,6 @@
                 <w:rFonts w:ascii="Times New Roman" w:hAnsi="Times New Roman" w:cs="Times New Roman"/>
                 <w:b/>
                 <w:bCs/>
-                <w:sz w:val="20"/>
-                <w:szCs w:val="20"/>
                 <w:lang w:val="tr-TR"/>
               </w:rPr>
               <w:t>Günlük hayattan örnek olay</w:t>
@@ -919,8 +884,6 @@
                 <w:rFonts w:ascii="Times New Roman" w:hAnsi="Times New Roman" w:cs="Times New Roman"/>
                 <w:b/>
                 <w:bCs/>
-                <w:sz w:val="20"/>
-                <w:szCs w:val="20"/>
                 <w:lang w:val="tr-TR"/>
               </w:rPr>
               <w:t>Araştırılabilir soru</w:t>
@@ -947,8 +910,6 @@
                 <w:rFonts w:ascii="Times New Roman" w:hAnsi="Times New Roman" w:cs="Times New Roman"/>
                 <w:b/>
                 <w:bCs/>
-                <w:sz w:val="20"/>
-                <w:szCs w:val="20"/>
                 <w:lang w:val="tr-TR"/>
               </w:rPr>
               <w:t>Hipotez</w:t>
@@ -976,8 +937,6 @@
             <w:r>
               <w:rPr>
                 <w:rFonts w:ascii="Times New Roman" w:hAnsi="Times New Roman" w:cs="Times New Roman"/>
-                <w:sz w:val="20"/>
-                <w:szCs w:val="20"/>
                 <w:lang w:val="tr-TR"/>
               </w:rPr>
               <w:t>Sıcaklık</w:t>
@@ -999,8 +958,6 @@
             <w:r>
               <w:rPr>
                 <w:rFonts w:ascii="Times New Roman" w:hAnsi="Times New Roman" w:cs="Times New Roman"/>
-                <w:sz w:val="20"/>
-                <w:szCs w:val="20"/>
                 <w:lang w:val="tr-TR"/>
               </w:rPr>
               <w:t>Süt, buzdolabında oda sıcaklığına göre daha geç bozulur.</w:t>
@@ -1022,8 +979,6 @@
             <w:r>
               <w:rPr>
                 <w:rFonts w:ascii="Times New Roman" w:hAnsi="Times New Roman" w:cs="Times New Roman"/>
-                <w:sz w:val="20"/>
-                <w:szCs w:val="20"/>
                 <w:lang w:val="tr-TR"/>
               </w:rPr>
               <w:t>Sıcaklık, sütün bozulma tepkimelerinin hızını nasıl etkiler?</w:t>
@@ -1045,8 +1000,6 @@
             <w:r>
               <w:rPr>
                 <w:rFonts w:ascii="Times New Roman" w:hAnsi="Times New Roman" w:cs="Times New Roman"/>
-                <w:sz w:val="20"/>
-                <w:szCs w:val="20"/>
                 <w:lang w:val="tr-TR"/>
               </w:rPr>
               <w:t>Sıcaklık arttıkça sütün bozulma hızı artar.</w:t>
@@ -1074,8 +1027,6 @@
             <w:r>
               <w:rPr>
                 <w:rFonts w:ascii="Times New Roman" w:hAnsi="Times New Roman" w:cs="Times New Roman"/>
-                <w:sz w:val="20"/>
-                <w:szCs w:val="20"/>
                 <w:lang w:val="tr-TR"/>
               </w:rPr>
               <w:t>Tepken cinsi</w:t>
@@ -1097,11 +1048,23 @@
             <w:r>
               <w:rPr>
                 <w:rFonts w:ascii="Times New Roman" w:hAnsi="Times New Roman" w:cs="Times New Roman"/>
-                <w:sz w:val="20"/>
-                <w:szCs w:val="20"/>
-                <w:lang w:val="tr-TR"/>
-              </w:rPr>
-              <w:t>Sodyum metali suyla şiddetle tepkimeye girerken demir suyla çok yavaş tepkimeye girer.</w:t>
+                <w:lang w:val="tr-TR"/>
+              </w:rPr>
+              <w:t>Sodyum metali suyla şiddetle tepkimeye girerken</w:t>
+            </w:r>
+            <w:r>
+              <w:rPr>
+                <w:rFonts w:ascii="Times New Roman" w:hAnsi="Times New Roman" w:cs="Times New Roman"/>
+                <w:lang w:val="tr-TR"/>
+              </w:rPr>
+              <w:t>,</w:t>
+            </w:r>
+            <w:r>
+              <w:rPr>
+                <w:rFonts w:ascii="Times New Roman" w:hAnsi="Times New Roman" w:cs="Times New Roman"/>
+                <w:lang w:val="tr-TR"/>
+              </w:rPr>
+              <w:t xml:space="preserve"> demir suyla çok yavaş tepkimeye girer.</w:t>
             </w:r>
           </w:p>
         </w:tc>
@@ -1154,8 +1117,6 @@
             <w:r>
               <w:rPr>
                 <w:rFonts w:ascii="Times New Roman" w:hAnsi="Times New Roman" w:cs="Times New Roman"/>
-                <w:sz w:val="20"/>
-                <w:szCs w:val="20"/>
                 <w:lang w:val="tr-TR"/>
               </w:rPr>
               <w:t>Fiziksel hâl</w:t>
@@ -1177,11 +1138,9 @@
             <w:r>
               <w:rPr>
                 <w:rFonts w:ascii="Times New Roman" w:hAnsi="Times New Roman" w:cs="Times New Roman"/>
-                <w:sz w:val="20"/>
-                <w:szCs w:val="20"/>
-                <w:lang w:val="tr-TR"/>
-              </w:rPr>
-              <w:t>Kabartma tozu kuru hâldeyken değişmeden kalır, hamura su eklendiğinde gaz çıkışı başlar.</w:t>
+                <w:lang w:val="tr-TR"/>
+              </w:rPr>
+              <w:t xml:space="preserve">Bir parça katı parafine kibrit alevi tutulduğunda parafin hemen tutuşmaz; mumun fitilinde eriyip buhar hâline geçen parafin ise alevle hızla yanar.</w:t>
             </w:r>
           </w:p>
         </w:tc>
@@ -1234,8 +1193,6 @@
             <w:r>
               <w:rPr>
                 <w:rFonts w:ascii="Times New Roman" w:hAnsi="Times New Roman" w:cs="Times New Roman"/>
-                <w:sz w:val="20"/>
-                <w:szCs w:val="20"/>
                 <w:lang w:val="tr-TR"/>
               </w:rPr>
               <w:t>Tepken derişimi</w:t>
@@ -1257,11 +1214,9 @@
             <w:r>
               <w:rPr>
                 <w:rFonts w:ascii="Times New Roman" w:hAnsi="Times New Roman" w:cs="Times New Roman"/>
-                <w:sz w:val="20"/>
-                <w:szCs w:val="20"/>
-                <w:lang w:val="tr-TR"/>
-              </w:rPr>
-              <w:t>Saf oksijen içine sokulan kor hâlindeki tahta kıymık alev alır.</w:t>
+                <w:lang w:val="tr-TR"/>
+              </w:rPr>
+              <w:t xml:space="preserve">Su ısıtıcısındaki kireç tabakası seyreltilmemiş sirkeyle, suyla seyreltilmiş sirkeye göre daha kısa sürede temizlenir.</w:t>
             </w:r>
           </w:p>
         </w:tc>
@@ -1314,8 +1269,6 @@
             <w:r>
               <w:rPr>
                 <w:rFonts w:ascii="Times New Roman" w:hAnsi="Times New Roman" w:cs="Times New Roman"/>
-                <w:sz w:val="20"/>
-                <w:szCs w:val="20"/>
                 <w:lang w:val="tr-TR"/>
               </w:rPr>
               <w:t>Katı tepkenin temas yüzeyi</w:t>
@@ -1337,11 +1290,16 @@
             <w:r>
               <w:rPr>
                 <w:rFonts w:ascii="Times New Roman" w:hAnsi="Times New Roman" w:cs="Times New Roman"/>
-                <w:sz w:val="20"/>
-                <w:szCs w:val="20"/>
-                <w:lang w:val="tr-TR"/>
-              </w:rPr>
-              <w:t>İnce yongalar, aynı kütledeki odun kütüğünden çok daha hızlı yanar.</w:t>
+                <w:lang w:val="tr-TR"/>
+              </w:rPr>
+              <w:t>Talaş</w:t>
+            </w:r>
+            <w:r>
+              <w:rPr>
+                <w:rFonts w:ascii="Times New Roman" w:hAnsi="Times New Roman" w:cs="Times New Roman"/>
+                <w:lang w:val="tr-TR"/>
+              </w:rPr>
+              <w:t>, aynı kütledeki odun kütüğünden çok daha hızlı yanar.</w:t>
             </w:r>
           </w:p>
         </w:tc>
@@ -1394,10 +1352,9 @@
             <w:r>
               <w:rPr>
                 <w:rFonts w:ascii="Times New Roman" w:hAnsi="Times New Roman" w:cs="Times New Roman"/>
-                <w:sz w:val="20"/>
-                <w:szCs w:val="20"/>
-                <w:lang w:val="tr-TR"/>
-              </w:rPr>
+                <w:lang w:val="tr-TR"/>
+              </w:rPr>
+              <w:lastRenderedPageBreak/>
               <w:t>Katalizör</w:t>
             </w:r>
           </w:p>
@@ -1417,8 +1374,6 @@
             <w:r>
               <w:rPr>
                 <w:rFonts w:ascii="Times New Roman" w:hAnsi="Times New Roman" w:cs="Times New Roman"/>
-                <w:sz w:val="20"/>
-                <w:szCs w:val="20"/>
                 <w:lang w:val="tr-TR"/>
               </w:rPr>
               <w:t>Hidrojen peroksit (oksijenli su) yaraya döküldüğünde köpürür.</w:t>
@@ -1495,15 +1450,7 @@
           <w:rFonts w:ascii="Times New Roman" w:hAnsi="Times New Roman" w:cs="Times New Roman"/>
           <w:lang w:val="tr-TR"/>
         </w:rPr>
-        <w:t xml:space="preserve">Sınıfınızda gruplara ayrılınız. Grup arkadaşlarınızla iş birliği içinde her bir faktörün tepkime hızı ile ilişkisini araştıracağınız deneyler için bağımlı, bağımsız ve kontrol değişkenlerini belirleyerek aşağıdaki tabloya yazınız. Grup çalışmasında görev paylaşımı yapınız, arkadaşlarınızın fikirlerine </w:t>
-      </w:r>
-      <w:r>
-        <w:rPr>
-          <w:rFonts w:ascii="Times New Roman" w:hAnsi="Times New Roman" w:cs="Times New Roman"/>
-          <w:lang w:val="tr-TR"/>
-        </w:rPr>
-        <w:lastRenderedPageBreak/>
-        <w:t>saygı gösteriniz ve dostluk ilişkilerinizi güçlendirecek şekilde davranınız. Ortak hedefinize ulaşmak için zorlandığınız noktalarda birbirinize destek olunuz, gerektiğinde arkadaşlarınızdan yardım isteyiniz.</w:t>
+        <w:t>Sınıfınızda gruplara ayrılınız. Grup arkadaşlarınızla iş birliği içinde her bir faktörün tepkime hızı ile ilişkisini araştıracağınız deneyler için bağımlı, bağımsız ve kontrol değişkenlerini belirleyerek aşağıdaki tabloya yazınız. Grup çalışmasında görev paylaşımı yapınız, arkadaşlarınızın fikirlerine saygı gösteriniz ve dostluk ilişkilerinizi güçlendirecek şekilde davranınız. Ortak hedefinize ulaşmak için zorlandığınız noktalarda birbirinize destek olunuz, gerektiğinde arkadaşlarınızdan yardım isteyiniz.</w:t>
       </w:r>
     </w:p>
     <w:tbl>
@@ -2161,6 +2108,7 @@
                 <w:bCs/>
                 <w:lang w:val="tr-TR"/>
               </w:rPr>
+              <w:lastRenderedPageBreak/>
               <w:t>Deney önerileri</w:t>
             </w:r>
           </w:p>
@@ -2241,7 +2189,6 @@
                 <w:rFonts w:ascii="Times New Roman" w:hAnsi="Times New Roman" w:cs="Times New Roman"/>
                 <w:lang w:val="tr-TR"/>
               </w:rPr>
-              <w:lastRenderedPageBreak/>
               <w:t xml:space="preserve">• </w:t>
             </w:r>
             <w:r>
@@ -2588,6 +2535,7 @@
           <w:rFonts w:ascii="Times New Roman" w:hAnsi="Times New Roman" w:cs="Times New Roman"/>
           <w:lang w:val="tr-TR"/>
         </w:rPr>
+        <w:lastRenderedPageBreak/>
         <w:t>……………………………………………………………………………………………………</w:t>
       </w:r>
     </w:p>
@@ -2894,7 +2842,6 @@
                 <w:rFonts w:ascii="Times New Roman" w:hAnsi="Times New Roman" w:cs="Times New Roman"/>
                 <w:lang w:val="tr-TR"/>
               </w:rPr>
-              <w:lastRenderedPageBreak/>
               <w:t>3</w:t>
             </w:r>
           </w:p>
@@ -3593,6 +3540,7 @@
           <w:rFonts w:ascii="Times New Roman" w:hAnsi="Times New Roman" w:cs="Times New Roman"/>
           <w:lang w:val="tr-TR"/>
         </w:rPr>
+        <w:lastRenderedPageBreak/>
         <w:t>Verileriniz hipotezlerinizden birini desteklemiyorsa bunun olası nedenlerini (kontrol değişkenlerinin sabit tutulup tutulmadığı, ölçüm süresi, malzeme miktarı vb.) grup arkadaşlarınızla tartışınız. Gerekirse deney planınızı yeniden düzenleyerek deneyi tekrarlayınız.</w:t>
       </w:r>
     </w:p>
@@ -3644,7 +3592,6 @@
           <w:rFonts w:ascii="Times New Roman" w:hAnsi="Times New Roman" w:cs="Times New Roman"/>
           <w:lang w:val="tr-TR"/>
         </w:rPr>
-        <w:lastRenderedPageBreak/>
         <w:t>……………………………………………………………………………………………</w:t>
       </w:r>
     </w:p>
@@ -3903,6 +3850,7 @@
           <w:rFonts w:ascii="Times New Roman" w:hAnsi="Times New Roman" w:cs="Times New Roman"/>
           <w:lang w:val="tr-TR"/>
         </w:rPr>
+        <w:lastRenderedPageBreak/>
         <w:t>……………………………………………………………………………………………</w:t>
       </w:r>
     </w:p>
@@ -3968,7 +3916,6 @@
           <w:noProof/>
           <w:lang w:val="tr-TR"/>
         </w:rPr>
-        <w:lastRenderedPageBreak/>
         <mc:AlternateContent>
           <mc:Choice Requires="wps">
             <w:drawing>
@@ -4391,7 +4338,15 @@
           <w:rFonts w:ascii="Times New Roman" w:hAnsi="Times New Roman" w:cs="Times New Roman"/>
           <w:lang w:val="tr-TR"/>
         </w:rPr>
-        <w:t>(suda) → AgCl(k) gibi) bağ kırılması gerektirmediği için oda sıcaklığında çok hızlıdır. Metanın yanması gibi kovalent bağların kırılmasını gerektiren tepkimeler ise genellikle daha yavaştır.</w:t>
+        <w:t xml:space="preserve">(suda) → AgCl(k) gibi) </w:t>
+      </w:r>
+      <w:r>
+        <w:rPr>
+          <w:rFonts w:ascii="Times New Roman" w:hAnsi="Times New Roman" w:cs="Times New Roman"/>
+          <w:lang w:val="tr-TR"/>
+        </w:rPr>
+        <w:lastRenderedPageBreak/>
+        <w:t>bağ kırılması gerektirmediği için oda sıcaklığında çok hızlıdır. Metanın yanması gibi kovalent bağların kırılmasını gerektiren tepkimeler ise genellikle daha yavaştır.</w:t>
       </w:r>
     </w:p>
     <w:tbl>
@@ -4463,7 +4418,6 @@
                 <w:rFonts w:ascii="Times New Roman" w:hAnsi="Times New Roman" w:cs="Times New Roman"/>
                 <w:lang w:val="tr-TR"/>
               </w:rPr>
-              <w:lastRenderedPageBreak/>
               <w:t>Shutterstock arama: “silver chloride precipitate” / “white precipitate test tube”</w:t>
             </w:r>
           </w:p>
@@ -4635,7 +4589,15 @@
           <w:rFonts w:ascii="Times New Roman" w:hAnsi="Times New Roman" w:cs="Times New Roman"/>
           <w:lang w:val="tr-TR"/>
         </w:rPr>
-        <w:t>Eşit kütlede mermer parçaları biri 0,5 M, diğeri 2 M hidroklorik asit çözeltisi içeren iki behere bırakıldığında derişik asitteki gaz çıkışının çok daha hızlı olduğu görülür. Peki derişimin artması tanecikler düzeyinde neyi değiştirir? Tepken derişimi arttıkça birim hacimdeki tanecik sayısı artar. Birim hacimde daha fazla tanecik bulunması birim zamanda gerçekleşen çarpışma sayısını ve dolayısıyla etkin çarpışma sayısını artırır (Görsel D). Bu nedenle tepken derişimi arttıkça tepkime hızı artar. Havada ısıtıldığında yalnızca kızaran bir çelik yünü parçasının saf oksijen dolu bir kapta parlak kıvılcımlar saçarak hızla yanması da havada yaklaşık %21 olan oksijen oranının saf oksijende çok daha yüksek olmasıyla açıklanabilir. Gaz fazındaki tepkimelerde sabit sıcaklıkta kabın hacmi küçültüldüğünde gazların derişimi ve basıncı artar; bu durum da tepkime hızını artırır. Sıcaklık sabit kaldığı sürece katı ve saf sıvıların derişimi değişmediğinden bunların miktarındaki değişim tepkime hızını derişim yoluyla etkilemez.</w:t>
+        <w:t xml:space="preserve">Eşit kütlede mermer parçaları biri 0,5 M, diğeri 2 M hidroklorik asit çözeltisi içeren iki behere bırakıldığında derişik asitteki gaz çıkışının çok daha hızlı olduğu görülür. Peki derişimin artması tanecikler düzeyinde neyi değiştirir? Tepken derişimi arttıkça birim hacimdeki tanecik sayısı artar. Birim hacimde daha fazla tanecik bulunması birim zamanda gerçekleşen çarpışma sayısını ve dolayısıyla etkin çarpışma sayısını artırır (Görsel D). Bu nedenle tepken derişimi arttıkça tepkime </w:t>
+      </w:r>
+      <w:r>
+        <w:rPr>
+          <w:rFonts w:ascii="Times New Roman" w:hAnsi="Times New Roman" w:cs="Times New Roman"/>
+          <w:lang w:val="tr-TR"/>
+        </w:rPr>
+        <w:lastRenderedPageBreak/>
+        <w:t>hızı artar. Havada ısıtıldığında yalnızca kızaran bir çelik yünü parçasının saf oksijen dolu bir kapta parlak kıvılcımlar saçarak hızla yanması da havada yaklaşık %21 olan oksijen oranının saf oksijende çok daha yüksek olmasıyla açıklanabilir. Gaz fazındaki tepkimelerde sabit sıcaklıkta kabın hacmi küçültüldüğünde gazların derişimi ve basıncı artar; bu durum da tepkime hızını artırır. Sıcaklık sabit kaldığı sürece katı ve saf sıvıların derişimi değişmediğinden bunların miktarındaki değişim tepkime hızını derişim yoluyla etkilemez.</w:t>
       </w:r>
     </w:p>
     <w:p>
@@ -4650,7 +4612,6 @@
         <w:rPr>
           <w:noProof/>
         </w:rPr>
-        <w:lastRenderedPageBreak/>
         <w:drawing>
           <wp:inline distT="0" distB="0" distL="0" distR="0" wp14:anchorId="6B73C9F0" wp14:editId="5416ED67">
             <wp:extent cx="4680000" cy="2246400"/>

</xml_diff>

<commit_message>
1.7: Gorsel C Kimya10'daki cokelme fotografiyla degistirildi (1094771678); ornek kursun(II) iyodur cokelegine cevrildi
</commit_message>
<xml_diff>
--- a/Kim11-1-7-Tepkime-Hizina-Etki-Eden-Faktorler.docx
+++ b/Kim11-1-7-Tepkime-Hizina-Etki-Eden-Faktorler.docx
@@ -289,7 +289,7 @@
           <w:noProof/>
         </w:rPr>
         <w:drawing>
-          <wp:inline distT="0" distB="0" distL="0" distR="0" wp14:anchorId="04A89E27" wp14:editId="09DCE0F9">
+          <wp:inline distT="0" distB="0" distL="0" distR="0" wp14:anchorId="04A89E27" wp14:editId="550C15F7">
             <wp:extent cx="5943600" cy="4358640"/>
             <wp:effectExtent l="0" t="0" r="0" b="0"/>
             <wp:docPr id="2123729894" name="Picture 12" descr="Rusty iron nails piled up in a disorderly fashion"/>
@@ -1140,7 +1140,7 @@
                 <w:rFonts w:ascii="Times New Roman" w:hAnsi="Times New Roman" w:cs="Times New Roman"/>
                 <w:lang w:val="tr-TR"/>
               </w:rPr>
-              <w:t xml:space="preserve">Benzin buharı küçük bir kıvılcımla anında tutuşup yanar; bu nedenle akaryakıt istasyonlarında kıvılcım çıkarabilecek davranışlar yasaktır. Kaptaki sıvı benzin ise ancak yüzeyinden buharlaştığı ölçüde yanar.</w:t>
+              <w:t>Benzin buharı küçük bir kıvılcımla anında tutuşup yanar; bu nedenle akaryakıt istasyonlarında kıvılcım çıkarabilecek davranışlar yasaktır. Kaptaki sıvı benzin ise ancak yüzeyinden buharlaştığı ölçüde yanar.</w:t>
             </w:r>
           </w:p>
         </w:tc>
@@ -1216,7 +1216,15 @@
                 <w:rFonts w:ascii="Times New Roman" w:hAnsi="Times New Roman" w:cs="Times New Roman"/>
                 <w:lang w:val="tr-TR"/>
               </w:rPr>
-              <w:t xml:space="preserve">Derişik hidrobromik asit çözeltisine atılan alüminyum folyo parçası yoğun gaz kabarcıkları çıkararak kısa sürede tükenir; seyreltik hidrobromik asit çözeltisine atılan aynı boyuttaki alüminyum folyo parçası ise daha az kabarcık çıkararak çok daha uzun sürede tükenir.</w:t>
+              <w:t xml:space="preserve">Derişik hidrobromik asit çözeltisine atılan alüminyum folyo parçası yoğun gaz kabarcıkları çıkararak kısa sürede </w:t>
+            </w:r>
+            <w:r>
+              <w:rPr>
+                <w:rFonts w:ascii="Times New Roman" w:hAnsi="Times New Roman" w:cs="Times New Roman"/>
+                <w:lang w:val="tr-TR"/>
+              </w:rPr>
+              <w:lastRenderedPageBreak/>
+              <w:t>tükenir; seyreltik hidrobromik asit çözeltisine atılan aynı boyuttaki alüminyum folyo parçası ise daha az kabarcık çıkararak çok daha uzun sürede tükenir.</w:t>
             </w:r>
           </w:p>
         </w:tc>
@@ -1354,7 +1362,6 @@
                 <w:rFonts w:ascii="Times New Roman" w:hAnsi="Times New Roman" w:cs="Times New Roman"/>
                 <w:lang w:val="tr-TR"/>
               </w:rPr>
-              <w:lastRenderedPageBreak/>
               <w:t>Katalizör</w:t>
             </w:r>
           </w:p>
@@ -1376,7 +1383,7 @@
                 <w:rFonts w:ascii="Times New Roman" w:hAnsi="Times New Roman" w:cs="Times New Roman"/>
                 <w:lang w:val="tr-TR"/>
               </w:rPr>
-              <w:t xml:space="preserve">Laktozsuz süt üretiminde süte laktaz enzimi eklenir. Laktaz eklenen sütteki süt şekeri (laktoz) kısa sürede daha basit şekerlere parçalanır; laktaz eklenmeyen sütte ise aynı sürede belirgin bir parçalanma olmaz.</w:t>
+              <w:t>Laktozsuz süt üretiminde süte laktaz enzimi eklenir. Laktaz eklenen sütteki süt şekeri (laktoz) kısa sürede daha basit şekerlere parçalanır; laktaz eklenmeyen sütte ise aynı sürede belirgin bir parçalanma olmaz.</w:t>
             </w:r>
           </w:p>
         </w:tc>
@@ -1829,6 +1836,7 @@
                 <w:rFonts w:ascii="Times New Roman" w:hAnsi="Times New Roman" w:cs="Times New Roman"/>
                 <w:lang w:val="tr-TR"/>
               </w:rPr>
+              <w:lastRenderedPageBreak/>
               <w:t>Sıcaklık</w:t>
             </w:r>
           </w:p>
@@ -2066,32 +2074,32 @@
           <w:rFonts w:ascii="Times New Roman" w:hAnsi="Times New Roman" w:cs="Times New Roman"/>
           <w:lang w:val="tr-TR"/>
         </w:rPr>
-        <w:t xml:space="preserve">Her faktörün tepkime hızına etkisini araştırmak için grup arkadaşlarınızla deneyler tasarlayınız ve tasarladığınız deneyleri gerçekleştiriniz. Görev ve sorumluluklarınızı yerine getirmek için bir yol haritası çiziniz. Magnezyum, çinko ve bakır şeritler, farklı derişimlerde hidroklorik asit ve sodyum tiyosülfat çözeltileri, kabartma tozu, limon tuzu, efervesan tablet, %3’lük hidrojen peroksit çözeltisi, kuru maya, havan, deney tüpleri, beherler, ısıtıcı, termometre ve kronometre gibi malzemeler kullanabilirsiniz. Deneylerinizi gerçekleştirmek için farklı malzemeler de tercih edebilirsiniz. Deneylerinizi gerçekleştirirken uymanız gereken güvenlik uyarılarını belirleyiniz. Okulunuzda laboratuvar imkânı yoksa deneyleri sanal laboratuvar uygulamaları, simülasyonlar veya yapay zekâ destekli kimya programları (IBM RXN for Chemistry vb.) ile de gerçekleştirebilirsiniz. Kullandığınız dijital kaynakların güvenilir olmasına dikkat ediniz.</w:t>
-      </w:r>
-    </w:p>
-    <w:p>
-      <w:pPr>
-        <w:jc w:val="both"/>
-        <w:rPr>
-          <w:rFonts w:ascii="Times New Roman" w:hAnsi="Times New Roman" w:cs="Times New Roman"/>
-          <w:lang w:val="tr-TR"/>
-        </w:rPr>
-      </w:pPr>
-    </w:p>
-    <w:p>
-      <w:pPr>
-        <w:jc w:val="both"/>
-        <w:rPr>
-          <w:rFonts w:ascii="Times New Roman" w:hAnsi="Times New Roman" w:cs="Times New Roman"/>
-          <w:lang w:val="tr-TR"/>
-        </w:rPr>
-      </w:pPr>
-      <w:r>
-        <w:rPr>
-          <w:rFonts w:ascii="Times New Roman" w:hAnsi="Times New Roman" w:cs="Times New Roman"/>
-          <w:lang w:val="tr-TR"/>
-        </w:rPr>
-        <w:t xml:space="preserve">• Her faktör için tasarladığınız deneyin adını, amacını, yapılışını ve deney için gerekli malzemeleri aşağıdaki deney planına not ediniz. Deneyi gerçekleştirdikten sonra elde ettiğiniz verileri gözlem tablosuna kaydediniz.</w:t>
+        <w:t>Her faktörün tepkime hızına etkisini araştırmak için grup arkadaşlarınızla deneyler tasarlayınız ve tasarladığınız deneyleri gerçekleştiriniz. Görev ve sorumluluklarınızı yerine getirmek için bir yol haritası çiziniz. Magnezyum, çinko ve bakır şeritler, farklı derişimlerde hidroklorik asit ve sodyum tiyosülfat çözeltileri, kabartma tozu, limon tuzu, efervesan tablet, %3’lük hidrojen peroksit çözeltisi, kuru maya, havan, deney tüpleri, beherler, ısıtıcı, termometre ve kronometre gibi malzemeler kullanabilirsiniz. Deneylerinizi gerçekleştirmek için farklı malzemeler de tercih edebilirsiniz. Deneylerinizi gerçekleştirirken uymanız gereken güvenlik uyarılarını belirleyiniz. Okulunuzda laboratuvar imkânı yoksa deneyleri sanal laboratuvar uygulamaları, simülasyonlar veya yapay zekâ destekli kimya programları (IBM RXN for Chemistry vb.) ile de gerçekleştirebilirsiniz. Kullandığınız dijital kaynakların güvenilir olmasına dikkat ediniz.</w:t>
+      </w:r>
+    </w:p>
+    <w:p>
+      <w:pPr>
+        <w:jc w:val="both"/>
+        <w:rPr>
+          <w:rFonts w:ascii="Times New Roman" w:hAnsi="Times New Roman" w:cs="Times New Roman"/>
+          <w:lang w:val="tr-TR"/>
+        </w:rPr>
+      </w:pPr>
+    </w:p>
+    <w:p>
+      <w:pPr>
+        <w:jc w:val="both"/>
+        <w:rPr>
+          <w:rFonts w:ascii="Times New Roman" w:hAnsi="Times New Roman" w:cs="Times New Roman"/>
+          <w:lang w:val="tr-TR"/>
+        </w:rPr>
+      </w:pPr>
+      <w:r>
+        <w:rPr>
+          <w:rFonts w:ascii="Times New Roman" w:hAnsi="Times New Roman" w:cs="Times New Roman"/>
+          <w:lang w:val="tr-TR"/>
+        </w:rPr>
+        <w:t>• Her faktör için tasarladığınız deneyin adını, amacını, yapılışını ve deney için gerekli malzemeleri aşağıdaki deney planına not ediniz. Deneyi gerçekleştirdikten sonra elde ettiğiniz verileri gözlem tablosuna kaydediniz.</w:t>
       </w:r>
     </w:p>
     <w:p>
@@ -2135,13 +2143,6 @@
           <w:lang w:val="tr-TR"/>
         </w:rPr>
         <w:t>Deneyin Amacı: ……………………………………………………………………………</w:t>
-      </w:r>
-      <w:r>
-        <w:rPr>
-          <w:rFonts w:ascii="Times New Roman" w:hAnsi="Times New Roman" w:cs="Times New Roman"/>
-          <w:lang w:val="tr-TR"/>
-        </w:rPr>
-        <w:t xml:space="preserve"/>
       </w:r>
     </w:p>
     <w:p>
@@ -2716,13 +2717,6 @@
         </w:rPr>
         <w:t>Deneyin Amacı: ……………………………………………………………………………</w:t>
       </w:r>
-      <w:r>
-        <w:rPr>
-          <w:rFonts w:ascii="Times New Roman" w:hAnsi="Times New Roman" w:cs="Times New Roman"/>
-          <w:lang w:val="tr-TR"/>
-        </w:rPr>
-        <w:t xml:space="preserve"/>
-      </w:r>
     </w:p>
     <w:p>
       <w:pPr>
@@ -3316,6 +3310,7 @@
           <w:rFonts w:ascii="Times New Roman" w:hAnsi="Times New Roman" w:cs="Times New Roman"/>
           <w:lang w:val="tr-TR"/>
         </w:rPr>
+        <w:lastRenderedPageBreak/>
         <w:t>Deney verilerinizi analiz ederek her bir faktörün tepkime hızına etkisini yorumlayınız. Verileriniz başlangıçta kurduğunuz hipotezleri destekliyor mu? Açıklayınız.</w:t>
       </w:r>
     </w:p>
@@ -3337,7 +3332,6 @@
           <w:rFonts w:ascii="Times New Roman" w:hAnsi="Times New Roman" w:cs="Times New Roman"/>
           <w:lang w:val="tr-TR"/>
         </w:rPr>
-        <w:lastRenderedPageBreak/>
         <w:t>Verileriniz hipotezlerinizden birini desteklemiyorsa bunun olası nedenlerini (kontrol değişkenlerinin sabit tutulup tutulmadığı, ölçüm süresi, malzeme miktarı vb.) grup arkadaşlarınızla tartışınız. Gerekirse deney planınızı yeniden düzenleyerek deneyi tekrarlayınız.</w:t>
       </w:r>
     </w:p>
@@ -3630,6 +3624,7 @@
           <w:rFonts w:ascii="Times New Roman" w:hAnsi="Times New Roman" w:cs="Times New Roman"/>
           <w:lang w:val="tr-TR"/>
         </w:rPr>
+        <w:lastRenderedPageBreak/>
         <w:t>Grubunuzun bulgularını ve açıklamalarını sınıfınızla paylaşınız. Diğer grupların sonuçlarını kendi sonuçlarınızla karşılaştırarak ulaştığınız açıklamaların güvenilirliğini değerlendiriniz.</w:t>
       </w:r>
     </w:p>
@@ -3647,7 +3642,6 @@
           <w:rFonts w:ascii="Times New Roman" w:hAnsi="Times New Roman" w:cs="Times New Roman"/>
           <w:lang w:val="tr-TR"/>
         </w:rPr>
-        <w:lastRenderedPageBreak/>
         <w:t>……………………………………………………………………………………………</w:t>
       </w:r>
     </w:p>
@@ -4070,7 +4064,7 @@
           <w:rFonts w:ascii="Times New Roman" w:hAnsi="Times New Roman" w:cs="Times New Roman"/>
           <w:lang w:val="tr-TR"/>
         </w:rPr>
-        <w:t>Analiz ve Keşif Atölyesi 1.7.’de gerçekleştirdiğiniz deneylerde aynı tepkimenin bazı koşullarda hızlandığını, bazı koşullarda ise yavaşladığını gözlemlediniz. Deney verileriniz, kimyasal tepkimelerin hızının; tepkenlerin cinsine, fiziksel hâline ve derişimine, sıcaklığa, katı tepkenlerin temas yüzeyine ve katalizöre bağlı olduğunu göstermektedir. Bu faktörlerin etkisi çarpışma teorisi ile açıklanabilir. Çarpışma teorisine göre bir tepkimenin hızı, birim zamanda gerçekleşen etkin çarpışma sayısı ile doğru orantılıdır. Bu nedenle birim zamandaki toplam çarpışma sayısını ya da çarpışmalar içindeki etkin çarpışmaların oranını artıran her etken tepkime hızını artırır.</w:t>
+        <w:t>Deney veriler, kimyasal tepkimelerin hızının; tepkenlerin cinsine, fiziksel hâline ve derişimine, sıcaklığa, katı tepkenlerin temas yüzeyine ve katalizöre bağlı olduğunu göstermektedir. Bu faktörlerin etkisi çarpışma teorisi ile açıklanabilir. Çarpışma teorisine göre bir tepkimenin hızı, birim zamanda gerçekleşen etkin çarpışma sayısı ile doğru orantılıdır. Bu nedenle birim zamandaki toplam çarpışma sayısını ya da çarpışmalar içindeki etkin çarpışmaların oranını artıran her etken tepkime hızını artırır.</w:t>
       </w:r>
     </w:p>
     <w:p>
@@ -4105,7 +4099,15 @@
           <w:rFonts w:ascii="Times New Roman" w:hAnsi="Times New Roman" w:cs="Times New Roman"/>
           <w:lang w:val="tr-TR"/>
         </w:rPr>
-        <w:t>Aynı koşullarda farklı maddeler farklı hızlarda tepkimeye girer. Örneğin oda sıcaklığında gümüş nitrat çözeltisine sodyum klorür çözeltisi eklendiğinde beyaz renkli gümüş klorür çökeleği anında oluşur (Görsel C). Buna karşılık doğal gazın temel bileşeni olan metan, havadaki oksijenle aynı ortamda uzun süre tepkimeye girmeden bulunabilir; yanmanın başlaması için bir kıvılcım ya da alev gerekir. Peki tepkenlerin cinsi tepkime hızını neden bu kadar etkiler? Tepkime sırasında kırılması gereken bağların sayısı ve sağlamlığı, aktivasyon enerjisinin büyüklüğünü belirler. Genel olarak zıt yüklü iyonlar arasında gerçekleşen tepkimeler (Ag</w:t>
+        <w:t xml:space="preserve">Aynı koşullarda farklı maddeler farklı hızlarda tepkimeye girer. Örneğin oda sıcaklığında kurşun(II) nitrat çözeltisine potasyum iyodür çözeltisi eklendiğinde sarı renkli kurşun(II) iyodür çökeleği anında oluşur (Görsel C). Buna karşılık doğal gazın temel bileşeni olan metan, havadaki oksijenle aynı ortamda uzun süre tepkimeye girmeden bulunabilir; yanmanın başlaması için bir kıvılcım ya da </w:t>
+      </w:r>
+      <w:r>
+        <w:rPr>
+          <w:rFonts w:ascii="Times New Roman" w:hAnsi="Times New Roman" w:cs="Times New Roman"/>
+          <w:lang w:val="tr-TR"/>
+        </w:rPr>
+        <w:lastRenderedPageBreak/>
+        <w:t>alev gerekir. Peki tepkenlerin cinsi tepkime hızını neden bu kadar etkiler? Tepkime sırasında kırılması gereken bağların sayısı ve sağlamlığı, aktivasyon enerjisinin büyüklüğünü belirler. Genel olarak zıt yüklü iyonlar arasında gerçekleşen tepkimeler (Ag</w:t>
       </w:r>
       <w:r>
         <w:rPr>
@@ -4135,15 +4137,7 @@
           <w:rFonts w:ascii="Times New Roman" w:hAnsi="Times New Roman" w:cs="Times New Roman"/>
           <w:lang w:val="tr-TR"/>
         </w:rPr>
-        <w:t xml:space="preserve">(suda) → AgCl(k) gibi) </w:t>
-      </w:r>
-      <w:r>
-        <w:rPr>
-          <w:rFonts w:ascii="Times New Roman" w:hAnsi="Times New Roman" w:cs="Times New Roman"/>
-          <w:lang w:val="tr-TR"/>
-        </w:rPr>
-        <w:lastRenderedPageBreak/>
-        <w:t>bağ kırılması gerektirmediği için oda sıcaklığında çok hızlıdır. Metanın yanması gibi kovalent bağların kırılmasını gerektiren tepkimeler ise genellikle daha yavaştır.</w:t>
+        <w:t>(suda) → AgCl(k) gibi) bağ kırılması gerektirmediği için oda sıcaklığında çok hızlıdır. Metanın yanması gibi kovalent bağların kırılmasını gerektiren tepkimeler ise genellikle daha yavaştır.</w:t>
       </w:r>
     </w:p>
     <w:tbl>
@@ -4199,7 +4193,7 @@
                 <w:rFonts w:ascii="Times New Roman" w:hAnsi="Times New Roman" w:cs="Times New Roman"/>
                 <w:lang w:val="tr-TR"/>
               </w:rPr>
-              <w:t>Tarif: Gümüş nitrat çözeltisi bulunan bir deney tüpüne/behere sodyum klorür çözeltisi damlatıldığı anda oluşan beyaz, bulutsu gümüş klorür çökeleği.</w:t>
+              <w:t xml:space="preserve">Tarif: İki berrak çözeltinin karıştırılmasıyla anında oluşan sarı kurşun(II) iyodür çökeleği (fotoğraf; Kimya10’da kullanılan görselin aynısı).</w:t>
             </w:r>
           </w:p>
           <w:p>
@@ -4215,7 +4209,7 @@
                 <w:rFonts w:ascii="Times New Roman" w:hAnsi="Times New Roman" w:cs="Times New Roman"/>
                 <w:lang w:val="tr-TR"/>
               </w:rPr>
-              <w:t>Shutterstock arama: “silver chloride precipitate” / “white precipitate test tube”</w:t>
+              <w:t xml:space="preserve">Shutterstock arama: “yellow precipitate two clear liquids”</w:t>
             </w:r>
           </w:p>
           <w:p>
@@ -4231,7 +4225,7 @@
                 <w:rFonts w:ascii="Times New Roman" w:hAnsi="Times New Roman" w:cs="Times New Roman"/>
                 <w:lang w:val="tr-TR"/>
               </w:rPr>
-              <w:t>Shutter ID: 2074498582 (vektörel; AgNO₃ + NaCl → AgCl + NaNO₃ çökelme tepkimesi, etiketler Türkçeleştirilmeli). Alternatif: 2294975705. Uygun fotoğraf bulunamadı; mümkünse deney fotoğrafı çekilsin.</w:t>
+              <w:t xml:space="preserve">Shutter ID: 1094771678</w:t>
             </w:r>
           </w:p>
         </w:tc>
@@ -4261,14 +4255,14 @@
           <w:bCs/>
           <w:lang w:val="tr-TR"/>
         </w:rPr>
-        <w:t>Görsel C:</w:t>
-      </w:r>
-      <w:r>
-        <w:rPr>
-          <w:rFonts w:ascii="Times New Roman" w:hAnsi="Times New Roman" w:cs="Times New Roman"/>
-          <w:lang w:val="tr-TR"/>
-        </w:rPr>
-        <w:t xml:space="preserve"> Gümüş nitrat ve sodyum klorür çözeltilerinin karıştırılmasıyla anında oluşan gümüş klorür çökeleği</w:t>
+        <w:t xml:space="preserve">Görsel C: Kurşun(II) nitrat ve potasyum iyodür çözeltilerinin karıştırılmasıyla anında oluşan kurşun(II) iyodür çökeleği</w:t>
+      </w:r>
+      <w:r>
+        <w:rPr>
+          <w:rFonts w:ascii="Times New Roman" w:hAnsi="Times New Roman" w:cs="Times New Roman"/>
+          <w:lang w:val="tr-TR"/>
+        </w:rPr>
+        <w:t xml:space="preserve"/>
       </w:r>
     </w:p>
     <w:p>
@@ -4386,7 +4380,7 @@
           <w:rFonts w:ascii="Times New Roman" w:hAnsi="Times New Roman" w:cs="Times New Roman"/>
           <w:lang w:val="tr-TR"/>
         </w:rPr>
-        <w:t xml:space="preserve">Eşit kütlede mermer parçaları biri 0,5 M, diğeri 2 M hidroklorik asit çözeltisi içeren iki behere bırakıldığında derişik asitteki gaz çıkışının çok daha hızlı olduğu görülür. Peki derişimin artması tanecikler düzeyinde neyi değiştirir? Tepken derişimi arttıkça birim hacimdeki tanecik sayısı artar. Birim hacimde daha fazla tanecik bulunması birim zamanda gerçekleşen çarpışma sayısını ve dolayısıyla etkin çarpışma sayısını artırır (Görsel D). Bu nedenle tepken derişimi arttıkça tepkime </w:t>
+        <w:t xml:space="preserve">Eşit kütlede mermer parçaları biri 0,5 M, diğeri 2 M hidroklorik asit çözeltisi içeren iki behere bırakıldığında derişik asitteki gaz çıkışının çok daha hızlı olduğu görülür. Peki derişimin artması </w:t>
       </w:r>
       <w:r>
         <w:rPr>
@@ -4394,7 +4388,7 @@
           <w:lang w:val="tr-TR"/>
         </w:rPr>
         <w:lastRenderedPageBreak/>
-        <w:t>hızı artar. Havada ısıtıldığında yalnızca kızaran bir çelik yünü parçasının saf oksijen dolu bir kapta parlak kıvılcımlar saçarak hızla yanması da havada yaklaşık %21 olan oksijen oranının saf oksijende çok daha yüksek olmasıyla açıklanabilir. Gaz fazındaki tepkimelerde sabit sıcaklıkta kabın hacmi küçültüldüğünde gazların derişimi ve basıncı artar; bu durum da tepkime hızını artırır. Sıcaklık sabit kaldığı sürece katı ve saf sıvıların derişimi değişmediğinden bunların miktarındaki değişim tepkime hızını derişim yoluyla etkilemez.</w:t>
+        <w:t>tanecikler düzeyinde neyi değiştirir? Tepken derişimi arttıkça birim hacimdeki tanecik sayısı artar. Birim hacimde daha fazla tanecik bulunması birim zamanda gerçekleşen çarpışma sayısını ve dolayısıyla etkin çarpışma sayısını artırır (Görsel D). Bu nedenle tepken derişimi arttıkça tepkime hızı artar. Havada ısıtıldığında yalnızca kızaran bir çelik yünü parçasının saf oksijen dolu bir kapta parlak kıvılcımlar saçarak hızla yanması da havada yaklaşık %21 olan oksijen oranının saf oksijende çok daha yüksek olmasıyla açıklanabilir. Gaz fazındaki tepkimelerde sabit sıcaklıkta kabın hacmi küçültüldüğünde gazların derişimi ve basıncı artar; bu durum da tepkime hızını artırır. Sıcaklık sabit kaldığı sürece katı ve saf sıvıların derişimi değişmediğinden bunların miktarındaki değişim tepkime hızını derişim yoluyla etkilemez.</w:t>
       </w:r>
     </w:p>
     <w:p>
@@ -4575,7 +4569,15 @@
           <w:rFonts w:ascii="Times New Roman" w:hAnsi="Times New Roman" w:cs="Times New Roman"/>
           <w:lang w:val="tr-TR"/>
         </w:rPr>
-        <w:t>) bu alan belirgin şekilde büyüktür; bu nedenle etkin çarpışma sayısı ve tepkime hızı artar. Sıcaklık artışı hem endotermik hem de ekzotermik tepkimelerin hızını artırır. Oda sıcaklığı civarında birçok tepkimede sıcaklığın 10 °C artırılması tepkime hızını yaklaşık iki katına çıkarır. Sebze ve meyvelerin buzdolabında saklanması, düşük sıcaklıkta bozulma tepkimelerinin yavaşlamasından yararlanılan bir uygulamadır. Düdüklü tencerede suyun daha yüksek sıcaklıkta kaynaması ise yemeklerin daha kısa sürede pişmesini sağlar.</w:t>
+        <w:t xml:space="preserve">) bu alan belirgin şekilde büyüktür; bu nedenle etkin çarpışma sayısı ve tepkime hızı artar. Sıcaklık artışı hem endotermik hem de ekzotermik tepkimelerin hızını artırır. Oda sıcaklığı civarında birçok tepkimede sıcaklığın 10 °C artırılması tepkime hızını yaklaşık iki katına çıkarır. Sebze ve meyvelerin buzdolabında saklanması, düşük sıcaklıkta bozulma tepkimelerinin yavaşlamasından yararlanılan bir uygulamadır. Düdüklü </w:t>
+      </w:r>
+      <w:r>
+        <w:rPr>
+          <w:rFonts w:ascii="Times New Roman" w:hAnsi="Times New Roman" w:cs="Times New Roman"/>
+          <w:lang w:val="tr-TR"/>
+        </w:rPr>
+        <w:lastRenderedPageBreak/>
+        <w:t>tencerede suyun daha yüksek sıcaklıkta kaynaması ise yemeklerin daha kısa sürede pişmesini sağlar.</w:t>
       </w:r>
     </w:p>
     <w:p>
@@ -4590,7 +4592,6 @@
         <w:rPr>
           <w:noProof/>
         </w:rPr>
-        <w:lastRenderedPageBreak/>
         <w:drawing>
           <wp:inline distT="0" distB="0" distL="0" distR="0" wp14:anchorId="0E9E73F2" wp14:editId="6FD2B120">
             <wp:extent cx="4680000" cy="2867280"/>
@@ -4782,6 +4783,7 @@
           <w:bCs/>
           <w:lang w:val="tr-TR"/>
         </w:rPr>
+        <w:lastRenderedPageBreak/>
         <w:t>Görsel E:</w:t>
       </w:r>
       <w:r>
@@ -4808,7 +4810,6 @@
           <w:bCs/>
           <w:lang w:val="tr-TR"/>
         </w:rPr>
-        <w:lastRenderedPageBreak/>
         <w:t>Katalizör</w:t>
       </w:r>
     </w:p>

</xml_diff>

<commit_message>
1.7: Fiziksel hal bolumune kati ve cozelti tepkenlerini karsilastiran tanecik modeli (Gorsel D) eklendi; sonraki gorsel harfleri kaydirildi
</commit_message>
<xml_diff>
--- a/Kim11-1-7-Tepkime-Hizina-Etki-Eden-Faktorler.docx
+++ b/Kim11-1-7-Tepkime-Hizina-Etki-Eden-Faktorler.docx
@@ -289,7 +289,7 @@
           <w:noProof/>
         </w:rPr>
         <w:drawing>
-          <wp:inline distT="0" distB="0" distL="0" distR="0" wp14:anchorId="04A89E27" wp14:editId="550C15F7">
+          <wp:inline distT="0" distB="0" distL="0" distR="0" wp14:anchorId="04A89E27" wp14:editId="26B71731">
             <wp:extent cx="5943600" cy="4358640"/>
             <wp:effectExtent l="0" t="0" r="0" b="0"/>
             <wp:docPr id="2123729894" name="Picture 12" descr="Rusty iron nails piled up in a disorderly fashion"/>
@@ -4099,7 +4099,7 @@
           <w:rFonts w:ascii="Times New Roman" w:hAnsi="Times New Roman" w:cs="Times New Roman"/>
           <w:lang w:val="tr-TR"/>
         </w:rPr>
-        <w:t xml:space="preserve">Aynı koşullarda farklı maddeler farklı hızlarda tepkimeye girer. Örneğin oda sıcaklığında kurşun(II) nitrat çözeltisine potasyum iyodür çözeltisi eklendiğinde sarı renkli kurşun(II) iyodür çökeleği anında oluşur (Görsel C). Buna karşılık doğal gazın temel bileşeni olan metan, havadaki oksijenle aynı ortamda uzun süre tepkimeye girmeden bulunabilir; yanmanın başlaması için bir kıvılcım ya da </w:t>
+        <w:t xml:space="preserve">Aynı koşullarda farklı maddeler farklı hızlarda tepkimeye girer. Örneğin oda sıcaklığında kurşun(II) nitrat çözeltisine potasyum iyodür çözeltisi eklendiğinde sarı renkli kurşun(II) iyodür çökeleği anında oluşur (Görsel C). Buna karşılık doğal gazın temel bileşeni olan metan, havadaki oksijenle aynı ortamda uzun süre tepkimeye girmeden bulunabilir; yanmanın başlaması için bir </w:t>
       </w:r>
       <w:r>
         <w:rPr>
@@ -4107,7 +4107,7 @@
           <w:lang w:val="tr-TR"/>
         </w:rPr>
         <w:lastRenderedPageBreak/>
-        <w:t>alev gerekir. Peki tepkenlerin cinsi tepkime hızını neden bu kadar etkiler? Tepkime sırasında kırılması gereken bağların sayısı ve sağlamlığı, aktivasyon enerjisinin büyüklüğünü belirler. Genel olarak zıt yüklü iyonlar arasında gerçekleşen tepkimeler (Ag</w:t>
+        <w:t>kıvılcım ya da alev gerekir. Peki tepkenlerin cinsi tepkime hızını neden bu kadar etkiler? Tepkime sırasında kırılması gereken bağların sayısı ve sağlamlığı, aktivasyon enerjisinin büyüklüğünü belirler. Genel olarak zıt yüklü iyonlar arasında gerçekleşen tepkimeler (Ag</w:t>
       </w:r>
       <w:r>
         <w:rPr>
@@ -4140,218 +4140,135 @@
         <w:t>(suda) → AgCl(k) gibi) bağ kırılması gerektirmediği için oda sıcaklığında çok hızlıdır. Metanın yanması gibi kovalent bağların kırılmasını gerektiren tepkimeler ise genellikle daha yavaştır.</w:t>
       </w:r>
     </w:p>
-    <w:tbl>
-      <w:tblPr>
-        <w:tblW w:w="9000" w:type="dxa"/>
-        <w:jc w:val="center"/>
-        <w:tblBorders>
-          <w:top w:val="single" w:sz="8" w:space="0" w:color="7F7F7F"/>
-          <w:left w:val="single" w:sz="8" w:space="0" w:color="7F7F7F"/>
-          <w:bottom w:val="single" w:sz="8" w:space="0" w:color="7F7F7F"/>
-          <w:right w:val="single" w:sz="8" w:space="0" w:color="7F7F7F"/>
-        </w:tblBorders>
-        <w:tblLook w:val="04A0" w:firstRow="1" w:lastRow="0" w:firstColumn="1" w:lastColumn="0" w:noHBand="0" w:noVBand="1"/>
-      </w:tblPr>
-      <w:tblGrid>
-        <w:gridCol w:w="9000"/>
-      </w:tblGrid>
-      <w:tr>
-        <w:trPr>
-          <w:jc w:val="center"/>
-        </w:trPr>
-        <w:tc>
-          <w:tcPr>
-            <w:tcW w:w="9000" w:type="dxa"/>
-            <w:shd w:val="clear" w:color="auto" w:fill="EDEDED"/>
-          </w:tcPr>
-          <w:p>
-            <w:pPr>
-              <w:jc w:val="both"/>
-              <w:rPr>
-                <w:rFonts w:ascii="Times New Roman" w:hAnsi="Times New Roman" w:cs="Times New Roman"/>
-                <w:lang w:val="tr-TR"/>
-              </w:rPr>
-            </w:pPr>
-            <w:r>
-              <w:rPr>
-                <w:rFonts w:ascii="Times New Roman" w:hAnsi="Times New Roman" w:cs="Times New Roman"/>
-                <w:lang w:val="tr-TR"/>
-              </w:rPr>
-              <w:t>GÖRSEL ALANI</w:t>
-            </w:r>
-          </w:p>
-          <w:p>
-            <w:pPr>
-              <w:jc w:val="both"/>
-              <w:rPr>
-                <w:rFonts w:ascii="Times New Roman" w:hAnsi="Times New Roman" w:cs="Times New Roman"/>
-                <w:lang w:val="tr-TR"/>
-              </w:rPr>
-            </w:pPr>
-            <w:r>
-              <w:rPr>
-                <w:rFonts w:ascii="Times New Roman" w:hAnsi="Times New Roman" w:cs="Times New Roman"/>
-                <w:lang w:val="tr-TR"/>
-              </w:rPr>
-              <w:t xml:space="preserve">Tarif: İki berrak çözeltinin karıştırılmasıyla anında oluşan sarı kurşun(II) iyodür çökeleği (fotoğraf; Kimya10’da kullanılan görselin aynısı).</w:t>
-            </w:r>
-          </w:p>
-          <w:p>
-            <w:pPr>
-              <w:jc w:val="both"/>
-              <w:rPr>
-                <w:rFonts w:ascii="Times New Roman" w:hAnsi="Times New Roman" w:cs="Times New Roman"/>
-                <w:lang w:val="tr-TR"/>
-              </w:rPr>
-            </w:pPr>
-            <w:r>
-              <w:rPr>
-                <w:rFonts w:ascii="Times New Roman" w:hAnsi="Times New Roman" w:cs="Times New Roman"/>
-                <w:lang w:val="tr-TR"/>
-              </w:rPr>
-              <w:t xml:space="preserve">Shutterstock arama: “yellow precipitate two clear liquids”</w:t>
-            </w:r>
-          </w:p>
-          <w:p>
-            <w:pPr>
-              <w:jc w:val="both"/>
-              <w:rPr>
-                <w:rFonts w:ascii="Times New Roman" w:hAnsi="Times New Roman" w:cs="Times New Roman"/>
-                <w:lang w:val="tr-TR"/>
-              </w:rPr>
-            </w:pPr>
-            <w:r>
-              <w:rPr>
-                <w:rFonts w:ascii="Times New Roman" w:hAnsi="Times New Roman" w:cs="Times New Roman"/>
-                <w:lang w:val="tr-TR"/>
-              </w:rPr>
-              <w:t xml:space="preserve">Shutter ID: 1094771678</w:t>
-            </w:r>
-          </w:p>
-        </w:tc>
-      </w:tr>
-    </w:tbl>
-    <w:p>
-      <w:pPr>
-        <w:jc w:val="both"/>
-        <w:rPr>
-          <w:rFonts w:ascii="Times New Roman" w:hAnsi="Times New Roman" w:cs="Times New Roman"/>
-          <w:lang w:val="tr-TR"/>
-        </w:rPr>
-      </w:pPr>
-    </w:p>
-    <w:p>
-      <w:pPr>
-        <w:jc w:val="center"/>
-        <w:rPr>
-          <w:rFonts w:ascii="Times New Roman" w:hAnsi="Times New Roman" w:cs="Times New Roman"/>
-          <w:lang w:val="tr-TR"/>
-        </w:rPr>
-      </w:pPr>
-      <w:r>
+    <w:p>
+      <w:pPr>
+        <w:jc w:val="both"/>
+        <w:rPr>
+          <w:rFonts w:ascii="Times New Roman" w:hAnsi="Times New Roman" w:cs="Times New Roman"/>
+          <w:lang w:val="tr-TR"/>
+        </w:rPr>
+      </w:pPr>
+    </w:p>
+    <w:p>
+      <w:pPr>
+        <w:jc w:val="both"/>
+        <w:rPr>
+          <w:rFonts w:ascii="Times New Roman" w:hAnsi="Times New Roman" w:cs="Times New Roman"/>
+          <w:lang w:val="tr-TR"/>
+        </w:rPr>
+      </w:pPr>
+      <w:r>
+        <w:fldChar w:fldCharType="begin"/>
+      </w:r>
+      <w:r>
+        <w:instrText xml:space="preserve"> INCLUDEPICTURE "https://www.shutterstock.com/shutterstock/photos/1094771678/display_1500/stock-photo-chemical-reaction-two-clear-liquids-are-mixed-to-produce-a-yellow-precipitate-1094771678.jpg" \* MERGEFORMATINET </w:instrText>
+      </w:r>
+      <w:r>
+        <w:fldChar w:fldCharType="separate"/>
+      </w:r>
+      <w:r>
+        <w:rPr>
+          <w:noProof/>
+        </w:rPr>
+        <w:drawing>
+          <wp:inline distT="0" distB="0" distL="0" distR="0" wp14:anchorId="38FCBFA0" wp14:editId="74C0E250">
+            <wp:extent cx="5080673" cy="3707914"/>
+            <wp:effectExtent l="0" t="0" r="0" b="635"/>
+            <wp:docPr id="75804744" name="Picture 11" descr="Chemical reaction. Two clear liquids are mixed to produce a yellow precipitate."/>
+            <wp:cNvGraphicFramePr>
+              <a:graphicFrameLocks xmlns:a="http://schemas.openxmlformats.org/drawingml/2006/main" noChangeAspect="1"/>
+            </wp:cNvGraphicFramePr>
+            <a:graphic xmlns:a="http://schemas.openxmlformats.org/drawingml/2006/main">
+              <a:graphicData uri="http://schemas.openxmlformats.org/drawingml/2006/picture">
+                <pic:pic xmlns:pic="http://schemas.openxmlformats.org/drawingml/2006/picture">
+                  <pic:nvPicPr>
+                    <pic:cNvPr id="0" name="Picture 1" descr="Chemical reaction. Two clear liquids are mixed to produce a yellow precipitate."/>
+                    <pic:cNvPicPr>
+                      <a:picLocks noChangeAspect="1" noChangeArrowheads="1"/>
+                    </pic:cNvPicPr>
+                  </pic:nvPicPr>
+                  <pic:blipFill>
+                    <a:blip r:embed="rId9" cstate="print">
+                      <a:extLst>
+                        <a:ext uri="{28A0092B-C50C-407E-A947-70E740481C1C}">
+                          <a14:useLocalDpi xmlns:a14="http://schemas.microsoft.com/office/drawing/2010/main" val="0"/>
+                        </a:ext>
+                      </a:extLst>
+                    </a:blip>
+                    <a:srcRect/>
+                    <a:stretch>
+                      <a:fillRect/>
+                    </a:stretch>
+                  </pic:blipFill>
+                  <pic:spPr bwMode="auto">
+                    <a:xfrm>
+                      <a:off x="0" y="0"/>
+                      <a:ext cx="5082924" cy="3709557"/>
+                    </a:xfrm>
+                    <a:prstGeom prst="rect">
+                      <a:avLst/>
+                    </a:prstGeom>
+                    <a:noFill/>
+                    <a:ln>
+                      <a:noFill/>
+                    </a:ln>
+                  </pic:spPr>
+                </pic:pic>
+              </a:graphicData>
+            </a:graphic>
+          </wp:inline>
+        </w:drawing>
+      </w:r>
+      <w:r>
+        <w:fldChar w:fldCharType="end"/>
+      </w:r>
+    </w:p>
+    <w:p>
+      <w:pPr>
+        <w:jc w:val="both"/>
         <w:rPr>
           <w:rFonts w:ascii="Times New Roman" w:hAnsi="Times New Roman" w:cs="Times New Roman"/>
           <w:b/>
           <w:bCs/>
           <w:lang w:val="tr-TR"/>
         </w:rPr>
-        <w:t xml:space="preserve">Görsel C: Kurşun(II) nitrat ve potasyum iyodür çözeltilerinin karıştırılmasıyla anında oluşan kurşun(II) iyodür çökeleği</w:t>
-      </w:r>
-      <w:r>
-        <w:rPr>
-          <w:rFonts w:ascii="Times New Roman" w:hAnsi="Times New Roman" w:cs="Times New Roman"/>
-          <w:lang w:val="tr-TR"/>
-        </w:rPr>
-        <w:t xml:space="preserve"/>
-      </w:r>
-    </w:p>
-    <w:p>
-      <w:pPr>
-        <w:jc w:val="both"/>
-        <w:rPr>
-          <w:rFonts w:ascii="Times New Roman" w:hAnsi="Times New Roman" w:cs="Times New Roman"/>
-          <w:lang w:val="tr-TR"/>
-        </w:rPr>
-      </w:pPr>
-      <w:r>
-        <w:rPr>
-          <w:rFonts w:ascii="Times New Roman" w:hAnsi="Times New Roman" w:cs="Times New Roman"/>
-          <w:lang w:val="tr-TR"/>
-        </w:rPr>
-        <w:t>Tepkime hızı, bir basamakta aynı anda çarpışması gereken tanecik sayısına da bağlıdır. İki taneciğin uygun doğrultuda çarpışma olasılığı yüksekken üç taneciğin aynı anda ve uygun doğrultuda çarpışma olasılığı çok düşüktür. Bu nedenle aynı koşullarda, tek basamakta gerçekleşen ve iki taneciğin çarpışmasını gerektiren tepkimeler, üç taneciğin aynı anda çarpışmasını gerektiren tepkimelere göre genellikle daha hızlıdır. Dört ya da daha fazla taneciğin aynı anda çarpışması neredeyse imkânsız olduğundan bu tür tepkimeler birden fazla basamakta gerçekleşir.</w:t>
-      </w:r>
-    </w:p>
-    <w:p>
-      <w:pPr>
-        <w:keepNext/>
-        <w:jc w:val="both"/>
-        <w:rPr>
-          <w:rFonts w:ascii="Times New Roman" w:hAnsi="Times New Roman" w:cs="Times New Roman"/>
-          <w:lang w:val="tr-TR"/>
-        </w:rPr>
-      </w:pPr>
+      </w:pPr>
+      <w:proofErr w:type="spellStart"/>
       <w:r>
         <w:rPr>
           <w:rFonts w:ascii="Times New Roman" w:hAnsi="Times New Roman" w:cs="Times New Roman"/>
           <w:b/>
           <w:bCs/>
-          <w:lang w:val="tr-TR"/>
-        </w:rPr>
-        <w:t>Fiziksel Hâl</w:t>
-      </w:r>
-    </w:p>
-    <w:p>
-      <w:pPr>
-        <w:jc w:val="both"/>
-        <w:rPr>
-          <w:rFonts w:ascii="Times New Roman" w:hAnsi="Times New Roman" w:cs="Times New Roman"/>
-          <w:lang w:val="tr-TR"/>
-        </w:rPr>
-      </w:pPr>
-      <w:r>
-        <w:rPr>
-          <w:rFonts w:ascii="Times New Roman" w:hAnsi="Times New Roman" w:cs="Times New Roman"/>
-          <w:lang w:val="tr-TR"/>
-        </w:rPr>
-        <w:t xml:space="preserve">Tepkimenin gerçekleşebilmesi için tepken taneciklerinin birbirleriyle çarpışması gerekir. Katı hâldeki tanecikler yalnızca yerlerinde titreşim hareketi yapabildiği için iki katı tepken ancak temas yüzeylerinde tepkimeye girebilir. Bu nedenle katılar arasındaki tepkimeler genellikle çok yavaştır. Sıvı ve çözelti hâlindeki tanecikler ile gaz tanecikleri ise ortamda serbestçe hareket ederek daha sık çarpışır. Örneğin katı kurşun(II) nitrat ile katı potasyum iyodür bir kapta karıştırıldığında sarı renkli kurşun(II) iyodür yalnızca tanecikleri birbirine değen yüzeylerde ve yavaş oluşur. Aynı maddelerin sulu çözeltileri karıştırıldığında ise sarı çökelek anında oluşur. Genel olarak aynı tepkime için tepkime hızı gaz &gt; sıvı (çözelti) &gt; katı şeklinde sıralanır. Tepkenlerin tamamı aynı fiziksel hâlde bulunan tepkimelere </w:t>
-      </w:r>
+          <w:highlight w:val="yellow"/>
+          <w:lang w:val="tr-TR"/>
+        </w:rPr>
+        <w:t>Shutter</w:t>
+      </w:r>
+      <w:proofErr w:type="spellEnd"/>
       <w:r>
         <w:rPr>
           <w:rFonts w:ascii="Times New Roman" w:hAnsi="Times New Roman" w:cs="Times New Roman"/>
           <w:b/>
           <w:bCs/>
-          <w:lang w:val="tr-TR"/>
-        </w:rPr>
-        <w:t>homojen tepkimeler</w:t>
-      </w:r>
-      <w:r>
-        <w:rPr>
-          <w:rFonts w:ascii="Times New Roman" w:hAnsi="Times New Roman" w:cs="Times New Roman"/>
-          <w:lang w:val="tr-TR"/>
-        </w:rPr>
-        <w:t xml:space="preserve">, farklı fiziksel hâllerde bulunan tepkimelere ise </w:t>
+          <w:highlight w:val="yellow"/>
+          <w:lang w:val="tr-TR"/>
+        </w:rPr>
+        <w:t xml:space="preserve"> ID: 1094771678</w:t>
       </w:r>
       <w:r>
         <w:rPr>
           <w:rFonts w:ascii="Times New Roman" w:hAnsi="Times New Roman" w:cs="Times New Roman"/>
           <w:b/>
           <w:bCs/>
-          <w:lang w:val="tr-TR"/>
-        </w:rPr>
-        <w:t>heterojen tepkimeler</w:t>
-      </w:r>
-      <w:r>
-        <w:rPr>
-          <w:rFonts w:ascii="Times New Roman" w:hAnsi="Times New Roman" w:cs="Times New Roman"/>
-          <w:lang w:val="tr-TR"/>
-        </w:rPr>
-        <w:t xml:space="preserve"> denir.</w:t>
-      </w:r>
-    </w:p>
-    <w:p>
-      <w:pPr>
-        <w:keepNext/>
-        <w:jc w:val="both"/>
+          <w:highlight w:val="yellow"/>
+          <w:lang w:val="tr-TR"/>
+        </w:rPr>
+        <w:t xml:space="preserve"> (NOT: Kimya10 kitabında bu görseli kullanmıştık)</w:t>
+      </w:r>
+    </w:p>
+    <w:p>
+      <w:pPr>
+        <w:jc w:val="center"/>
         <w:rPr>
           <w:rFonts w:ascii="Times New Roman" w:hAnsi="Times New Roman" w:cs="Times New Roman"/>
           <w:lang w:val="tr-TR"/>
@@ -4364,6 +4281,257 @@
           <w:bCs/>
           <w:lang w:val="tr-TR"/>
         </w:rPr>
+        <w:t xml:space="preserve">Görsel C: </w:t>
+      </w:r>
+      <w:proofErr w:type="gramStart"/>
+      <w:r>
+        <w:rPr>
+          <w:rFonts w:ascii="Times New Roman" w:hAnsi="Times New Roman" w:cs="Times New Roman"/>
+          <w:b/>
+          <w:bCs/>
+          <w:lang w:val="tr-TR"/>
+        </w:rPr>
+        <w:t>Kurşun(</w:t>
+      </w:r>
+      <w:proofErr w:type="gramEnd"/>
+      <w:r>
+        <w:rPr>
+          <w:rFonts w:ascii="Times New Roman" w:hAnsi="Times New Roman" w:cs="Times New Roman"/>
+          <w:b/>
+          <w:bCs/>
+          <w:lang w:val="tr-TR"/>
+        </w:rPr>
+        <w:t xml:space="preserve">II) nitrat ve potasyum iyodür çözeltilerinin karıştırılmasıyla anında oluşan </w:t>
+      </w:r>
+      <w:proofErr w:type="gramStart"/>
+      <w:r>
+        <w:rPr>
+          <w:rFonts w:ascii="Times New Roman" w:hAnsi="Times New Roman" w:cs="Times New Roman"/>
+          <w:b/>
+          <w:bCs/>
+          <w:lang w:val="tr-TR"/>
+        </w:rPr>
+        <w:t>kurşun(</w:t>
+      </w:r>
+      <w:proofErr w:type="gramEnd"/>
+      <w:r>
+        <w:rPr>
+          <w:rFonts w:ascii="Times New Roman" w:hAnsi="Times New Roman" w:cs="Times New Roman"/>
+          <w:b/>
+          <w:bCs/>
+          <w:lang w:val="tr-TR"/>
+        </w:rPr>
+        <w:t>II) iyodür çökeleği</w:t>
+      </w:r>
+    </w:p>
+    <w:p>
+      <w:pPr>
+        <w:jc w:val="both"/>
+        <w:rPr>
+          <w:rFonts w:ascii="Times New Roman" w:hAnsi="Times New Roman" w:cs="Times New Roman"/>
+          <w:lang w:val="tr-TR"/>
+        </w:rPr>
+      </w:pPr>
+      <w:r>
+        <w:rPr>
+          <w:rFonts w:ascii="Times New Roman" w:hAnsi="Times New Roman" w:cs="Times New Roman"/>
+          <w:lang w:val="tr-TR"/>
+        </w:rPr>
+        <w:t>Tepkime hızı, bir basamakta aynı anda çarpışması gereken tanecik sayısına da bağlıdır. İki taneciğin uygun doğrultuda çarpışma olasılığı yüksekken üç taneciğin aynı anda ve uygun doğrultuda çarpışma olasılığı çok düşüktür. Bu nedenle aynı koşullarda, tek basamakta gerçekleşen ve iki taneciğin çarpışmasını gerektiren tepkimeler, üç taneciğin aynı anda çarpışmasını gerektiren tepkimelere göre genellikle daha hızlıdır. Dört ya da daha fazla taneciğin aynı anda çarpışması neredeyse imkânsız olduğundan bu tür tepkimeler birden fazla basamakta gerçekleşir.</w:t>
+      </w:r>
+    </w:p>
+    <w:p>
+      <w:pPr>
+        <w:keepNext/>
+        <w:jc w:val="both"/>
+        <w:rPr>
+          <w:rFonts w:ascii="Times New Roman" w:hAnsi="Times New Roman" w:cs="Times New Roman"/>
+          <w:lang w:val="tr-TR"/>
+        </w:rPr>
+      </w:pPr>
+      <w:r>
+        <w:rPr>
+          <w:rFonts w:ascii="Times New Roman" w:hAnsi="Times New Roman" w:cs="Times New Roman"/>
+          <w:b/>
+          <w:bCs/>
+          <w:lang w:val="tr-TR"/>
+        </w:rPr>
+        <w:t>Fiziksel Hâl</w:t>
+      </w:r>
+    </w:p>
+    <w:p>
+      <w:pPr>
+        <w:jc w:val="both"/>
+        <w:rPr>
+          <w:rFonts w:ascii="Times New Roman" w:hAnsi="Times New Roman" w:cs="Times New Roman"/>
+          <w:lang w:val="tr-TR"/>
+        </w:rPr>
+      </w:pPr>
+      <w:r>
+        <w:rPr>
+          <w:rFonts w:ascii="Times New Roman" w:hAnsi="Times New Roman" w:cs="Times New Roman"/>
+          <w:lang w:val="tr-TR"/>
+        </w:rPr>
+        <w:t xml:space="preserve">Tepkimenin gerçekleşebilmesi için tepken taneciklerinin birbirleriyle çarpışması gerekir. Katı hâldeki tanecikler yalnızca yerlerinde titreşim hareketi yapabildiği için iki katı tepken ancak temas </w:t>
+      </w:r>
+      <w:r>
+        <w:rPr>
+          <w:rFonts w:ascii="Times New Roman" w:hAnsi="Times New Roman" w:cs="Times New Roman"/>
+          <w:lang w:val="tr-TR"/>
+        </w:rPr>
+        <w:lastRenderedPageBreak/>
+        <w:t xml:space="preserve">yüzeylerinde tepkimeye girebilir. Bu nedenle katılar arasındaki tepkimeler genellikle çok yavaştır. Sıvı ve çözelti hâlindeki tanecikler ile gaz tanecikleri ise ortamda serbestçe hareket ederek daha sık çarpışır. Örneğin katı kurşun(II) nitrat ile katı potasyum iyodür bir kapta karıştırıldığında sarı renkli kurşun(II) iyodür yalnızca tanecikleri birbirine değen yüzeylerde ve yavaş oluşur. Aynı maddelerin sulu çözeltileri karıştırıldığında ise sarı çökelek anında oluşur (Görsel D). Genel olarak aynı tepkime için tepkime hızı gaz &gt; sıvı (çözelti) &gt; katı şeklinde sıralanır. Tepkenlerin tamamı aynı fiziksel hâlde bulunan tepkimelere </w:t>
+      </w:r>
+      <w:r>
+        <w:rPr>
+          <w:rFonts w:ascii="Times New Roman" w:hAnsi="Times New Roman" w:cs="Times New Roman"/>
+          <w:b/>
+          <w:bCs/>
+          <w:lang w:val="tr-TR"/>
+        </w:rPr>
+        <w:t>homojen tepkimeler</w:t>
+      </w:r>
+      <w:r>
+        <w:rPr>
+          <w:rFonts w:ascii="Times New Roman" w:hAnsi="Times New Roman" w:cs="Times New Roman"/>
+          <w:lang w:val="tr-TR"/>
+        </w:rPr>
+        <w:t xml:space="preserve">, farklı fiziksel hâllerde bulunan tepkimelere ise </w:t>
+      </w:r>
+      <w:r>
+        <w:rPr>
+          <w:rFonts w:ascii="Times New Roman" w:hAnsi="Times New Roman" w:cs="Times New Roman"/>
+          <w:b/>
+          <w:bCs/>
+          <w:lang w:val="tr-TR"/>
+        </w:rPr>
+        <w:t>heterojen tepkimeler</w:t>
+      </w:r>
+      <w:r>
+        <w:rPr>
+          <w:rFonts w:ascii="Times New Roman" w:hAnsi="Times New Roman" w:cs="Times New Roman"/>
+          <w:lang w:val="tr-TR"/>
+        </w:rPr>
+        <w:t xml:space="preserve"> denir.</w:t>
+      </w:r>
+    </w:p>
+    <w:p>
+      <w:pPr>
+        <w:jc w:val="center"/>
+        <w:rPr>
+          <w:rFonts w:ascii="Times New Roman" w:hAnsi="Times New Roman" w:cs="Times New Roman"/>
+          <w:lang w:val="tr-TR"/>
+        </w:rPr>
+      </w:pPr>
+      <w:r>
+        <w:rPr>
+          <w:noProof/>
+        </w:rPr>
+        <w:drawing>
+          <wp:inline distT="0" distB="0" distL="0" distR="0" wp14:anchorId="6B73C9F0" wp14:editId="5416ED67">
+            <wp:extent cx="4680000" cy="2187391"/>
+            <wp:effectExtent l="0" t="0" r="0" b="0"/>
+            <wp:docPr id="2123729895" name="Grafik 900020" descr="Fiziksel hal tanecik modeli"/>
+            <wp:cNvGraphicFramePr>
+              <a:graphicFrameLocks xmlns:a="http://schemas.openxmlformats.org/drawingml/2006/main" noChangeAspect="1"/>
+            </wp:cNvGraphicFramePr>
+            <a:graphic xmlns:a="http://schemas.openxmlformats.org/drawingml/2006/main">
+              <a:graphicData uri="http://schemas.openxmlformats.org/drawingml/2006/picture">
+                <pic:pic xmlns:pic="http://schemas.openxmlformats.org/drawingml/2006/picture">
+                  <pic:nvPicPr>
+                    <pic:cNvPr id="900005" name="k17_fiziksel_hal.png"/>
+                    <pic:cNvPicPr/>
+                  </pic:nvPicPr>
+                  <pic:blipFill>
+                    <a:blip r:embed="rId20"/>
+                    <a:stretch>
+                      <a:fillRect/>
+                    </a:stretch>
+                  </pic:blipFill>
+                  <pic:spPr>
+                    <a:xfrm>
+                      <a:off x="0" y="0"/>
+                      <a:ext cx="4680000" cy="2187391"/>
+                    </a:xfrm>
+                    <a:prstGeom prst="rect">
+                      <a:avLst/>
+                    </a:prstGeom>
+                  </pic:spPr>
+                </pic:pic>
+              </a:graphicData>
+            </a:graphic>
+          </wp:inline>
+        </w:drawing>
+      </w:r>
+    </w:p>
+    <w:p>
+      <w:pPr>
+        <w:jc w:val="center"/>
+        <w:rPr>
+          <w:rFonts w:ascii="Times New Roman" w:hAnsi="Times New Roman" w:cs="Times New Roman"/>
+          <w:lang w:val="tr-TR"/>
+        </w:rPr>
+      </w:pPr>
+      <w:r>
+        <w:rPr>
+          <w:rFonts w:ascii="Times New Roman" w:hAnsi="Times New Roman" w:cs="Times New Roman"/>
+          <w:b/>
+          <w:bCs/>
+          <w:lang w:val="tr-TR"/>
+        </w:rPr>
+        <w:t xml:space="preserve">Görsel D: Katı hâldeki ve çözeltideki tepkenlerin tanecikler düzeyinde karşılaştırılması</w:t>
+      </w:r>
+      <w:r>
+        <w:rPr>
+          <w:rFonts w:ascii="Times New Roman" w:hAnsi="Times New Roman" w:cs="Times New Roman"/>
+          <w:lang w:val="tr-TR"/>
+        </w:rPr>
+        <w:t xml:space="preserve"/>
+      </w:r>
+    </w:p>
+    <w:p>
+      <w:pPr>
+        <w:jc w:val="both"/>
+        <w:rPr>
+          <w:rFonts w:ascii="Times New Roman" w:hAnsi="Times New Roman" w:cs="Times New Roman"/>
+          <w:lang w:val="tr-TR"/>
+        </w:rPr>
+      </w:pPr>
+      <w:r>
+        <w:rPr>
+          <w:rFonts w:ascii="Times New Roman" w:hAnsi="Times New Roman" w:cs="Times New Roman"/>
+          <w:b/>
+          <w:bCs/>
+          <w:highlight w:val="yellow"/>
+          <w:lang w:val="tr-TR"/>
+        </w:rPr>
+        <w:t xml:space="preserve">NOT: Taslak model; yayınevi tarafından aynı renk ve iyon oranlarıyla (Pb²⁺ : NO₃⁻ = 1 : 2, K⁺ : I⁻ = 1 : 1) yeniden çizilebilir.</w:t>
+      </w:r>
+      <w:r>
+        <w:rPr>
+          <w:rFonts w:ascii="Times New Roman" w:hAnsi="Times New Roman" w:cs="Times New Roman"/>
+          <w:highlight w:val="yellow"/>
+          <w:lang w:val="tr-TR"/>
+        </w:rPr>
+        <w:t/>
+      </w:r>
+    </w:p>
+    <w:p>
+      <w:pPr>
+        <w:keepNext/>
+        <w:jc w:val="both"/>
+        <w:rPr>
+          <w:rFonts w:ascii="Times New Roman" w:hAnsi="Times New Roman" w:cs="Times New Roman"/>
+          <w:lang w:val="tr-TR"/>
+        </w:rPr>
+      </w:pPr>
+      <w:r>
+        <w:rPr>
+          <w:rFonts w:ascii="Times New Roman" w:hAnsi="Times New Roman" w:cs="Times New Roman"/>
+          <w:b/>
+          <w:bCs/>
+          <w:lang w:val="tr-TR"/>
+        </w:rPr>
         <w:t>Tepken Derişimi</w:t>
       </w:r>
     </w:p>
@@ -4380,15 +4548,7 @@
           <w:rFonts w:ascii="Times New Roman" w:hAnsi="Times New Roman" w:cs="Times New Roman"/>
           <w:lang w:val="tr-TR"/>
         </w:rPr>
-        <w:t xml:space="preserve">Eşit kütlede mermer parçaları biri 0,5 M, diğeri 2 M hidroklorik asit çözeltisi içeren iki behere bırakıldığında derişik asitteki gaz çıkışının çok daha hızlı olduğu görülür. Peki derişimin artması </w:t>
-      </w:r>
-      <w:r>
-        <w:rPr>
-          <w:rFonts w:ascii="Times New Roman" w:hAnsi="Times New Roman" w:cs="Times New Roman"/>
-          <w:lang w:val="tr-TR"/>
-        </w:rPr>
-        <w:lastRenderedPageBreak/>
-        <w:t>tanecikler düzeyinde neyi değiştirir? Tepken derişimi arttıkça birim hacimdeki tanecik sayısı artar. Birim hacimde daha fazla tanecik bulunması birim zamanda gerçekleşen çarpışma sayısını ve dolayısıyla etkin çarpışma sayısını artırır (Görsel D). Bu nedenle tepken derişimi arttıkça tepkime hızı artar. Havada ısıtıldığında yalnızca kızaran bir çelik yünü parçasının saf oksijen dolu bir kapta parlak kıvılcımlar saçarak hızla yanması da havada yaklaşık %21 olan oksijen oranının saf oksijende çok daha yüksek olmasıyla açıklanabilir. Gaz fazındaki tepkimelerde sabit sıcaklıkta kabın hacmi küçültüldüğünde gazların derişimi ve basıncı artar; bu durum da tepkime hızını artırır. Sıcaklık sabit kaldığı sürece katı ve saf sıvıların derişimi değişmediğinden bunların miktarındaki değişim tepkime hızını derişim yoluyla etkilemez.</w:t>
+        <w:t xml:space="preserve">Eşit kütlede mermer parçaları biri 0,5 M, diğeri 2 M hidroklorik asit çözeltisi içeren iki behere bırakıldığında derişik asitteki gaz çıkışının çok daha hızlı olduğu görülür. Peki derişimin artması tanecikler düzeyinde neyi değiştirir? Tepken derişimi arttıkça birim hacimdeki tanecik sayısı artar. Birim hacimde daha fazla tanecik bulunması birim zamanda gerçekleşen çarpışma sayısını ve dolayısıyla etkin çarpışma sayısını artırır (Görsel E). Bu nedenle tepken derişimi arttıkça tepkime hızı artar. Havada ısıtıldığında yalnızca kızaran bir çelik yünü parçasının saf oksijen dolu bir kapta parlak kıvılcımlar saçarak hızla yanması da havada yaklaşık %21 olan oksijen oranının saf oksijende çok daha yüksek olmasıyla açıklanabilir. Gaz fazındaki tepkimelerde sabit sıcaklıkta kabın hacmi küçültüldüğünde gazların derişimi ve basıncı artar; bu durum da tepkime hızını artırır. Sıcaklık sabit kaldığı sürece katı ve saf sıvıların derişimi değişmediğinden bunların miktarındaki değişim tepkime hızını derişim yoluyla etkilemez.</w:t>
       </w:r>
     </w:p>
     <w:p>
@@ -4419,7 +4579,7 @@
                     <pic:cNvPicPr/>
                   </pic:nvPicPr>
                   <pic:blipFill>
-                    <a:blip r:embed="rId9"/>
+                    <a:blip r:embed="rId10"/>
                     <a:stretch>
                       <a:fillRect/>
                     </a:stretch>
@@ -4455,7 +4615,7 @@
           <w:bCs/>
           <w:lang w:val="tr-TR"/>
         </w:rPr>
-        <w:t>Görsel D:</w:t>
+        <w:t xml:space="preserve">Görsel E:</w:t>
       </w:r>
       <w:r>
         <w:rPr>
@@ -4508,6 +4668,7 @@
           <w:bCs/>
           <w:lang w:val="tr-TR"/>
         </w:rPr>
+        <w:lastRenderedPageBreak/>
         <w:t>Sıcaklık</w:t>
       </w:r>
     </w:p>
@@ -4569,15 +4730,7 @@
           <w:rFonts w:ascii="Times New Roman" w:hAnsi="Times New Roman" w:cs="Times New Roman"/>
           <w:lang w:val="tr-TR"/>
         </w:rPr>
-        <w:t xml:space="preserve">) bu alan belirgin şekilde büyüktür; bu nedenle etkin çarpışma sayısı ve tepkime hızı artar. Sıcaklık artışı hem endotermik hem de ekzotermik tepkimelerin hızını artırır. Oda sıcaklığı civarında birçok tepkimede sıcaklığın 10 °C artırılması tepkime hızını yaklaşık iki katına çıkarır. Sebze ve meyvelerin buzdolabında saklanması, düşük sıcaklıkta bozulma tepkimelerinin yavaşlamasından yararlanılan bir uygulamadır. Düdüklü </w:t>
-      </w:r>
-      <w:r>
-        <w:rPr>
-          <w:rFonts w:ascii="Times New Roman" w:hAnsi="Times New Roman" w:cs="Times New Roman"/>
-          <w:lang w:val="tr-TR"/>
-        </w:rPr>
-        <w:lastRenderedPageBreak/>
-        <w:t>tencerede suyun daha yüksek sıcaklıkta kaynaması ise yemeklerin daha kısa sürede pişmesini sağlar.</w:t>
+        <w:t>) bu alan belirgin şekilde büyüktür; bu nedenle etkin çarpışma sayısı ve tepkime hızı artar. Sıcaklık artışı hem endotermik hem de ekzotermik tepkimelerin hızını artırır. Oda sıcaklığı civarında birçok tepkimede sıcaklığın 10 °C artırılması tepkime hızını yaklaşık iki katına çıkarır. Sebze ve meyvelerin buzdolabında saklanması, düşük sıcaklıkta bozulma tepkimelerinin yavaşlamasından yararlanılan bir uygulamadır. Düdüklü tencerede suyun daha yüksek sıcaklıkta kaynaması ise yemeklerin daha kısa sürede pişmesini sağlar.</w:t>
       </w:r>
     </w:p>
     <w:p>
@@ -4608,7 +4761,7 @@
                     <pic:cNvPicPr/>
                   </pic:nvPicPr>
                   <pic:blipFill>
-                    <a:blip r:embed="rId10"/>
+                    <a:blip r:embed="rId11"/>
                     <a:stretch>
                       <a:fillRect/>
                     </a:stretch>
@@ -4701,7 +4854,15 @@
           <w:rFonts w:ascii="Times New Roman" w:hAnsi="Times New Roman" w:cs="Times New Roman"/>
           <w:lang w:val="tr-TR"/>
         </w:rPr>
-        <w:t xml:space="preserve"> iken bu küp kenarı 1 cm olan 8 küpe bölündüğünde toplam yüzey alanı 48 cm</w:t>
+        <w:t xml:space="preserve"> iken bu küp kenarı 1 cm olan 8 küpe </w:t>
+      </w:r>
+      <w:r>
+        <w:rPr>
+          <w:rFonts w:ascii="Times New Roman" w:hAnsi="Times New Roman" w:cs="Times New Roman"/>
+          <w:lang w:val="tr-TR"/>
+        </w:rPr>
+        <w:lastRenderedPageBreak/>
+        <w:t>bölündüğünde toplam yüzey alanı 48 cm</w:t>
       </w:r>
       <w:r>
         <w:rPr>
@@ -4716,7 +4877,7 @@
           <w:rFonts w:ascii="Times New Roman" w:hAnsi="Times New Roman" w:cs="Times New Roman"/>
           <w:lang w:val="tr-TR"/>
         </w:rPr>
-        <w:t xml:space="preserve"> olur (Görsel E). Temas yüzeyi arttıkça birim zamanda gerçekleşen çarpışma sayısı artar ve tepkime hızlanır. Bir demir çivi gaz ocağının alevinde yalnızca kızarırken aynı aleve serpilen demir tozunun kıvılcımlar saçarak yanması bu duruma örnektir. Un fabrikalarında ve kömür madenlerinde havada asılı kalan ince tozların bir kıvılcımla patlayabilmesi de temas yüzeyinin çok büyük olmasından kaynaklanır.</w:t>
+        <w:t xml:space="preserve"> olur (Görsel F). Temas yüzeyi arttıkça birim zamanda gerçekleşen çarpışma sayısı artar ve tepkime hızlanır. Bir demir çivi gaz ocağının alevinde yalnızca kızarırken aynı aleve serpilen demir tozunun kıvılcımlar saçarak yanması bu duruma örnektir. Un fabrikalarında ve kömür madenlerinde havada asılı kalan ince tozların bir kıvılcımla patlayabilmesi de temas yüzeyinin çok büyük olmasından kaynaklanır.</w:t>
       </w:r>
     </w:p>
     <w:p>
@@ -4747,7 +4908,7 @@
                     <pic:cNvPicPr/>
                   </pic:nvPicPr>
                   <pic:blipFill>
-                    <a:blip r:embed="rId11"/>
+                    <a:blip r:embed="rId12"/>
                     <a:stretch>
                       <a:fillRect/>
                     </a:stretch>
@@ -4783,8 +4944,7 @@
           <w:bCs/>
           <w:lang w:val="tr-TR"/>
         </w:rPr>
-        <w:lastRenderedPageBreak/>
-        <w:t>Görsel E:</w:t>
+        <w:t xml:space="preserve">Görsel F:</w:t>
       </w:r>
       <w:r>
         <w:rPr>
@@ -4916,6 +5076,7 @@
         <w:rPr>
           <w:noProof/>
         </w:rPr>
+        <w:lastRenderedPageBreak/>
         <w:drawing>
           <wp:inline distT="0" distB="0" distL="0" distR="0" wp14:anchorId="7EB47F88" wp14:editId="6D8D8774">
             <wp:extent cx="4680000" cy="2867280"/>
@@ -4929,81 +5090,6 @@
                 <pic:pic xmlns:pic="http://schemas.openxmlformats.org/drawingml/2006/picture">
                   <pic:nvPicPr>
                     <pic:cNvPr id="900008" name="k11_900008.png"/>
-                    <pic:cNvPicPr/>
-                  </pic:nvPicPr>
-                  <pic:blipFill>
-                    <a:blip r:embed="rId12"/>
-                    <a:stretch>
-                      <a:fillRect/>
-                    </a:stretch>
-                  </pic:blipFill>
-                  <pic:spPr>
-                    <a:xfrm>
-                      <a:off x="0" y="0"/>
-                      <a:ext cx="4680000" cy="2867280"/>
-                    </a:xfrm>
-                    <a:prstGeom prst="rect">
-                      <a:avLst/>
-                    </a:prstGeom>
-                  </pic:spPr>
-                </pic:pic>
-              </a:graphicData>
-            </a:graphic>
-          </wp:inline>
-        </w:drawing>
-      </w:r>
-    </w:p>
-    <w:p>
-      <w:pPr>
-        <w:jc w:val="center"/>
-        <w:rPr>
-          <w:rFonts w:ascii="Times New Roman" w:hAnsi="Times New Roman" w:cs="Times New Roman"/>
-          <w:lang w:val="tr-TR"/>
-        </w:rPr>
-      </w:pPr>
-      <w:r>
-        <w:rPr>
-          <w:rFonts w:ascii="Times New Roman" w:hAnsi="Times New Roman" w:cs="Times New Roman"/>
-          <w:b/>
-          <w:bCs/>
-          <w:lang w:val="tr-TR"/>
-        </w:rPr>
-        <w:t>Grafik B:</w:t>
-      </w:r>
-      <w:r>
-        <w:rPr>
-          <w:rFonts w:ascii="Times New Roman" w:hAnsi="Times New Roman" w:cs="Times New Roman"/>
-          <w:lang w:val="tr-TR"/>
-        </w:rPr>
-        <w:t xml:space="preserve"> Katalizörlü ve katalizörsüz bir ekzotermik tepkimeye ait potansiyel enerji-tepkime koordinatı grafiği</w:t>
-      </w:r>
-    </w:p>
-    <w:p>
-      <w:pPr>
-        <w:jc w:val="center"/>
-        <w:rPr>
-          <w:rFonts w:ascii="Times New Roman" w:hAnsi="Times New Roman" w:cs="Times New Roman"/>
-          <w:lang w:val="tr-TR"/>
-        </w:rPr>
-      </w:pPr>
-      <w:r>
-        <w:rPr>
-          <w:noProof/>
-        </w:rPr>
-        <w:lastRenderedPageBreak/>
-        <w:drawing>
-          <wp:inline distT="0" distB="0" distL="0" distR="0" wp14:anchorId="69926181" wp14:editId="2FB36F26">
-            <wp:extent cx="4680000" cy="2867280"/>
-            <wp:effectExtent l="0" t="0" r="0" b="0"/>
-            <wp:docPr id="900009" name="Grafik 900009" descr="Katalizörün eşik enerjisine etkisi"/>
-            <wp:cNvGraphicFramePr>
-              <a:graphicFrameLocks xmlns:a="http://schemas.openxmlformats.org/drawingml/2006/main" noChangeAspect="1"/>
-            </wp:cNvGraphicFramePr>
-            <a:graphic xmlns:a="http://schemas.openxmlformats.org/drawingml/2006/main">
-              <a:graphicData uri="http://schemas.openxmlformats.org/drawingml/2006/picture">
-                <pic:pic xmlns:pic="http://schemas.openxmlformats.org/drawingml/2006/picture">
-                  <pic:nvPicPr>
-                    <pic:cNvPr id="900009" name="k11_900009.png"/>
                     <pic:cNvPicPr/>
                   </pic:nvPicPr>
                   <pic:blipFill>
@@ -5043,6 +5129,80 @@
           <w:bCs/>
           <w:lang w:val="tr-TR"/>
         </w:rPr>
+        <w:t>Grafik B:</w:t>
+      </w:r>
+      <w:r>
+        <w:rPr>
+          <w:rFonts w:ascii="Times New Roman" w:hAnsi="Times New Roman" w:cs="Times New Roman"/>
+          <w:lang w:val="tr-TR"/>
+        </w:rPr>
+        <w:t xml:space="preserve"> Katalizörlü ve katalizörsüz bir ekzotermik tepkimeye ait potansiyel enerji-tepkime koordinatı grafiği</w:t>
+      </w:r>
+    </w:p>
+    <w:p>
+      <w:pPr>
+        <w:jc w:val="center"/>
+        <w:rPr>
+          <w:rFonts w:ascii="Times New Roman" w:hAnsi="Times New Roman" w:cs="Times New Roman"/>
+          <w:lang w:val="tr-TR"/>
+        </w:rPr>
+      </w:pPr>
+      <w:r>
+        <w:rPr>
+          <w:noProof/>
+        </w:rPr>
+        <w:drawing>
+          <wp:inline distT="0" distB="0" distL="0" distR="0" wp14:anchorId="69926181" wp14:editId="2FB36F26">
+            <wp:extent cx="4680000" cy="2867280"/>
+            <wp:effectExtent l="0" t="0" r="0" b="0"/>
+            <wp:docPr id="900009" name="Grafik 900009" descr="Katalizörün eşik enerjisine etkisi"/>
+            <wp:cNvGraphicFramePr>
+              <a:graphicFrameLocks xmlns:a="http://schemas.openxmlformats.org/drawingml/2006/main" noChangeAspect="1"/>
+            </wp:cNvGraphicFramePr>
+            <a:graphic xmlns:a="http://schemas.openxmlformats.org/drawingml/2006/main">
+              <a:graphicData uri="http://schemas.openxmlformats.org/drawingml/2006/picture">
+                <pic:pic xmlns:pic="http://schemas.openxmlformats.org/drawingml/2006/picture">
+                  <pic:nvPicPr>
+                    <pic:cNvPr id="900009" name="k11_900009.png"/>
+                    <pic:cNvPicPr/>
+                  </pic:nvPicPr>
+                  <pic:blipFill>
+                    <a:blip r:embed="rId14"/>
+                    <a:stretch>
+                      <a:fillRect/>
+                    </a:stretch>
+                  </pic:blipFill>
+                  <pic:spPr>
+                    <a:xfrm>
+                      <a:off x="0" y="0"/>
+                      <a:ext cx="4680000" cy="2867280"/>
+                    </a:xfrm>
+                    <a:prstGeom prst="rect">
+                      <a:avLst/>
+                    </a:prstGeom>
+                  </pic:spPr>
+                </pic:pic>
+              </a:graphicData>
+            </a:graphic>
+          </wp:inline>
+        </w:drawing>
+      </w:r>
+    </w:p>
+    <w:p>
+      <w:pPr>
+        <w:jc w:val="center"/>
+        <w:rPr>
+          <w:rFonts w:ascii="Times New Roman" w:hAnsi="Times New Roman" w:cs="Times New Roman"/>
+          <w:lang w:val="tr-TR"/>
+        </w:rPr>
+      </w:pPr>
+      <w:r>
+        <w:rPr>
+          <w:rFonts w:ascii="Times New Roman" w:hAnsi="Times New Roman" w:cs="Times New Roman"/>
+          <w:b/>
+          <w:bCs/>
+          <w:lang w:val="tr-TR"/>
+        </w:rPr>
         <w:t>Grafik C:</w:t>
       </w:r>
       <w:r>
@@ -5129,6 +5289,7 @@
           <w:rFonts w:ascii="Times New Roman" w:hAnsi="Times New Roman" w:cs="Times New Roman"/>
           <w:lang w:val="tr-TR"/>
         </w:rPr>
+        <w:lastRenderedPageBreak/>
         <w:t>Kendiliğinden gerçekleşemeyecek bir tepkimeyi gerçekleştiremez; gerçekleşebilen bir tepkimeyi hızlandırır.</w:t>
       </w:r>
     </w:p>
@@ -5249,15 +5410,7 @@
           <w:rFonts w:ascii="Times New Roman" w:hAnsi="Times New Roman" w:cs="Times New Roman"/>
           <w:lang w:val="tr-TR"/>
         </w:rPr>
-        <w:t xml:space="preserve">) </w:t>
-      </w:r>
-      <w:r>
-        <w:rPr>
-          <w:rFonts w:ascii="Times New Roman" w:hAnsi="Times New Roman" w:cs="Times New Roman"/>
-          <w:lang w:val="tr-TR"/>
-        </w:rPr>
-        <w:lastRenderedPageBreak/>
-        <w:t>ve su buharına (H</w:t>
+        <w:t>) ve su buharına (H</w:t>
       </w:r>
       <w:r>
         <w:rPr>
@@ -5512,7 +5665,15 @@
           <w:rFonts w:ascii="Times New Roman" w:hAnsi="Times New Roman" w:cs="Times New Roman"/>
           <w:lang w:val="tr-TR"/>
         </w:rPr>
-        <w:t>Grubunuzla birlikte tepken cinsi, tepkenlerin fiziksel hâli, derişim, sıcaklık, katı tepkenin temas yüzeyi ve katalizör faktörlerinden birinin tepkime hızına etkisini araştırmak amacıyla neden-sonuç ilişkisini ortaya koyacağınız bir deney tasarlayınız. Deneyinizde araştırma sorunuzu, hipotezinizi, bağımlı, bağımsız ve kontrol değişkenlerinizi belirleyiniz. Deneyi gerçekleştirerek elde ettiğiniz verileri tablo ve grafiklerle sununuz. Sonuçlarınızı çarpışma teorisi ile destekleyerek bir deney raporu hâlinde yazınız ve sınıfınızda paylaşınız. Görevinizi tamamladıktan sonra hazırlanan öz değerlendirme raporu ile deney sürecinde hedeflerinize ulaşabilme düzeyinizi, öğrenme sürecinizi nasıl gerçekleştirdiğinizi, bu süreçte hangi duyguları yaşadığınızı ve neleri daha farklı yapabileceğinizi değerlendiriniz.</w:t>
+        <w:t xml:space="preserve">Grubunuzla birlikte tepken cinsi, tepkenlerin fiziksel hâli, derişim, sıcaklık, katı tepkenin temas yüzeyi ve katalizör faktörlerinden birinin tepkime hızına etkisini araştırmak amacıyla neden-sonuç </w:t>
+      </w:r>
+      <w:r>
+        <w:rPr>
+          <w:rFonts w:ascii="Times New Roman" w:hAnsi="Times New Roman" w:cs="Times New Roman"/>
+          <w:lang w:val="tr-TR"/>
+        </w:rPr>
+        <w:lastRenderedPageBreak/>
+        <w:t>ilişkisini ortaya koyacağınız bir deney tasarlayınız. Deneyinizde araştırma sorunuzu, hipotezinizi, bağımlı, bağımsız ve kontrol değişkenlerinizi belirleyiniz. Deneyi gerçekleştirerek elde ettiğiniz verileri tablo ve grafiklerle sununuz. Sonuçlarınızı çarpışma teorisi ile destekleyerek bir deney raporu hâlinde yazınız ve sınıfınızda paylaşınız. Görevinizi tamamladıktan sonra hazırlanan öz değerlendirme raporu ile deney sürecinde hedeflerinize ulaşabilme düzeyinizi, öğrenme sürecinizi nasıl gerçekleştirdiğinizi, bu süreçte hangi duyguları yaşadığınızı ve neleri daha farklı yapabileceğinizi değerlendiriniz.</w:t>
       </w:r>
     </w:p>
     <w:p>
@@ -5686,7 +5847,6 @@
           <w:noProof/>
           <w:lang w:val="tr-TR"/>
         </w:rPr>
-        <w:lastRenderedPageBreak/>
         <mc:AlternateContent>
           <mc:Choice Requires="wps">
             <w:drawing>
@@ -6271,6 +6431,7 @@
                 <w:rFonts w:ascii="Times New Roman" w:hAnsi="Times New Roman" w:cs="Times New Roman"/>
                 <w:lang w:val="tr-TR"/>
               </w:rPr>
+              <w:lastRenderedPageBreak/>
               <w:t>Mayalı hamurun sıcak ortamda daha çabuk kabarması</w:t>
             </w:r>
           </w:p>
@@ -6568,7 +6729,6 @@
           <w:rFonts w:ascii="Times New Roman" w:hAnsi="Times New Roman" w:cs="Times New Roman"/>
           <w:lang w:val="tr-TR"/>
         </w:rPr>
-        <w:lastRenderedPageBreak/>
         <w:t>……………………………………………………………………………………………</w:t>
       </w:r>
     </w:p>
@@ -6676,6 +6836,7 @@
         <w:rPr>
           <w:noProof/>
         </w:rPr>
+        <w:lastRenderedPageBreak/>
         <w:drawing>
           <wp:inline distT="0" distB="0" distL="0" distR="0" wp14:anchorId="6DE7896F" wp14:editId="669051F2">
             <wp:extent cx="3960000" cy="2426160"/>
@@ -6692,7 +6853,7 @@
                     <pic:cNvPicPr/>
                   </pic:nvPicPr>
                   <pic:blipFill>
-                    <a:blip r:embed="rId14"/>
+                    <a:blip r:embed="rId15"/>
                     <a:stretch>
                       <a:fillRect/>
                     </a:stretch>
@@ -6924,125 +7085,125 @@
           <w:rFonts w:ascii="Times New Roman" w:hAnsi="Times New Roman" w:cs="Times New Roman"/>
           <w:lang w:val="tr-TR"/>
         </w:rPr>
+        <w:t>……………………………………………………………………………………………</w:t>
+      </w:r>
+    </w:p>
+    <w:p>
+      <w:pPr>
+        <w:ind w:left="720"/>
+        <w:jc w:val="both"/>
+        <w:rPr>
+          <w:rFonts w:ascii="Times New Roman" w:hAnsi="Times New Roman" w:cs="Times New Roman"/>
+          <w:lang w:val="tr-TR"/>
+        </w:rPr>
+      </w:pPr>
+      <w:r>
+        <w:rPr>
+          <w:rFonts w:ascii="Times New Roman" w:hAnsi="Times New Roman" w:cs="Times New Roman"/>
+          <w:lang w:val="tr-TR"/>
+        </w:rPr>
+        <w:t>……………………………………………………………………………………………</w:t>
+      </w:r>
+    </w:p>
+    <w:p>
+      <w:pPr>
+        <w:jc w:val="both"/>
+        <w:rPr>
+          <w:rFonts w:ascii="Times New Roman" w:hAnsi="Times New Roman" w:cs="Times New Roman"/>
+          <w:lang w:val="tr-TR"/>
+        </w:rPr>
+      </w:pPr>
+      <w:r>
+        <w:rPr>
+          <w:rFonts w:ascii="Times New Roman" w:hAnsi="Times New Roman" w:cs="Times New Roman"/>
+          <w:lang w:val="tr-TR"/>
+        </w:rPr>
+        <w:t>6. Aşağıdaki ifadelerden doğru olanların başına “D”, yanlış olanların başına “Y” yazınız.</w:t>
+      </w:r>
+    </w:p>
+    <w:p>
+      <w:pPr>
+        <w:ind w:left="720"/>
+        <w:jc w:val="both"/>
+        <w:rPr>
+          <w:rFonts w:ascii="Times New Roman" w:hAnsi="Times New Roman" w:cs="Times New Roman"/>
+          <w:lang w:val="tr-TR"/>
+        </w:rPr>
+      </w:pPr>
+      <w:r>
+        <w:rPr>
+          <w:rFonts w:ascii="Times New Roman" w:hAnsi="Times New Roman" w:cs="Times New Roman"/>
+          <w:lang w:val="tr-TR"/>
+        </w:rPr>
+        <w:t>(  ) Katalizör, tepkime sonunda elde edilen ürün miktarını artırır.</w:t>
+      </w:r>
+    </w:p>
+    <w:p>
+      <w:pPr>
+        <w:ind w:left="720"/>
+        <w:jc w:val="both"/>
+        <w:rPr>
+          <w:rFonts w:ascii="Times New Roman" w:hAnsi="Times New Roman" w:cs="Times New Roman"/>
+          <w:lang w:val="tr-TR"/>
+        </w:rPr>
+      </w:pPr>
+      <w:r>
+        <w:rPr>
+          <w:rFonts w:ascii="Times New Roman" w:hAnsi="Times New Roman" w:cs="Times New Roman"/>
+          <w:lang w:val="tr-TR"/>
+        </w:rPr>
+        <w:t>(  ) Katalizör yalnızca ileri tepkimenin aktivasyon enerjisini düşürür.</w:t>
+      </w:r>
+    </w:p>
+    <w:p>
+      <w:pPr>
+        <w:ind w:left="720"/>
+        <w:jc w:val="both"/>
+        <w:rPr>
+          <w:rFonts w:ascii="Times New Roman" w:hAnsi="Times New Roman" w:cs="Times New Roman"/>
+          <w:lang w:val="tr-TR"/>
+        </w:rPr>
+      </w:pPr>
+      <w:r>
+        <w:rPr>
+          <w:rFonts w:ascii="Times New Roman" w:hAnsi="Times New Roman" w:cs="Times New Roman"/>
+          <w:lang w:val="tr-TR"/>
+        </w:rPr>
+        <w:t>(  ) Enzimler, canlılarda gerçekleşen tepkimeleri hızlandıran katalizörlerdir.</w:t>
+      </w:r>
+    </w:p>
+    <w:p>
+      <w:pPr>
+        <w:ind w:left="720"/>
+        <w:jc w:val="both"/>
+        <w:rPr>
+          <w:rFonts w:ascii="Times New Roman" w:hAnsi="Times New Roman" w:cs="Times New Roman"/>
+          <w:lang w:val="tr-TR"/>
+        </w:rPr>
+      </w:pPr>
+      <w:r>
+        <w:rPr>
+          <w:rFonts w:ascii="Times New Roman" w:hAnsi="Times New Roman" w:cs="Times New Roman"/>
+          <w:lang w:val="tr-TR"/>
+        </w:rPr>
+        <w:t>(  ) İnhibitörler tepkime hızını azaltır.</w:t>
+      </w:r>
+    </w:p>
+    <w:p>
+      <w:pPr>
+        <w:ind w:left="720"/>
+        <w:jc w:val="both"/>
+        <w:rPr>
+          <w:rFonts w:ascii="Times New Roman" w:hAnsi="Times New Roman" w:cs="Times New Roman"/>
+          <w:lang w:val="tr-TR"/>
+        </w:rPr>
+      </w:pPr>
+      <w:r>
+        <w:rPr>
+          <w:rFonts w:ascii="Times New Roman" w:hAnsi="Times New Roman" w:cs="Times New Roman"/>
+          <w:lang w:val="tr-TR"/>
+        </w:rPr>
         <w:lastRenderedPageBreak/>
-        <w:t>……………………………………………………………………………………………</w:t>
-      </w:r>
-    </w:p>
-    <w:p>
-      <w:pPr>
-        <w:ind w:left="720"/>
-        <w:jc w:val="both"/>
-        <w:rPr>
-          <w:rFonts w:ascii="Times New Roman" w:hAnsi="Times New Roman" w:cs="Times New Roman"/>
-          <w:lang w:val="tr-TR"/>
-        </w:rPr>
-      </w:pPr>
-      <w:r>
-        <w:rPr>
-          <w:rFonts w:ascii="Times New Roman" w:hAnsi="Times New Roman" w:cs="Times New Roman"/>
-          <w:lang w:val="tr-TR"/>
-        </w:rPr>
-        <w:t>……………………………………………………………………………………………</w:t>
-      </w:r>
-    </w:p>
-    <w:p>
-      <w:pPr>
-        <w:jc w:val="both"/>
-        <w:rPr>
-          <w:rFonts w:ascii="Times New Roman" w:hAnsi="Times New Roman" w:cs="Times New Roman"/>
-          <w:lang w:val="tr-TR"/>
-        </w:rPr>
-      </w:pPr>
-      <w:r>
-        <w:rPr>
-          <w:rFonts w:ascii="Times New Roman" w:hAnsi="Times New Roman" w:cs="Times New Roman"/>
-          <w:lang w:val="tr-TR"/>
-        </w:rPr>
-        <w:t>6. Aşağıdaki ifadelerden doğru olanların başına “D”, yanlış olanların başına “Y” yazınız.</w:t>
-      </w:r>
-    </w:p>
-    <w:p>
-      <w:pPr>
-        <w:ind w:left="720"/>
-        <w:jc w:val="both"/>
-        <w:rPr>
-          <w:rFonts w:ascii="Times New Roman" w:hAnsi="Times New Roman" w:cs="Times New Roman"/>
-          <w:lang w:val="tr-TR"/>
-        </w:rPr>
-      </w:pPr>
-      <w:r>
-        <w:rPr>
-          <w:rFonts w:ascii="Times New Roman" w:hAnsi="Times New Roman" w:cs="Times New Roman"/>
-          <w:lang w:val="tr-TR"/>
-        </w:rPr>
-        <w:t>(  ) Katalizör, tepkime sonunda elde edilen ürün miktarını artırır.</w:t>
-      </w:r>
-    </w:p>
-    <w:p>
-      <w:pPr>
-        <w:ind w:left="720"/>
-        <w:jc w:val="both"/>
-        <w:rPr>
-          <w:rFonts w:ascii="Times New Roman" w:hAnsi="Times New Roman" w:cs="Times New Roman"/>
-          <w:lang w:val="tr-TR"/>
-        </w:rPr>
-      </w:pPr>
-      <w:r>
-        <w:rPr>
-          <w:rFonts w:ascii="Times New Roman" w:hAnsi="Times New Roman" w:cs="Times New Roman"/>
-          <w:lang w:val="tr-TR"/>
-        </w:rPr>
-        <w:t>(  ) Katalizör yalnızca ileri tepkimenin aktivasyon enerjisini düşürür.</w:t>
-      </w:r>
-    </w:p>
-    <w:p>
-      <w:pPr>
-        <w:ind w:left="720"/>
-        <w:jc w:val="both"/>
-        <w:rPr>
-          <w:rFonts w:ascii="Times New Roman" w:hAnsi="Times New Roman" w:cs="Times New Roman"/>
-          <w:lang w:val="tr-TR"/>
-        </w:rPr>
-      </w:pPr>
-      <w:r>
-        <w:rPr>
-          <w:rFonts w:ascii="Times New Roman" w:hAnsi="Times New Roman" w:cs="Times New Roman"/>
-          <w:lang w:val="tr-TR"/>
-        </w:rPr>
-        <w:t>(  ) Enzimler, canlılarda gerçekleşen tepkimeleri hızlandıran katalizörlerdir.</w:t>
-      </w:r>
-    </w:p>
-    <w:p>
-      <w:pPr>
-        <w:ind w:left="720"/>
-        <w:jc w:val="both"/>
-        <w:rPr>
-          <w:rFonts w:ascii="Times New Roman" w:hAnsi="Times New Roman" w:cs="Times New Roman"/>
-          <w:lang w:val="tr-TR"/>
-        </w:rPr>
-      </w:pPr>
-      <w:r>
-        <w:rPr>
-          <w:rFonts w:ascii="Times New Roman" w:hAnsi="Times New Roman" w:cs="Times New Roman"/>
-          <w:lang w:val="tr-TR"/>
-        </w:rPr>
-        <w:t>(  ) İnhibitörler tepkime hızını azaltır.</w:t>
-      </w:r>
-    </w:p>
-    <w:p>
-      <w:pPr>
-        <w:ind w:left="720"/>
-        <w:jc w:val="both"/>
-        <w:rPr>
-          <w:rFonts w:ascii="Times New Roman" w:hAnsi="Times New Roman" w:cs="Times New Roman"/>
-          <w:lang w:val="tr-TR"/>
-        </w:rPr>
-      </w:pPr>
-      <w:r>
-        <w:rPr>
-          <w:rFonts w:ascii="Times New Roman" w:hAnsi="Times New Roman" w:cs="Times New Roman"/>
-          <w:lang w:val="tr-TR"/>
-        </w:rPr>
         <w:t>(  ) Katalizör tepkimenin izlediği yolu değiştirir.</w:t>
       </w:r>
     </w:p>
@@ -7312,8 +7473,8 @@
       </w:r>
     </w:p>
     <w:sectPr>
-      <w:footerReference w:type="even" r:id="rId15"/>
-      <w:footerReference w:type="default" r:id="rId16"/>
+      <w:footerReference w:type="even" r:id="rId16"/>
+      <w:footerReference w:type="default" r:id="rId17"/>
       <w:pgSz w:w="12240" w:h="15840"/>
       <w:pgMar w:top="1440" w:right="1440" w:bottom="1440" w:left="1440" w:header="708" w:footer="708" w:gutter="0"/>
       <w:cols w:space="708"/>

</xml_diff>

<commit_message>
1.7: Gorsel D ve E yeniden cizildi; yazilar buyutuldu, PbI2 kumeleri ve ust uste binen tanecikler duzeltildi
</commit_message>
<xml_diff>
--- a/Kim11-1-7-Tepkime-Hizina-Etki-Eden-Faktorler.docx
+++ b/Kim11-1-7-Tepkime-Hizina-Etki-Eden-Faktorler.docx
@@ -4429,7 +4429,7 @@
         </w:rPr>
         <w:drawing>
           <wp:inline distT="0" distB="0" distL="0" distR="0" wp14:anchorId="6B73C9F0" wp14:editId="5416ED67">
-            <wp:extent cx="4680000" cy="2187391"/>
+            <wp:extent cx="4680000" cy="2433600"/>
             <wp:effectExtent l="0" t="0" r="0" b="0"/>
             <wp:docPr id="2123729895" name="Grafik 900020" descr="Fiziksel hal tanecik modeli"/>
             <wp:cNvGraphicFramePr>
@@ -4451,7 +4451,7 @@
                   <pic:spPr>
                     <a:xfrm>
                       <a:off x="0" y="0"/>
-                      <a:ext cx="4680000" cy="2187391"/>
+                      <a:ext cx="4680000" cy="2433600"/>
                     </a:xfrm>
                     <a:prstGeom prst="rect">
                       <a:avLst/>
@@ -4565,7 +4565,7 @@
         </w:rPr>
         <w:drawing>
           <wp:inline distT="0" distB="0" distL="0" distR="0" wp14:anchorId="6B73C9F0" wp14:editId="5416ED67">
-            <wp:extent cx="4680000" cy="2246400"/>
+            <wp:extent cx="4680000" cy="2340000"/>
             <wp:effectExtent l="0" t="0" r="0" b="0"/>
             <wp:docPr id="900005" name="Grafik 900005" descr="Derişim tanecik modeli"/>
             <wp:cNvGraphicFramePr>
@@ -4587,7 +4587,7 @@
                   <pic:spPr>
                     <a:xfrm>
                       <a:off x="0" y="0"/>
-                      <a:ext cx="4680000" cy="2246400"/>
+                      <a:ext cx="4680000" cy="2340000"/>
                     </a:xfrm>
                     <a:prstGeom prst="rect">
                       <a:avLst/>

</xml_diff>